<commit_message>
docs: finalized Product Specification Document (PSD) with risk register and testing plan
</commit_message>
<xml_diff>
--- a/docs/PSD.docx
+++ b/docs/PSD.docx
@@ -7,37 +7,30 @@
         <w:pStyle w:val="NormalWeb"/>
         <w:spacing w:before="0" w:beforeAutospacing="0"/>
         <w:rPr>
-          <w:rFonts w:ascii="Arial" w:hAnsi="Arial" w:cs="Arial"/>
-        </w:rPr>
-      </w:pPr>
-      <w:r>
-        <w:rPr>
-          <w:rFonts w:hAnsi="Symbol"/>
-        </w:rPr>
-        <w:t></w:t>
-      </w:r>
-      <w:r>
-        <w:t xml:space="preserve">  </w:t>
-      </w:r>
-      <w:r>
-        <w:rPr>
-          <w:rStyle w:val="citation-1296"/>
-          <w:rFonts w:ascii="Arial" w:eastAsiaTheme="majorEastAsia" w:hAnsi="Arial" w:cs="Arial"/>
+          <w:rFonts w:ascii="Calibri" w:eastAsiaTheme="majorEastAsia" w:hAnsi="Calibri" w:cs="Calibri"/>
           <w:b/>
           <w:bCs/>
         </w:rPr>
+      </w:pPr>
+      <w:r>
+        <w:rPr>
+          <w:rStyle w:val="citation-1296"/>
+          <w:rFonts w:ascii="Calibri" w:eastAsiaTheme="majorEastAsia" w:hAnsi="Calibri" w:cs="Calibri"/>
+          <w:b/>
+          <w:bCs/>
+        </w:rPr>
         <w:t>Product Name:</w:t>
       </w:r>
       <w:r>
         <w:rPr>
           <w:rStyle w:val="citation-1296"/>
-          <w:rFonts w:ascii="Arial" w:eastAsiaTheme="majorEastAsia" w:hAnsi="Arial" w:cs="Arial"/>
+          <w:rFonts w:ascii="Calibri" w:eastAsiaTheme="majorEastAsia" w:hAnsi="Calibri" w:cs="Calibri"/>
         </w:rPr>
         <w:t xml:space="preserve"> CarePoint Hospital System</w:t>
       </w:r>
       <w:r>
         <w:rPr>
-          <w:rFonts w:ascii="Arial" w:hAnsi="Arial" w:cs="Arial"/>
+          <w:rFonts w:ascii="Calibri" w:hAnsi="Calibri" w:cs="Calibri"/>
         </w:rPr>
         <w:t>.</w:t>
       </w:r>
@@ -47,22 +40,13 @@
         <w:pStyle w:val="NormalWeb"/>
         <w:spacing w:before="0" w:beforeAutospacing="0"/>
         <w:rPr>
-          <w:rFonts w:ascii="Arial" w:hAnsi="Arial" w:cs="Arial"/>
+          <w:rFonts w:ascii="Calibri" w:hAnsi="Calibri" w:cs="Calibri"/>
         </w:rPr>
       </w:pPr>
       <w:r>
         <w:rPr>
-          <w:rFonts w:hAnsi="Symbol"/>
-        </w:rPr>
-        <w:t></w:t>
-      </w:r>
-      <w:r>
-        <w:t xml:space="preserve">  </w:t>
-      </w:r>
-      <w:r>
-        <w:rPr>
           <w:rStyle w:val="citation-1295"/>
-          <w:rFonts w:ascii="Arial" w:eastAsiaTheme="majorEastAsia" w:hAnsi="Arial" w:cs="Arial"/>
+          <w:rFonts w:ascii="Calibri" w:eastAsiaTheme="majorEastAsia" w:hAnsi="Calibri" w:cs="Calibri"/>
           <w:b/>
           <w:bCs/>
         </w:rPr>
@@ -71,13 +55,13 @@
       <w:r>
         <w:rPr>
           <w:rStyle w:val="citation-1295"/>
-          <w:rFonts w:ascii="Arial" w:eastAsiaTheme="majorEastAsia" w:hAnsi="Arial" w:cs="Arial"/>
+          <w:rFonts w:ascii="Calibri" w:eastAsiaTheme="majorEastAsia" w:hAnsi="Calibri" w:cs="Calibri"/>
         </w:rPr>
         <w:t xml:space="preserve"> Patients struggle to book appointments quickly and lack secure, instant access to their own medical data</w:t>
       </w:r>
       <w:r>
         <w:rPr>
-          <w:rFonts w:ascii="Arial" w:hAnsi="Arial" w:cs="Arial"/>
+          <w:rFonts w:ascii="Calibri" w:hAnsi="Calibri" w:cs="Calibri"/>
         </w:rPr>
         <w:t>.</w:t>
       </w:r>
@@ -87,22 +71,13 @@
         <w:pStyle w:val="NormalWeb"/>
         <w:spacing w:before="0" w:beforeAutospacing="0"/>
         <w:rPr>
-          <w:rFonts w:ascii="Arial" w:hAnsi="Arial" w:cs="Arial"/>
+          <w:rFonts w:ascii="Calibri" w:hAnsi="Calibri" w:cs="Calibri"/>
         </w:rPr>
       </w:pPr>
       <w:r>
         <w:rPr>
-          <w:rFonts w:hAnsi="Symbol"/>
-        </w:rPr>
-        <w:t></w:t>
-      </w:r>
-      <w:r>
-        <w:t xml:space="preserve">  </w:t>
-      </w:r>
-      <w:r>
-        <w:rPr>
           <w:rStyle w:val="citation-1294"/>
-          <w:rFonts w:ascii="Arial" w:eastAsiaTheme="majorEastAsia" w:hAnsi="Arial" w:cs="Arial"/>
+          <w:rFonts w:ascii="Calibri" w:eastAsiaTheme="majorEastAsia" w:hAnsi="Calibri" w:cs="Calibri"/>
           <w:b/>
           <w:bCs/>
         </w:rPr>
@@ -111,13 +86,13 @@
       <w:r>
         <w:rPr>
           <w:rStyle w:val="citation-1294"/>
-          <w:rFonts w:ascii="Arial" w:eastAsiaTheme="majorEastAsia" w:hAnsi="Arial" w:cs="Arial"/>
+          <w:rFonts w:ascii="Calibri" w:eastAsiaTheme="majorEastAsia" w:hAnsi="Calibri" w:cs="Calibri"/>
         </w:rPr>
         <w:t xml:space="preserve"> NHS Patients (all ages) and Hospital Staff/Doctors</w:t>
       </w:r>
       <w:r>
         <w:rPr>
-          <w:rFonts w:ascii="Arial" w:hAnsi="Arial" w:cs="Arial"/>
+          <w:rFonts w:ascii="Calibri" w:hAnsi="Calibri" w:cs="Calibri"/>
         </w:rPr>
         <w:t>.</w:t>
       </w:r>
@@ -127,22 +102,13 @@
         <w:pStyle w:val="NormalWeb"/>
         <w:spacing w:before="0" w:beforeAutospacing="0"/>
         <w:rPr>
-          <w:rFonts w:ascii="Arial" w:hAnsi="Arial" w:cs="Arial"/>
+          <w:rFonts w:ascii="Calibri" w:hAnsi="Calibri" w:cs="Calibri"/>
         </w:rPr>
       </w:pPr>
       <w:r>
         <w:rPr>
-          <w:rFonts w:hAnsi="Symbol"/>
-        </w:rPr>
-        <w:t></w:t>
-      </w:r>
-      <w:r>
-        <w:t xml:space="preserve">  </w:t>
-      </w:r>
-      <w:r>
-        <w:rPr>
           <w:rStyle w:val="citation-1293"/>
-          <w:rFonts w:ascii="Arial" w:eastAsiaTheme="majorEastAsia" w:hAnsi="Arial" w:cs="Arial"/>
+          <w:rFonts w:ascii="Calibri" w:eastAsiaTheme="majorEastAsia" w:hAnsi="Calibri" w:cs="Calibri"/>
           <w:b/>
           <w:bCs/>
         </w:rPr>
@@ -151,13 +117,13 @@
       <w:r>
         <w:rPr>
           <w:rStyle w:val="citation-1293"/>
-          <w:rFonts w:ascii="Arial" w:eastAsiaTheme="majorEastAsia" w:hAnsi="Arial" w:cs="Arial"/>
+          <w:rFonts w:ascii="Calibri" w:eastAsiaTheme="majorEastAsia" w:hAnsi="Calibri" w:cs="Calibri"/>
         </w:rPr>
         <w:t xml:space="preserve"> Secure login, dynamic appointment booking, real-time doctor availability calendar, and a patient medical record portal</w:t>
       </w:r>
       <w:r>
         <w:rPr>
-          <w:rFonts w:ascii="Arial" w:hAnsi="Arial" w:cs="Arial"/>
+          <w:rFonts w:ascii="Calibri" w:hAnsi="Calibri" w:cs="Calibri"/>
         </w:rPr>
         <w:t>.</w:t>
       </w:r>
@@ -167,22 +133,13 @@
         <w:pStyle w:val="NormalWeb"/>
         <w:spacing w:before="0" w:beforeAutospacing="0"/>
         <w:rPr>
-          <w:rFonts w:ascii="Arial" w:hAnsi="Arial" w:cs="Arial"/>
+          <w:rFonts w:ascii="Calibri" w:hAnsi="Calibri" w:cs="Calibri"/>
         </w:rPr>
       </w:pPr>
       <w:r>
         <w:rPr>
-          <w:rFonts w:hAnsi="Symbol"/>
-        </w:rPr>
-        <w:t></w:t>
-      </w:r>
-      <w:r>
-        <w:t xml:space="preserve">  </w:t>
-      </w:r>
-      <w:r>
-        <w:rPr>
           <w:rStyle w:val="citation-1292"/>
-          <w:rFonts w:ascii="Arial" w:eastAsiaTheme="majorEastAsia" w:hAnsi="Arial" w:cs="Arial"/>
+          <w:rFonts w:ascii="Calibri" w:eastAsiaTheme="majorEastAsia" w:hAnsi="Calibri" w:cs="Calibri"/>
           <w:b/>
           <w:bCs/>
         </w:rPr>
@@ -191,13 +148,13 @@
       <w:r>
         <w:rPr>
           <w:rStyle w:val="citation-1292"/>
-          <w:rFonts w:ascii="Arial" w:eastAsiaTheme="majorEastAsia" w:hAnsi="Arial" w:cs="Arial"/>
+          <w:rFonts w:ascii="Calibri" w:eastAsiaTheme="majorEastAsia" w:hAnsi="Calibri" w:cs="Calibri"/>
         </w:rPr>
         <w:t xml:space="preserve"> Prescription payments, video consultations, and staff payroll systems (to keep the project feasible)</w:t>
       </w:r>
       <w:r>
         <w:rPr>
-          <w:rFonts w:ascii="Arial" w:hAnsi="Arial" w:cs="Arial"/>
+          <w:rFonts w:ascii="Calibri" w:hAnsi="Calibri" w:cs="Calibri"/>
         </w:rPr>
         <w:t>.</w:t>
       </w:r>
@@ -207,22 +164,13 @@
         <w:pStyle w:val="NormalWeb"/>
         <w:spacing w:before="0" w:beforeAutospacing="0"/>
         <w:rPr>
-          <w:rFonts w:ascii="Arial" w:hAnsi="Arial" w:cs="Arial"/>
+          <w:rFonts w:ascii="Calibri" w:hAnsi="Calibri" w:cs="Calibri"/>
         </w:rPr>
       </w:pPr>
       <w:r>
         <w:rPr>
-          <w:rFonts w:hAnsi="Symbol"/>
-        </w:rPr>
-        <w:t></w:t>
-      </w:r>
-      <w:r>
-        <w:t xml:space="preserve">  </w:t>
-      </w:r>
-      <w:r>
-        <w:rPr>
           <w:rStyle w:val="citation-1291"/>
-          <w:rFonts w:ascii="Arial" w:eastAsiaTheme="majorEastAsia" w:hAnsi="Arial" w:cs="Arial"/>
+          <w:rFonts w:ascii="Calibri" w:eastAsiaTheme="majorEastAsia" w:hAnsi="Calibri" w:cs="Calibri"/>
           <w:b/>
           <w:bCs/>
         </w:rPr>
@@ -231,30 +179,32 @@
       <w:r>
         <w:rPr>
           <w:rStyle w:val="citation-1291"/>
-          <w:rFonts w:ascii="Arial" w:eastAsiaTheme="majorEastAsia" w:hAnsi="Arial" w:cs="Arial"/>
+          <w:rFonts w:ascii="Calibri" w:eastAsiaTheme="majorEastAsia" w:hAnsi="Calibri" w:cs="Calibri"/>
         </w:rPr>
         <w:t xml:space="preserve"> </w:t>
       </w:r>
+      <w:proofErr w:type="spellStart"/>
       <w:r>
         <w:rPr>
           <w:rStyle w:val="citation-1291"/>
-          <w:rFonts w:ascii="Arial" w:eastAsiaTheme="majorEastAsia" w:hAnsi="Arial" w:cs="Arial"/>
+          <w:rFonts w:ascii="Calibri" w:eastAsiaTheme="majorEastAsia" w:hAnsi="Calibri" w:cs="Calibri"/>
           <w:b/>
           <w:bCs/>
         </w:rPr>
         <w:t>SvelteKit</w:t>
       </w:r>
+      <w:proofErr w:type="spellEnd"/>
       <w:r>
         <w:rPr>
           <w:rStyle w:val="citation-1291"/>
-          <w:rFonts w:ascii="Arial" w:eastAsiaTheme="majorEastAsia" w:hAnsi="Arial" w:cs="Arial"/>
+          <w:rFonts w:ascii="Calibri" w:eastAsiaTheme="majorEastAsia" w:hAnsi="Calibri" w:cs="Calibri"/>
         </w:rPr>
         <w:t xml:space="preserve"> (Frontend/Backend) for reactive data retrieval and </w:t>
       </w:r>
       <w:r>
         <w:rPr>
           <w:rStyle w:val="citation-1291"/>
-          <w:rFonts w:ascii="Arial" w:eastAsiaTheme="majorEastAsia" w:hAnsi="Arial" w:cs="Arial"/>
+          <w:rFonts w:ascii="Calibri" w:eastAsiaTheme="majorEastAsia" w:hAnsi="Calibri" w:cs="Calibri"/>
           <w:b/>
           <w:bCs/>
         </w:rPr>
@@ -263,13 +213,13 @@
       <w:r>
         <w:rPr>
           <w:rStyle w:val="citation-1291"/>
-          <w:rFonts w:ascii="Arial" w:eastAsiaTheme="majorEastAsia" w:hAnsi="Arial" w:cs="Arial"/>
+          <w:rFonts w:ascii="Calibri" w:eastAsiaTheme="majorEastAsia" w:hAnsi="Calibri" w:cs="Calibri"/>
         </w:rPr>
         <w:t xml:space="preserve"> for hosting</w:t>
       </w:r>
       <w:r>
         <w:rPr>
-          <w:rFonts w:ascii="Arial" w:hAnsi="Arial" w:cs="Arial"/>
+          <w:rFonts w:ascii="Calibri" w:hAnsi="Calibri" w:cs="Calibri"/>
         </w:rPr>
         <w:t>.</w:t>
       </w:r>
@@ -279,22 +229,13 @@
         <w:pStyle w:val="NormalWeb"/>
         <w:spacing w:before="0" w:beforeAutospacing="0"/>
         <w:rPr>
-          <w:rFonts w:ascii="Arial" w:hAnsi="Arial" w:cs="Arial"/>
+          <w:rFonts w:ascii="Calibri" w:hAnsi="Calibri" w:cs="Calibri"/>
         </w:rPr>
       </w:pPr>
       <w:r>
         <w:rPr>
-          <w:rFonts w:hAnsi="Symbol"/>
-        </w:rPr>
-        <w:t></w:t>
-      </w:r>
-      <w:r>
-        <w:t xml:space="preserve">  </w:t>
-      </w:r>
-      <w:r>
-        <w:rPr>
           <w:rStyle w:val="citation-1290"/>
-          <w:rFonts w:ascii="Arial" w:eastAsiaTheme="majorEastAsia" w:hAnsi="Arial" w:cs="Arial"/>
+          <w:rFonts w:ascii="Calibri" w:eastAsiaTheme="majorEastAsia" w:hAnsi="Calibri" w:cs="Calibri"/>
           <w:b/>
           <w:bCs/>
         </w:rPr>
@@ -303,13 +244,19 @@
       <w:r>
         <w:rPr>
           <w:rStyle w:val="citation-1290"/>
-          <w:rFonts w:ascii="Arial" w:eastAsiaTheme="majorEastAsia" w:hAnsi="Arial" w:cs="Arial"/>
-        </w:rPr>
-        <w:t xml:space="preserve"> A fully functional, "run-able" system demonstrated in a 5-minute video</w:t>
-      </w:r>
-      <w:r>
-        <w:rPr>
-          <w:rFonts w:ascii="Arial" w:hAnsi="Arial" w:cs="Arial"/>
+          <w:rFonts w:ascii="Calibri" w:eastAsiaTheme="majorEastAsia" w:hAnsi="Calibri" w:cs="Calibri"/>
+        </w:rPr>
+        <w:t xml:space="preserve"> </w:t>
+      </w:r>
+      <w:r>
+        <w:rPr>
+          <w:rFonts w:ascii="Calibri" w:eastAsiaTheme="majorEastAsia" w:hAnsi="Calibri" w:cs="Calibri"/>
+        </w:rPr>
+        <w:t>100% pass rate on all core functional unit tests (Arrange, Act, Assert) and zero critical bugs identified during the feature demonstration</w:t>
+      </w:r>
+      <w:r>
+        <w:rPr>
+          <w:rFonts w:ascii="Calibri" w:hAnsi="Calibri" w:cs="Calibri"/>
         </w:rPr>
         <w:t>.</w:t>
       </w:r>
@@ -317,44 +264,37 @@
     <w:p>
       <w:pPr>
         <w:pStyle w:val="NormalWeb"/>
+        <w:rPr>
+          <w:rFonts w:ascii="Calibri" w:hAnsi="Calibri" w:cs="Calibri"/>
+        </w:rPr>
       </w:pPr>
       <w:r>
         <w:rPr>
-          <w:rFonts w:hAnsi="Symbol"/>
-        </w:rPr>
-        <w:t></w:t>
-      </w:r>
-      <w:r>
-        <w:t xml:space="preserve">  </w:t>
-      </w:r>
-      <w:r>
-        <w:rPr>
+          <w:rFonts w:ascii="Calibri" w:hAnsi="Calibri" w:cs="Calibri"/>
           <w:b/>
           <w:bCs/>
         </w:rPr>
         <w:t>Roles:</w:t>
       </w:r>
       <w:r>
+        <w:rPr>
+          <w:rFonts w:ascii="Calibri" w:hAnsi="Calibri" w:cs="Calibri"/>
+        </w:rPr>
         <w:t xml:space="preserve"> Explicitly state: "I am fulfilling the roles of Scrum Master, Product Owner, and Developer for this project."</w:t>
       </w:r>
     </w:p>
     <w:p>
       <w:pPr>
         <w:pStyle w:val="NormalWeb"/>
+        <w:rPr>
+          <w:rStyle w:val="citation-1349"/>
+          <w:rFonts w:ascii="Calibri" w:eastAsiaTheme="majorEastAsia" w:hAnsi="Calibri" w:cs="Calibri"/>
+        </w:rPr>
       </w:pPr>
       <w:r>
         <w:rPr>
-          <w:rFonts w:hAnsi="Symbol"/>
-        </w:rPr>
-        <w:t></w:t>
-      </w:r>
-      <w:r>
-        <w:t xml:space="preserve">  </w:t>
-      </w:r>
-      <w:r>
-        <w:rPr>
           <w:rStyle w:val="citation-1349"/>
-          <w:rFonts w:eastAsiaTheme="majorEastAsia"/>
+          <w:rFonts w:ascii="Calibri" w:eastAsiaTheme="majorEastAsia" w:hAnsi="Calibri" w:cs="Calibri"/>
           <w:b/>
           <w:bCs/>
         </w:rPr>
@@ -363,19 +303,643 @@
       <w:r>
         <w:rPr>
           <w:rStyle w:val="citation-1349"/>
-          <w:rFonts w:eastAsiaTheme="majorEastAsia"/>
-        </w:rPr>
-        <w:t xml:space="preserve"> List your own hardware (Laptop/PC) and software (SvelteKit/cPanel) as the primary resources</w:t>
-      </w:r>
+          <w:rFonts w:ascii="Calibri" w:eastAsiaTheme="majorEastAsia" w:hAnsi="Calibri" w:cs="Calibri"/>
+        </w:rPr>
+        <w:t xml:space="preserve"> List your own hardware (Laptop/PC) and software (</w:t>
+      </w:r>
+      <w:proofErr w:type="spellStart"/>
       <w:r>
         <w:rPr>
           <w:rStyle w:val="citation-1349"/>
-          <w:rFonts w:eastAsiaTheme="majorEastAsia"/>
-        </w:rPr>
-        <w:t>.</w:t>
+          <w:rFonts w:ascii="Calibri" w:eastAsiaTheme="majorEastAsia" w:hAnsi="Calibri" w:cs="Calibri"/>
+        </w:rPr>
+        <w:t>SvelteKit</w:t>
+      </w:r>
+      <w:proofErr w:type="spellEnd"/>
+      <w:r>
+        <w:rPr>
+          <w:rStyle w:val="citation-1349"/>
+          <w:rFonts w:ascii="Calibri" w:eastAsiaTheme="majorEastAsia" w:hAnsi="Calibri" w:cs="Calibri"/>
+        </w:rPr>
+        <w:t>/cPanel) as the primary resources.</w:t>
       </w:r>
     </w:p>
-    <w:p/>
+    <w:p>
+      <w:pPr>
+        <w:pStyle w:val="NormalWeb"/>
+        <w:rPr>
+          <w:rStyle w:val="citation-1349"/>
+          <w:rFonts w:ascii="Calibri" w:eastAsiaTheme="majorEastAsia" w:hAnsi="Calibri" w:cs="Calibri"/>
+        </w:rPr>
+      </w:pPr>
+    </w:p>
+    <w:p>
+      <w:pPr>
+        <w:pStyle w:val="NormalWeb"/>
+        <w:rPr>
+          <w:rFonts w:ascii="Calibri" w:hAnsi="Calibri" w:cs="Calibri"/>
+          <w:b/>
+          <w:bCs/>
+          <w:u w:val="single"/>
+        </w:rPr>
+      </w:pPr>
+      <w:r>
+        <w:rPr>
+          <w:rFonts w:ascii="Calibri" w:hAnsi="Calibri" w:cs="Calibri"/>
+          <w:b/>
+          <w:bCs/>
+          <w:u w:val="single"/>
+        </w:rPr>
+        <w:t>Risk Register</w:t>
+      </w:r>
+    </w:p>
+    <w:tbl>
+      <w:tblPr>
+        <w:tblStyle w:val="TableGrid"/>
+        <w:tblW w:w="0" w:type="auto"/>
+        <w:tblLook w:val="04A0" w:firstRow="1" w:lastRow="0" w:firstColumn="1" w:lastColumn="0" w:noHBand="0" w:noVBand="1"/>
+      </w:tblPr>
+      <w:tblGrid>
+        <w:gridCol w:w="504"/>
+        <w:gridCol w:w="1646"/>
+        <w:gridCol w:w="1305"/>
+        <w:gridCol w:w="1040"/>
+        <w:gridCol w:w="4855"/>
+      </w:tblGrid>
+      <w:tr>
+        <w:tc>
+          <w:tcPr>
+            <w:tcW w:w="0" w:type="auto"/>
+          </w:tcPr>
+          <w:p>
+            <w:pPr>
+              <w:rPr>
+                <w:rFonts w:ascii="Calibri" w:hAnsi="Calibri" w:cs="Calibri"/>
+                <w:b/>
+                <w:bCs/>
+              </w:rPr>
+            </w:pPr>
+            <w:r>
+              <w:rPr>
+                <w:rFonts w:ascii="Calibri" w:hAnsi="Calibri" w:cs="Calibri"/>
+                <w:b/>
+                <w:bCs/>
+              </w:rPr>
+              <w:t>N</w:t>
+            </w:r>
+            <w:r>
+              <w:rPr>
+                <w:rFonts w:ascii="Calibri" w:hAnsi="Calibri" w:cs="Calibri"/>
+                <w:b/>
+                <w:bCs/>
+              </w:rPr>
+              <w:t>o</w:t>
+            </w:r>
+          </w:p>
+        </w:tc>
+        <w:tc>
+          <w:tcPr>
+            <w:tcW w:w="0" w:type="auto"/>
+            <w:hideMark/>
+          </w:tcPr>
+          <w:p>
+            <w:pPr>
+              <w:spacing w:after="160" w:line="278" w:lineRule="auto"/>
+              <w:rPr>
+                <w:rFonts w:ascii="Calibri" w:hAnsi="Calibri" w:cs="Calibri"/>
+              </w:rPr>
+            </w:pPr>
+            <w:r>
+              <w:rPr>
+                <w:rFonts w:ascii="Calibri" w:hAnsi="Calibri" w:cs="Calibri"/>
+                <w:b/>
+                <w:bCs/>
+              </w:rPr>
+              <w:t>Risk</w:t>
+            </w:r>
+          </w:p>
+        </w:tc>
+        <w:tc>
+          <w:tcPr>
+            <w:tcW w:w="0" w:type="auto"/>
+            <w:hideMark/>
+          </w:tcPr>
+          <w:p>
+            <w:pPr>
+              <w:spacing w:after="160" w:line="278" w:lineRule="auto"/>
+              <w:rPr>
+                <w:rFonts w:ascii="Calibri" w:hAnsi="Calibri" w:cs="Calibri"/>
+              </w:rPr>
+            </w:pPr>
+            <w:r>
+              <w:rPr>
+                <w:rFonts w:ascii="Calibri" w:hAnsi="Calibri" w:cs="Calibri"/>
+                <w:b/>
+                <w:bCs/>
+              </w:rPr>
+              <w:t>Probability</w:t>
+            </w:r>
+          </w:p>
+        </w:tc>
+        <w:tc>
+          <w:tcPr>
+            <w:tcW w:w="0" w:type="auto"/>
+            <w:hideMark/>
+          </w:tcPr>
+          <w:p>
+            <w:pPr>
+              <w:spacing w:after="160" w:line="278" w:lineRule="auto"/>
+              <w:rPr>
+                <w:rFonts w:ascii="Calibri" w:hAnsi="Calibri" w:cs="Calibri"/>
+              </w:rPr>
+            </w:pPr>
+            <w:r>
+              <w:rPr>
+                <w:rFonts w:ascii="Calibri" w:hAnsi="Calibri" w:cs="Calibri"/>
+                <w:b/>
+                <w:bCs/>
+              </w:rPr>
+              <w:t>Impact</w:t>
+            </w:r>
+          </w:p>
+        </w:tc>
+        <w:tc>
+          <w:tcPr>
+            <w:tcW w:w="0" w:type="auto"/>
+            <w:hideMark/>
+          </w:tcPr>
+          <w:p>
+            <w:pPr>
+              <w:spacing w:after="160" w:line="278" w:lineRule="auto"/>
+              <w:rPr>
+                <w:rFonts w:ascii="Calibri" w:hAnsi="Calibri" w:cs="Calibri"/>
+              </w:rPr>
+            </w:pPr>
+            <w:r>
+              <w:rPr>
+                <w:rFonts w:ascii="Calibri" w:hAnsi="Calibri" w:cs="Calibri"/>
+                <w:b/>
+                <w:bCs/>
+              </w:rPr>
+              <w:t>Mitigation Plan</w:t>
+            </w:r>
+          </w:p>
+        </w:tc>
+      </w:tr>
+      <w:tr>
+        <w:tc>
+          <w:tcPr>
+            <w:tcW w:w="0" w:type="auto"/>
+          </w:tcPr>
+          <w:p>
+            <w:pPr>
+              <w:rPr>
+                <w:rFonts w:ascii="Calibri" w:hAnsi="Calibri" w:cs="Calibri"/>
+                <w:b/>
+                <w:bCs/>
+              </w:rPr>
+            </w:pPr>
+            <w:r>
+              <w:rPr>
+                <w:rFonts w:ascii="Calibri" w:hAnsi="Calibri" w:cs="Calibri"/>
+                <w:b/>
+                <w:bCs/>
+              </w:rPr>
+              <w:t>1</w:t>
+            </w:r>
+          </w:p>
+        </w:tc>
+        <w:tc>
+          <w:tcPr>
+            <w:tcW w:w="0" w:type="auto"/>
+            <w:hideMark/>
+          </w:tcPr>
+          <w:p>
+            <w:pPr>
+              <w:spacing w:after="160" w:line="278" w:lineRule="auto"/>
+              <w:rPr>
+                <w:rFonts w:ascii="Calibri" w:hAnsi="Calibri" w:cs="Calibri"/>
+              </w:rPr>
+            </w:pPr>
+            <w:r>
+              <w:rPr>
+                <w:rFonts w:ascii="Calibri" w:hAnsi="Calibri" w:cs="Calibri"/>
+                <w:b/>
+                <w:bCs/>
+              </w:rPr>
+              <w:t>Data Integrity Breach</w:t>
+            </w:r>
+          </w:p>
+        </w:tc>
+        <w:tc>
+          <w:tcPr>
+            <w:tcW w:w="0" w:type="auto"/>
+            <w:hideMark/>
+          </w:tcPr>
+          <w:p>
+            <w:pPr>
+              <w:spacing w:after="160" w:line="278" w:lineRule="auto"/>
+              <w:rPr>
+                <w:rFonts w:ascii="Calibri" w:hAnsi="Calibri" w:cs="Calibri"/>
+              </w:rPr>
+            </w:pPr>
+            <w:r>
+              <w:rPr>
+                <w:rFonts w:ascii="Calibri" w:hAnsi="Calibri" w:cs="Calibri"/>
+              </w:rPr>
+              <w:t>Low</w:t>
+            </w:r>
+          </w:p>
+        </w:tc>
+        <w:tc>
+          <w:tcPr>
+            <w:tcW w:w="0" w:type="auto"/>
+            <w:hideMark/>
+          </w:tcPr>
+          <w:p>
+            <w:pPr>
+              <w:spacing w:after="160" w:line="278" w:lineRule="auto"/>
+              <w:rPr>
+                <w:rFonts w:ascii="Calibri" w:hAnsi="Calibri" w:cs="Calibri"/>
+              </w:rPr>
+            </w:pPr>
+            <w:r>
+              <w:rPr>
+                <w:rFonts w:ascii="Calibri" w:hAnsi="Calibri" w:cs="Calibri"/>
+              </w:rPr>
+              <w:t>High</w:t>
+            </w:r>
+          </w:p>
+        </w:tc>
+        <w:tc>
+          <w:tcPr>
+            <w:tcW w:w="0" w:type="auto"/>
+            <w:hideMark/>
+          </w:tcPr>
+          <w:p>
+            <w:pPr>
+              <w:spacing w:after="160" w:line="278" w:lineRule="auto"/>
+              <w:rPr>
+                <w:rFonts w:ascii="Calibri" w:hAnsi="Calibri" w:cs="Calibri"/>
+              </w:rPr>
+            </w:pPr>
+            <w:r>
+              <w:rPr>
+                <w:rFonts w:ascii="Calibri" w:hAnsi="Calibri" w:cs="Calibri"/>
+              </w:rPr>
+              <w:t xml:space="preserve">Use </w:t>
+            </w:r>
+            <w:proofErr w:type="spellStart"/>
+            <w:r>
+              <w:rPr>
+                <w:rFonts w:ascii="Calibri" w:hAnsi="Calibri" w:cs="Calibri"/>
+              </w:rPr>
+              <w:t>SvelteKit</w:t>
+            </w:r>
+            <w:proofErr w:type="spellEnd"/>
+            <w:r>
+              <w:rPr>
+                <w:rFonts w:ascii="Calibri" w:hAnsi="Calibri" w:cs="Calibri"/>
+              </w:rPr>
+              <w:t xml:space="preserve"> server-side load functions to validate user sessions before displaying records .</w:t>
+            </w:r>
+          </w:p>
+        </w:tc>
+      </w:tr>
+      <w:tr>
+        <w:tc>
+          <w:tcPr>
+            <w:tcW w:w="0" w:type="auto"/>
+          </w:tcPr>
+          <w:p>
+            <w:pPr>
+              <w:rPr>
+                <w:rFonts w:ascii="Calibri" w:hAnsi="Calibri" w:cs="Calibri"/>
+                <w:b/>
+                <w:bCs/>
+              </w:rPr>
+            </w:pPr>
+            <w:r>
+              <w:rPr>
+                <w:rFonts w:ascii="Calibri" w:hAnsi="Calibri" w:cs="Calibri"/>
+                <w:b/>
+                <w:bCs/>
+              </w:rPr>
+              <w:t>2</w:t>
+            </w:r>
+          </w:p>
+        </w:tc>
+        <w:tc>
+          <w:tcPr>
+            <w:tcW w:w="0" w:type="auto"/>
+            <w:hideMark/>
+          </w:tcPr>
+          <w:p>
+            <w:pPr>
+              <w:spacing w:after="160" w:line="278" w:lineRule="auto"/>
+              <w:rPr>
+                <w:rFonts w:ascii="Calibri" w:hAnsi="Calibri" w:cs="Calibri"/>
+              </w:rPr>
+            </w:pPr>
+            <w:r>
+              <w:rPr>
+                <w:rFonts w:ascii="Calibri" w:hAnsi="Calibri" w:cs="Calibri"/>
+                <w:b/>
+                <w:bCs/>
+              </w:rPr>
+              <w:t>Logic Errors in Booking</w:t>
+            </w:r>
+          </w:p>
+        </w:tc>
+        <w:tc>
+          <w:tcPr>
+            <w:tcW w:w="0" w:type="auto"/>
+            <w:hideMark/>
+          </w:tcPr>
+          <w:p>
+            <w:pPr>
+              <w:spacing w:after="160" w:line="278" w:lineRule="auto"/>
+              <w:rPr>
+                <w:rFonts w:ascii="Calibri" w:hAnsi="Calibri" w:cs="Calibri"/>
+              </w:rPr>
+            </w:pPr>
+            <w:r>
+              <w:rPr>
+                <w:rFonts w:ascii="Calibri" w:hAnsi="Calibri" w:cs="Calibri"/>
+              </w:rPr>
+              <w:t>Medium</w:t>
+            </w:r>
+          </w:p>
+        </w:tc>
+        <w:tc>
+          <w:tcPr>
+            <w:tcW w:w="0" w:type="auto"/>
+            <w:hideMark/>
+          </w:tcPr>
+          <w:p>
+            <w:pPr>
+              <w:spacing w:after="160" w:line="278" w:lineRule="auto"/>
+              <w:rPr>
+                <w:rFonts w:ascii="Calibri" w:hAnsi="Calibri" w:cs="Calibri"/>
+              </w:rPr>
+            </w:pPr>
+            <w:r>
+              <w:rPr>
+                <w:rFonts w:ascii="Calibri" w:hAnsi="Calibri" w:cs="Calibri"/>
+              </w:rPr>
+              <w:t>Medium</w:t>
+            </w:r>
+          </w:p>
+        </w:tc>
+        <w:tc>
+          <w:tcPr>
+            <w:tcW w:w="0" w:type="auto"/>
+            <w:hideMark/>
+          </w:tcPr>
+          <w:p>
+            <w:pPr>
+              <w:spacing w:after="160" w:line="278" w:lineRule="auto"/>
+              <w:rPr>
+                <w:rFonts w:ascii="Calibri" w:hAnsi="Calibri" w:cs="Calibri"/>
+              </w:rPr>
+            </w:pPr>
+            <w:r>
+              <w:rPr>
+                <w:rFonts w:ascii="Calibri" w:hAnsi="Calibri" w:cs="Calibri"/>
+              </w:rPr>
+              <w:t>Implement automated Unit Testing (Arrange, Act, Assert) for the date/time selection logic .</w:t>
+            </w:r>
+          </w:p>
+        </w:tc>
+      </w:tr>
+      <w:tr>
+        <w:tc>
+          <w:tcPr>
+            <w:tcW w:w="0" w:type="auto"/>
+          </w:tcPr>
+          <w:p>
+            <w:pPr>
+              <w:rPr>
+                <w:rFonts w:ascii="Calibri" w:hAnsi="Calibri" w:cs="Calibri"/>
+                <w:b/>
+                <w:bCs/>
+              </w:rPr>
+            </w:pPr>
+            <w:r>
+              <w:rPr>
+                <w:rFonts w:ascii="Calibri" w:hAnsi="Calibri" w:cs="Calibri"/>
+                <w:b/>
+                <w:bCs/>
+              </w:rPr>
+              <w:t>3</w:t>
+            </w:r>
+          </w:p>
+        </w:tc>
+        <w:tc>
+          <w:tcPr>
+            <w:tcW w:w="0" w:type="auto"/>
+            <w:hideMark/>
+          </w:tcPr>
+          <w:p>
+            <w:pPr>
+              <w:spacing w:after="160" w:line="278" w:lineRule="auto"/>
+              <w:rPr>
+                <w:rFonts w:ascii="Calibri" w:hAnsi="Calibri" w:cs="Calibri"/>
+              </w:rPr>
+            </w:pPr>
+            <w:r>
+              <w:rPr>
+                <w:rFonts w:ascii="Calibri" w:hAnsi="Calibri" w:cs="Calibri"/>
+                <w:b/>
+                <w:bCs/>
+              </w:rPr>
+              <w:t>Scope Creep</w:t>
+            </w:r>
+          </w:p>
+        </w:tc>
+        <w:tc>
+          <w:tcPr>
+            <w:tcW w:w="0" w:type="auto"/>
+            <w:hideMark/>
+          </w:tcPr>
+          <w:p>
+            <w:pPr>
+              <w:spacing w:after="160" w:line="278" w:lineRule="auto"/>
+              <w:rPr>
+                <w:rFonts w:ascii="Calibri" w:hAnsi="Calibri" w:cs="Calibri"/>
+              </w:rPr>
+            </w:pPr>
+            <w:r>
+              <w:rPr>
+                <w:rFonts w:ascii="Calibri" w:hAnsi="Calibri" w:cs="Calibri"/>
+              </w:rPr>
+              <w:t>Medium</w:t>
+            </w:r>
+          </w:p>
+        </w:tc>
+        <w:tc>
+          <w:tcPr>
+            <w:tcW w:w="0" w:type="auto"/>
+            <w:hideMark/>
+          </w:tcPr>
+          <w:p>
+            <w:pPr>
+              <w:spacing w:after="160" w:line="278" w:lineRule="auto"/>
+              <w:rPr>
+                <w:rFonts w:ascii="Calibri" w:hAnsi="Calibri" w:cs="Calibri"/>
+              </w:rPr>
+            </w:pPr>
+            <w:r>
+              <w:rPr>
+                <w:rFonts w:ascii="Calibri" w:hAnsi="Calibri" w:cs="Calibri"/>
+              </w:rPr>
+              <w:t>Medium</w:t>
+            </w:r>
+          </w:p>
+        </w:tc>
+        <w:tc>
+          <w:tcPr>
+            <w:tcW w:w="0" w:type="auto"/>
+            <w:hideMark/>
+          </w:tcPr>
+          <w:p>
+            <w:pPr>
+              <w:spacing w:after="160" w:line="278" w:lineRule="auto"/>
+              <w:rPr>
+                <w:rFonts w:ascii="Calibri" w:hAnsi="Calibri" w:cs="Calibri"/>
+              </w:rPr>
+            </w:pPr>
+            <w:r>
+              <w:rPr>
+                <w:rFonts w:ascii="Calibri" w:hAnsi="Calibri" w:cs="Calibri"/>
+              </w:rPr>
+              <w:t>Strictly adhere to the "Out of Scope" list and prioritize the Minimum Viable Product (MVP) features.</w:t>
+            </w:r>
+          </w:p>
+        </w:tc>
+      </w:tr>
+    </w:tbl>
+    <w:p>
+      <w:pPr>
+        <w:rPr>
+          <w:rFonts w:ascii="Calibri" w:hAnsi="Calibri" w:cs="Calibri"/>
+        </w:rPr>
+      </w:pPr>
+    </w:p>
+    <w:p>
+      <w:pPr>
+        <w:rPr>
+          <w:rFonts w:ascii="Calibri" w:hAnsi="Calibri" w:cs="Calibri"/>
+          <w:b/>
+          <w:bCs/>
+          <w:u w:val="single"/>
+        </w:rPr>
+      </w:pPr>
+      <w:r>
+        <w:rPr>
+          <w:rFonts w:ascii="Calibri" w:hAnsi="Calibri" w:cs="Calibri"/>
+          <w:b/>
+          <w:bCs/>
+          <w:u w:val="single"/>
+        </w:rPr>
+        <w:t>Testing Plan</w:t>
+      </w:r>
+    </w:p>
+    <w:p>
+      <w:pPr>
+        <w:rPr>
+          <w:rFonts w:ascii="Calibri" w:hAnsi="Calibri" w:cs="Calibri"/>
+        </w:rPr>
+      </w:pPr>
+      <w:r>
+        <w:rPr>
+          <w:rFonts w:ascii="Calibri" w:hAnsi="Calibri" w:cs="Calibri"/>
+          <w:b/>
+          <w:bCs/>
+        </w:rPr>
+        <w:lastRenderedPageBreak/>
+        <w:t>Unit Testing:</w:t>
+      </w:r>
+      <w:r>
+        <w:rPr>
+          <w:rFonts w:ascii="Calibri" w:hAnsi="Calibri" w:cs="Calibri"/>
+        </w:rPr>
+        <w:t xml:space="preserve"> Individual functions (e.g., date validation) will be tested using the </w:t>
+      </w:r>
+      <w:r>
+        <w:rPr>
+          <w:rFonts w:ascii="Calibri" w:hAnsi="Calibri" w:cs="Calibri"/>
+          <w:b/>
+          <w:bCs/>
+        </w:rPr>
+        <w:t>Arrange, Act, Assert</w:t>
+      </w:r>
+      <w:r>
+        <w:rPr>
+          <w:rFonts w:ascii="Calibri" w:hAnsi="Calibri" w:cs="Calibri"/>
+        </w:rPr>
+        <w:t xml:space="preserve"> pattern.</w:t>
+      </w:r>
+    </w:p>
+    <w:p>
+      <w:pPr>
+        <w:rPr>
+          <w:rFonts w:ascii="Calibri" w:hAnsi="Calibri" w:cs="Calibri"/>
+        </w:rPr>
+      </w:pPr>
+      <w:r>
+        <w:rPr>
+          <w:rFonts w:ascii="Calibri" w:hAnsi="Calibri" w:cs="Calibri"/>
+          <w:b/>
+          <w:bCs/>
+        </w:rPr>
+        <w:t>Functional Testing:</w:t>
+      </w:r>
+      <w:r>
+        <w:rPr>
+          <w:rFonts w:ascii="Calibri" w:hAnsi="Calibri" w:cs="Calibri"/>
+        </w:rPr>
+        <w:t xml:space="preserve"> Manual "walkthroughs" of the UI to ensure the Booking Form and Calendar behave as expected .</w:t>
+      </w:r>
+    </w:p>
+    <w:p>
+      <w:pPr>
+        <w:rPr>
+          <w:rFonts w:ascii="Calibri" w:hAnsi="Calibri" w:cs="Calibri"/>
+        </w:rPr>
+      </w:pPr>
+      <w:r>
+        <w:rPr>
+          <w:rFonts w:ascii="Calibri" w:hAnsi="Calibri" w:cs="Calibri"/>
+          <w:b/>
+          <w:bCs/>
+        </w:rPr>
+        <w:t>Security Testing:</w:t>
+      </w:r>
+      <w:r>
+        <w:rPr>
+          <w:rFonts w:ascii="Calibri" w:hAnsi="Calibri" w:cs="Calibri"/>
+        </w:rPr>
+        <w:t xml:space="preserve"> Verification that unauthorized users cannot access the /portal or /admin routes</w:t>
+      </w:r>
+    </w:p>
+    <w:p>
+      <w:pPr>
+        <w:rPr>
+          <w:rFonts w:ascii="Calibri" w:hAnsi="Calibri" w:cs="Calibri"/>
+        </w:rPr>
+      </w:pPr>
+    </w:p>
+    <w:p>
+      <w:pPr>
+        <w:rPr>
+          <w:rFonts w:ascii="Calibri" w:hAnsi="Calibri" w:cs="Calibri"/>
+          <w:b/>
+          <w:bCs/>
+          <w:u w:val="single"/>
+        </w:rPr>
+      </w:pPr>
+    </w:p>
     <w:sectPr>
       <w:pgSz w:w="12240" w:h="15840"/>
       <w:pgMar w:top="1440" w:right="1440" w:bottom="1440" w:left="1440" w:header="720" w:footer="720" w:gutter="0"/>
@@ -1358,6 +1922,25 @@
     <w:basedOn w:val="DefaultParagraphFont"/>
     <w:rsid w:val="00895C2F"/>
   </w:style>
+  <w:style w:type="table" w:styleId="TableGrid">
+    <w:name w:val="Table Grid"/>
+    <w:basedOn w:val="TableNormal"/>
+    <w:uiPriority w:val="39"/>
+    <w:rsid w:val="002B2641"/>
+    <w:pPr>
+      <w:spacing w:after="0" w:line="240" w:lineRule="auto"/>
+    </w:pPr>
+    <w:tblPr>
+      <w:tblBorders>
+        <w:top w:val="single" w:sz="4" w:space="0" w:color="auto"/>
+        <w:left w:val="single" w:sz="4" w:space="0" w:color="auto"/>
+        <w:bottom w:val="single" w:sz="4" w:space="0" w:color="auto"/>
+        <w:right w:val="single" w:sz="4" w:space="0" w:color="auto"/>
+        <w:insideH w:val="single" w:sz="4" w:space="0" w:color="auto"/>
+        <w:insideV w:val="single" w:sz="4" w:space="0" w:color="auto"/>
+      </w:tblBorders>
+    </w:tblPr>
+  </w:style>
 </w:styles>
 </file>
 

</xml_diff>

<commit_message>
docs: update Product Specification Document with detailed product overview, user personas, functional specifications, and testing plan
</commit_message>
<xml_diff>
--- a/docs/PSD.docx
+++ b/docs/PSD.docx
@@ -4,396 +4,714 @@
   <w:body>
     <w:p>
       <w:pPr>
-        <w:pStyle w:val="NormalWeb"/>
-        <w:spacing w:before="0" w:beforeAutospacing="0"/>
-        <w:rPr>
-          <w:rFonts w:ascii="Calibri" w:eastAsiaTheme="majorEastAsia" w:hAnsi="Calibri" w:cs="Calibri"/>
-          <w:b/>
-          <w:bCs/>
-        </w:rPr>
-      </w:pPr>
-      <w:r>
-        <w:rPr>
-          <w:rStyle w:val="citation-1296"/>
-          <w:rFonts w:ascii="Calibri" w:eastAsiaTheme="majorEastAsia" w:hAnsi="Calibri" w:cs="Calibri"/>
-          <w:b/>
-          <w:bCs/>
-        </w:rPr>
-        <w:t>Product Name:</w:t>
-      </w:r>
-      <w:r>
-        <w:rPr>
-          <w:rStyle w:val="citation-1296"/>
-          <w:rFonts w:ascii="Calibri" w:eastAsiaTheme="majorEastAsia" w:hAnsi="Calibri" w:cs="Calibri"/>
-        </w:rPr>
-        <w:t xml:space="preserve"> CarePoint Hospital System</w:t>
-      </w:r>
-      <w:r>
-        <w:rPr>
-          <w:rFonts w:ascii="Calibri" w:hAnsi="Calibri" w:cs="Calibri"/>
+        <w:pStyle w:val="Heading1"/>
+      </w:pPr>
+      <w:r>
+        <w:t>CarePoint Hospital System: Product Specification Document (PS</w:t>
+      </w:r>
+      <w:r>
+        <w:t>D)</w:t>
+      </w:r>
+    </w:p>
+    <w:p>
+      <w:pPr>
+        <w:pStyle w:val="Heading2"/>
+      </w:pPr>
+      <w:r>
+        <w:t>1. Product Summary &amp; Business Case</w:t>
+      </w:r>
+    </w:p>
+    <w:p>
+      <w:pPr>
+        <w:numPr>
+          <w:ilvl w:val="0"/>
+          <w:numId w:val="1"/>
+        </w:numPr>
+        <w:rPr>
+          <w:rFonts w:ascii="Calibri" w:hAnsi="Calibri" w:cs="Calibri"/>
+        </w:rPr>
+      </w:pPr>
+      <w:r>
+        <w:rPr>
+          <w:rFonts w:ascii="Calibri" w:hAnsi="Calibri" w:cs="Calibri"/>
+          <w:b/>
+          <w:bCs/>
+        </w:rPr>
+        <w:t>Product Overview</w:t>
+      </w:r>
+      <w:r>
+        <w:rPr>
+          <w:rFonts w:ascii="Calibri" w:hAnsi="Calibri" w:cs="Calibri"/>
+        </w:rPr>
+        <w:t>: CarePoint is a patient-centric hospital management system developed to empower users through self-service digital interactions. The system focuses on three core pillars: secure identity management, real-time resource visibility, and seamless data retrieval.</w:t>
+      </w:r>
+    </w:p>
+    <w:p>
+      <w:pPr>
+        <w:numPr>
+          <w:ilvl w:val="0"/>
+          <w:numId w:val="1"/>
+        </w:numPr>
+        <w:rPr>
+          <w:rFonts w:ascii="Calibri" w:hAnsi="Calibri" w:cs="Calibri"/>
+        </w:rPr>
+      </w:pPr>
+      <w:r>
+        <w:rPr>
+          <w:rFonts w:ascii="Calibri" w:hAnsi="Calibri" w:cs="Calibri"/>
+          <w:b/>
+          <w:bCs/>
+        </w:rPr>
+        <w:t xml:space="preserve">The Problem: </w:t>
+      </w:r>
+      <w:r>
+        <w:rPr>
+          <w:rFonts w:ascii="Calibri" w:hAnsi="Calibri" w:cs="Calibri"/>
+        </w:rPr>
+        <w:t xml:space="preserve">Existing clinical systems are often administrative-heavy, leading to patient frustration with telephone </w:t>
+      </w:r>
+      <w:proofErr w:type="gramStart"/>
+      <w:r>
+        <w:rPr>
+          <w:rFonts w:ascii="Calibri" w:hAnsi="Calibri" w:cs="Calibri"/>
+        </w:rPr>
+        <w:t>wait</w:t>
+      </w:r>
+      <w:proofErr w:type="gramEnd"/>
+      <w:r>
+        <w:rPr>
+          <w:rFonts w:ascii="Calibri" w:hAnsi="Calibri" w:cs="Calibri"/>
+        </w:rPr>
+        <w:t xml:space="preserve"> times for bookings and a lack of transparency regarding personal health records.</w:t>
+      </w:r>
+    </w:p>
+    <w:p>
+      <w:pPr>
+        <w:numPr>
+          <w:ilvl w:val="0"/>
+          <w:numId w:val="1"/>
+        </w:numPr>
+        <w:rPr>
+          <w:rFonts w:ascii="Calibri" w:hAnsi="Calibri" w:cs="Calibri"/>
+          <w:b/>
+          <w:bCs/>
+        </w:rPr>
+      </w:pPr>
+      <w:r>
+        <w:rPr>
+          <w:rFonts w:ascii="Calibri" w:hAnsi="Calibri" w:cs="Calibri"/>
+          <w:b/>
+          <w:bCs/>
+        </w:rPr>
+        <w:t xml:space="preserve">Business Value: </w:t>
+      </w:r>
+      <w:r>
+        <w:rPr>
+          <w:rFonts w:ascii="Calibri" w:hAnsi="Calibri" w:cs="Calibri"/>
+        </w:rPr>
+        <w:t>By shifting appointment management and record viewing to a digital self-service model, CarePoint reduces administrative overhead for GP surgeries and improves patient engagement and data accuracy.</w:t>
+      </w:r>
+    </w:p>
+    <w:p>
+      <w:pPr>
+        <w:rPr>
+          <w:rFonts w:ascii="Calibri" w:hAnsi="Calibri" w:cs="Calibri"/>
+          <w:b/>
+          <w:bCs/>
+        </w:rPr>
+      </w:pPr>
+    </w:p>
+    <w:p>
+      <w:pPr>
+        <w:pStyle w:val="Heading2"/>
+      </w:pPr>
+      <w:r>
+        <w:t>2. User Personas (Demographics &amp; Goals)</w:t>
+      </w:r>
+    </w:p>
+    <w:p>
+      <w:pPr>
+        <w:numPr>
+          <w:ilvl w:val="0"/>
+          <w:numId w:val="2"/>
+        </w:numPr>
+        <w:rPr>
+          <w:rFonts w:ascii="Calibri" w:hAnsi="Calibri" w:cs="Calibri"/>
+        </w:rPr>
+      </w:pPr>
+      <w:r>
+        <w:rPr>
+          <w:rFonts w:ascii="Calibri" w:hAnsi="Calibri" w:cs="Calibri"/>
+          <w:b/>
+          <w:bCs/>
+        </w:rPr>
+        <w:t>Arthur (72), Patient</w:t>
+      </w:r>
+      <w:r>
+        <w:rPr>
+          <w:rFonts w:ascii="Calibri" w:hAnsi="Calibri" w:cs="Calibri"/>
+        </w:rPr>
+        <w:t>: Retiree with limited technical patience. Goal: To book recurring check-ups easily without navigating complex phone menus.</w:t>
+      </w:r>
+    </w:p>
+    <w:p>
+      <w:pPr>
+        <w:numPr>
+          <w:ilvl w:val="0"/>
+          <w:numId w:val="2"/>
+        </w:numPr>
+        <w:rPr>
+          <w:rFonts w:ascii="Calibri" w:hAnsi="Calibri" w:cs="Calibri"/>
+        </w:rPr>
+      </w:pPr>
+      <w:r>
+        <w:rPr>
+          <w:rFonts w:ascii="Calibri" w:hAnsi="Calibri" w:cs="Calibri"/>
+          <w:b/>
+          <w:bCs/>
+        </w:rPr>
+        <w:t>Sarah (29), Patient</w:t>
+      </w:r>
+      <w:r>
+        <w:rPr>
+          <w:rFonts w:ascii="Calibri" w:hAnsi="Calibri" w:cs="Calibri"/>
+        </w:rPr>
+        <w:t>: Busy professional who is mobile-first. Goal: To view medical results and book appointments instantly between meetings.</w:t>
+      </w:r>
+    </w:p>
+    <w:p>
+      <w:pPr>
+        <w:numPr>
+          <w:ilvl w:val="0"/>
+          <w:numId w:val="2"/>
+        </w:numPr>
+        <w:rPr>
+          <w:rFonts w:ascii="Calibri" w:hAnsi="Calibri" w:cs="Calibri"/>
+        </w:rPr>
+      </w:pPr>
+      <w:r>
+        <w:rPr>
+          <w:rFonts w:ascii="Calibri" w:hAnsi="Calibri" w:cs="Calibri"/>
+          <w:b/>
+          <w:bCs/>
+        </w:rPr>
+        <w:t>Dr. Mehta (45), Clinician</w:t>
+      </w:r>
+      <w:r>
+        <w:rPr>
+          <w:rFonts w:ascii="Calibri" w:hAnsi="Calibri" w:cs="Calibri"/>
+        </w:rPr>
+        <w:t>: High-volume GP. Goal: A reliable, real-time view of the daily schedule to manage patient flow effectively.</w:t>
+      </w:r>
+    </w:p>
+    <w:p>
+      <w:pPr>
+        <w:rPr>
+          <w:rFonts w:ascii="Calibri" w:hAnsi="Calibri" w:cs="Calibri"/>
+        </w:rPr>
+      </w:pPr>
+    </w:p>
+    <w:p>
+      <w:pPr>
+        <w:pStyle w:val="Heading2"/>
+      </w:pPr>
+      <w:r>
+        <w:t>3. Functional Specifications (Product Features)</w:t>
+      </w:r>
+    </w:p>
+    <w:p>
+      <w:pPr>
+        <w:numPr>
+          <w:ilvl w:val="0"/>
+          <w:numId w:val="3"/>
+        </w:numPr>
+        <w:rPr>
+          <w:rFonts w:ascii="Calibri" w:hAnsi="Calibri" w:cs="Calibri"/>
+        </w:rPr>
+      </w:pPr>
+      <w:r>
+        <w:rPr>
+          <w:rFonts w:ascii="Calibri" w:hAnsi="Calibri" w:cs="Calibri"/>
+          <w:b/>
+          <w:bCs/>
+        </w:rPr>
+        <w:t>Secure Authentication</w:t>
+      </w:r>
+      <w:r>
+        <w:rPr>
+          <w:rFonts w:ascii="Calibri" w:hAnsi="Calibri" w:cs="Calibri"/>
+        </w:rPr>
+        <w:t>: A robust login system using server-side session validation to ensure data privacy.</w:t>
+      </w:r>
+    </w:p>
+    <w:p>
+      <w:pPr>
+        <w:numPr>
+          <w:ilvl w:val="0"/>
+          <w:numId w:val="3"/>
+        </w:numPr>
+        <w:rPr>
+          <w:rFonts w:ascii="Calibri" w:hAnsi="Calibri" w:cs="Calibri"/>
+          <w:b/>
+          <w:bCs/>
+        </w:rPr>
+      </w:pPr>
+      <w:r>
+        <w:rPr>
+          <w:rFonts w:ascii="Calibri" w:hAnsi="Calibri" w:cs="Calibri"/>
+          <w:b/>
+          <w:bCs/>
+        </w:rPr>
+        <w:t xml:space="preserve">Dynamic Booking Interface: </w:t>
+      </w:r>
+      <w:r>
+        <w:rPr>
+          <w:rFonts w:ascii="Calibri" w:hAnsi="Calibri" w:cs="Calibri"/>
+        </w:rPr>
+        <w:t>A form-based system that allows patients to select specific doctors and available time slots</w:t>
+      </w:r>
+      <w:r>
+        <w:rPr>
+          <w:rFonts w:ascii="Calibri" w:hAnsi="Calibri" w:cs="Calibri"/>
+          <w:b/>
+          <w:bCs/>
         </w:rPr>
         <w:t>.</w:t>
       </w:r>
     </w:p>
     <w:p>
       <w:pPr>
-        <w:pStyle w:val="NormalWeb"/>
-        <w:spacing w:before="0" w:beforeAutospacing="0"/>
-        <w:rPr>
-          <w:rFonts w:ascii="Calibri" w:hAnsi="Calibri" w:cs="Calibri"/>
-        </w:rPr>
-      </w:pPr>
-      <w:r>
-        <w:rPr>
-          <w:rStyle w:val="citation-1295"/>
-          <w:rFonts w:ascii="Calibri" w:eastAsiaTheme="majorEastAsia" w:hAnsi="Calibri" w:cs="Calibri"/>
-          <w:b/>
-          <w:bCs/>
-        </w:rPr>
-        <w:t>Problem to Solve:</w:t>
-      </w:r>
-      <w:r>
-        <w:rPr>
-          <w:rStyle w:val="citation-1295"/>
-          <w:rFonts w:ascii="Calibri" w:eastAsiaTheme="majorEastAsia" w:hAnsi="Calibri" w:cs="Calibri"/>
-        </w:rPr>
-        <w:t xml:space="preserve"> Patients struggle to book appointments quickly and lack secure, instant access to their own medical data</w:t>
-      </w:r>
-      <w:r>
-        <w:rPr>
-          <w:rFonts w:ascii="Calibri" w:hAnsi="Calibri" w:cs="Calibri"/>
-        </w:rPr>
-        <w:t>.</w:t>
-      </w:r>
-    </w:p>
-    <w:p>
-      <w:pPr>
-        <w:pStyle w:val="NormalWeb"/>
-        <w:spacing w:before="0" w:beforeAutospacing="0"/>
-        <w:rPr>
-          <w:rFonts w:ascii="Calibri" w:hAnsi="Calibri" w:cs="Calibri"/>
-        </w:rPr>
-      </w:pPr>
-      <w:r>
-        <w:rPr>
-          <w:rStyle w:val="citation-1294"/>
-          <w:rFonts w:ascii="Calibri" w:eastAsiaTheme="majorEastAsia" w:hAnsi="Calibri" w:cs="Calibri"/>
-          <w:b/>
-          <w:bCs/>
-        </w:rPr>
-        <w:t>Target Users:</w:t>
-      </w:r>
-      <w:r>
-        <w:rPr>
-          <w:rStyle w:val="citation-1294"/>
-          <w:rFonts w:ascii="Calibri" w:eastAsiaTheme="majorEastAsia" w:hAnsi="Calibri" w:cs="Calibri"/>
-        </w:rPr>
-        <w:t xml:space="preserve"> NHS Patients (all ages) and Hospital Staff/Doctors</w:t>
-      </w:r>
-      <w:r>
-        <w:rPr>
-          <w:rFonts w:ascii="Calibri" w:hAnsi="Calibri" w:cs="Calibri"/>
-        </w:rPr>
-        <w:t>.</w:t>
-      </w:r>
-    </w:p>
-    <w:p>
-      <w:pPr>
-        <w:pStyle w:val="NormalWeb"/>
-        <w:spacing w:before="0" w:beforeAutospacing="0"/>
-        <w:rPr>
-          <w:rFonts w:ascii="Calibri" w:hAnsi="Calibri" w:cs="Calibri"/>
-        </w:rPr>
-      </w:pPr>
-      <w:r>
-        <w:rPr>
-          <w:rStyle w:val="citation-1293"/>
-          <w:rFonts w:ascii="Calibri" w:eastAsiaTheme="majorEastAsia" w:hAnsi="Calibri" w:cs="Calibri"/>
-          <w:b/>
-          <w:bCs/>
-        </w:rPr>
-        <w:t>Scope (What):</w:t>
-      </w:r>
-      <w:r>
-        <w:rPr>
-          <w:rStyle w:val="citation-1293"/>
-          <w:rFonts w:ascii="Calibri" w:eastAsiaTheme="majorEastAsia" w:hAnsi="Calibri" w:cs="Calibri"/>
-        </w:rPr>
-        <w:t xml:space="preserve"> Secure login, dynamic appointment booking, real-time doctor availability calendar, and a patient medical record portal</w:t>
-      </w:r>
-      <w:r>
-        <w:rPr>
-          <w:rFonts w:ascii="Calibri" w:hAnsi="Calibri" w:cs="Calibri"/>
-        </w:rPr>
-        <w:t>.</w:t>
-      </w:r>
-    </w:p>
-    <w:p>
-      <w:pPr>
-        <w:pStyle w:val="NormalWeb"/>
-        <w:spacing w:before="0" w:beforeAutospacing="0"/>
-        <w:rPr>
-          <w:rFonts w:ascii="Calibri" w:hAnsi="Calibri" w:cs="Calibri"/>
-        </w:rPr>
-      </w:pPr>
-      <w:r>
-        <w:rPr>
-          <w:rStyle w:val="citation-1292"/>
-          <w:rFonts w:ascii="Calibri" w:eastAsiaTheme="majorEastAsia" w:hAnsi="Calibri" w:cs="Calibri"/>
-          <w:b/>
-          <w:bCs/>
-        </w:rPr>
-        <w:t>Out of Scope:</w:t>
-      </w:r>
-      <w:r>
-        <w:rPr>
-          <w:rStyle w:val="citation-1292"/>
-          <w:rFonts w:ascii="Calibri" w:eastAsiaTheme="majorEastAsia" w:hAnsi="Calibri" w:cs="Calibri"/>
-        </w:rPr>
-        <w:t xml:space="preserve"> Prescription payments, video consultations, and staff payroll systems (to keep the project feasible)</w:t>
-      </w:r>
-      <w:r>
-        <w:rPr>
-          <w:rFonts w:ascii="Calibri" w:hAnsi="Calibri" w:cs="Calibri"/>
-        </w:rPr>
-        <w:t>.</w:t>
-      </w:r>
-    </w:p>
-    <w:p>
-      <w:pPr>
-        <w:pStyle w:val="NormalWeb"/>
-        <w:spacing w:before="0" w:beforeAutospacing="0"/>
-        <w:rPr>
-          <w:rFonts w:ascii="Calibri" w:hAnsi="Calibri" w:cs="Calibri"/>
-        </w:rPr>
-      </w:pPr>
-      <w:r>
-        <w:rPr>
-          <w:rStyle w:val="citation-1291"/>
-          <w:rFonts w:ascii="Calibri" w:eastAsiaTheme="majorEastAsia" w:hAnsi="Calibri" w:cs="Calibri"/>
-          <w:b/>
-          <w:bCs/>
-        </w:rPr>
-        <w:t>Tech Stack:</w:t>
-      </w:r>
-      <w:r>
-        <w:rPr>
-          <w:rStyle w:val="citation-1291"/>
-          <w:rFonts w:ascii="Calibri" w:eastAsiaTheme="majorEastAsia" w:hAnsi="Calibri" w:cs="Calibri"/>
+        <w:numPr>
+          <w:ilvl w:val="0"/>
+          <w:numId w:val="3"/>
+        </w:numPr>
+        <w:rPr>
+          <w:rFonts w:ascii="Calibri" w:hAnsi="Calibri" w:cs="Calibri"/>
+        </w:rPr>
+      </w:pPr>
+      <w:r>
+        <w:rPr>
+          <w:rFonts w:ascii="Calibri" w:hAnsi="Calibri" w:cs="Calibri"/>
+          <w:b/>
+          <w:bCs/>
+        </w:rPr>
+        <w:t xml:space="preserve">Real-time Calendar: </w:t>
+      </w:r>
+      <w:r>
+        <w:rPr>
+          <w:rFonts w:ascii="Calibri" w:hAnsi="Calibri" w:cs="Calibri"/>
+        </w:rPr>
+        <w:t xml:space="preserve">A reactive dashboard displaying doctor availability, updated instantly via </w:t>
+      </w:r>
+      <w:proofErr w:type="spellStart"/>
+      <w:r>
+        <w:rPr>
+          <w:rFonts w:ascii="Calibri" w:hAnsi="Calibri" w:cs="Calibri"/>
+        </w:rPr>
+        <w:t>SvelteKit’s</w:t>
+      </w:r>
+      <w:proofErr w:type="spellEnd"/>
+      <w:r>
+        <w:rPr>
+          <w:rFonts w:ascii="Calibri" w:hAnsi="Calibri" w:cs="Calibri"/>
+        </w:rPr>
+        <w:t xml:space="preserve"> server-side load functions.</w:t>
+      </w:r>
+    </w:p>
+    <w:p>
+      <w:pPr>
+        <w:numPr>
+          <w:ilvl w:val="0"/>
+          <w:numId w:val="3"/>
+        </w:numPr>
+        <w:rPr>
+          <w:rFonts w:ascii="Calibri" w:hAnsi="Calibri" w:cs="Calibri"/>
+        </w:rPr>
+      </w:pPr>
+      <w:r>
+        <w:rPr>
+          <w:rFonts w:ascii="Calibri" w:hAnsi="Calibri" w:cs="Calibri"/>
+          <w:b/>
+          <w:bCs/>
+        </w:rPr>
+        <w:lastRenderedPageBreak/>
+        <w:t>Patient Medical Portal:</w:t>
+      </w:r>
+      <w:r>
+        <w:rPr>
+          <w:rFonts w:ascii="Calibri" w:hAnsi="Calibri" w:cs="Calibri"/>
+        </w:rPr>
+        <w:t xml:space="preserve"> A secure area for patients to retrieve and view their historical medical records.</w:t>
+      </w:r>
+    </w:p>
+    <w:p>
+      <w:pPr>
+        <w:rPr>
+          <w:rFonts w:ascii="Calibri" w:hAnsi="Calibri" w:cs="Calibri"/>
+        </w:rPr>
+      </w:pPr>
+    </w:p>
+    <w:p>
+      <w:pPr>
+        <w:pStyle w:val="Heading2"/>
+      </w:pPr>
+      <w:r>
+        <w:t>4. Success Metrics (Measurable Goals)</w:t>
+      </w:r>
+    </w:p>
+    <w:p>
+      <w:pPr>
+        <w:numPr>
+          <w:ilvl w:val="0"/>
+          <w:numId w:val="4"/>
+        </w:numPr>
+        <w:rPr>
+          <w:rFonts w:ascii="Calibri" w:hAnsi="Calibri" w:cs="Calibri"/>
+          <w:b/>
+          <w:bCs/>
+        </w:rPr>
+      </w:pPr>
+      <w:r>
+        <w:rPr>
+          <w:rFonts w:ascii="Calibri" w:hAnsi="Calibri" w:cs="Calibri"/>
+          <w:b/>
+          <w:bCs/>
+        </w:rPr>
+        <w:t xml:space="preserve">Testing Quality: </w:t>
+      </w:r>
+      <w:r>
+        <w:rPr>
+          <w:rFonts w:ascii="Calibri" w:hAnsi="Calibri" w:cs="Calibri"/>
+        </w:rPr>
+        <w:t>100% pass rate on all core functional unit tests using the Arrange, Act, Assert (AAA) pattern.</w:t>
+      </w:r>
+    </w:p>
+    <w:p>
+      <w:pPr>
+        <w:numPr>
+          <w:ilvl w:val="0"/>
+          <w:numId w:val="4"/>
+        </w:numPr>
+        <w:rPr>
+          <w:rFonts w:ascii="Calibri" w:hAnsi="Calibri" w:cs="Calibri"/>
+          <w:b/>
+          <w:bCs/>
+        </w:rPr>
+      </w:pPr>
+      <w:r>
+        <w:rPr>
+          <w:rFonts w:ascii="Calibri" w:hAnsi="Calibri" w:cs="Calibri"/>
+          <w:b/>
+          <w:bCs/>
+        </w:rPr>
+        <w:t xml:space="preserve">Performance: </w:t>
+      </w:r>
+      <w:r>
+        <w:rPr>
+          <w:rFonts w:ascii="Calibri" w:hAnsi="Calibri" w:cs="Calibri"/>
+        </w:rPr>
+        <w:t>The real-time calendar must load availability data in under 2 seconds to ensure a positive user experience.</w:t>
+      </w:r>
+    </w:p>
+    <w:p>
+      <w:pPr>
+        <w:numPr>
+          <w:ilvl w:val="0"/>
+          <w:numId w:val="4"/>
+        </w:numPr>
+        <w:rPr>
+          <w:rFonts w:ascii="Calibri" w:hAnsi="Calibri" w:cs="Calibri"/>
+          <w:b/>
+          <w:bCs/>
+        </w:rPr>
+      </w:pPr>
+      <w:r>
+        <w:rPr>
+          <w:rFonts w:ascii="Calibri" w:hAnsi="Calibri" w:cs="Calibri"/>
+          <w:b/>
+          <w:bCs/>
+        </w:rPr>
+        <w:t xml:space="preserve">Reliability: </w:t>
+      </w:r>
+      <w:r>
+        <w:rPr>
+          <w:rFonts w:ascii="Calibri" w:hAnsi="Calibri" w:cs="Calibri"/>
+        </w:rPr>
+        <w:t>Zero critical bugs (e.g., double-booking or unauthorized data access) identified during the final 5-minute demonstration.</w:t>
+      </w:r>
+    </w:p>
+    <w:p>
+      <w:pPr>
+        <w:rPr>
+          <w:rFonts w:ascii="Calibri" w:hAnsi="Calibri" w:cs="Calibri"/>
+          <w:b/>
+          <w:bCs/>
+        </w:rPr>
+      </w:pPr>
+    </w:p>
+    <w:p>
+      <w:pPr>
+        <w:pStyle w:val="Heading2"/>
+      </w:pPr>
+      <w:r>
+        <w:t>5. Technical Requirements (Hardware &amp; Software)</w:t>
+      </w:r>
+    </w:p>
+    <w:p>
+      <w:pPr>
+        <w:numPr>
+          <w:ilvl w:val="0"/>
+          <w:numId w:val="5"/>
+        </w:numPr>
+        <w:rPr>
+          <w:rFonts w:ascii="Calibri" w:hAnsi="Calibri" w:cs="Calibri"/>
+          <w:b/>
+          <w:bCs/>
+          <w:u w:val="single"/>
+        </w:rPr>
+      </w:pPr>
+      <w:r>
+        <w:rPr>
+          <w:rFonts w:ascii="Calibri" w:hAnsi="Calibri" w:cs="Calibri"/>
+          <w:b/>
+          <w:bCs/>
+          <w:u w:val="single"/>
+        </w:rPr>
+        <w:t>Development Software:</w:t>
+      </w:r>
+    </w:p>
+    <w:p>
+      <w:pPr>
+        <w:numPr>
+          <w:ilvl w:val="1"/>
+          <w:numId w:val="5"/>
+        </w:numPr>
+        <w:rPr>
+          <w:rFonts w:ascii="Calibri" w:hAnsi="Calibri" w:cs="Calibri"/>
+          <w:b/>
+          <w:bCs/>
+        </w:rPr>
+      </w:pPr>
+      <w:r>
+        <w:rPr>
+          <w:rFonts w:ascii="Calibri" w:hAnsi="Calibri" w:cs="Calibri"/>
+          <w:b/>
+          <w:bCs/>
+        </w:rPr>
+        <w:t xml:space="preserve">IDE: </w:t>
+      </w:r>
+      <w:r>
+        <w:rPr>
+          <w:rFonts w:ascii="Calibri" w:hAnsi="Calibri" w:cs="Calibri"/>
+        </w:rPr>
+        <w:t>Visual Studio Code (Requires minimum 1.6GHz processor and 1GB RAM).</w:t>
+      </w:r>
+    </w:p>
+    <w:p>
+      <w:pPr>
+        <w:numPr>
+          <w:ilvl w:val="1"/>
+          <w:numId w:val="5"/>
+        </w:numPr>
+        <w:rPr>
+          <w:rFonts w:ascii="Calibri" w:hAnsi="Calibri" w:cs="Calibri"/>
+          <w:b/>
+          <w:bCs/>
+        </w:rPr>
+      </w:pPr>
+      <w:r>
+        <w:rPr>
+          <w:rFonts w:ascii="Calibri" w:hAnsi="Calibri" w:cs="Calibri"/>
+          <w:b/>
+          <w:bCs/>
+        </w:rPr>
+        <w:t>Framework:</w:t>
+      </w:r>
+      <w:r>
+        <w:rPr>
+          <w:rFonts w:ascii="Calibri" w:hAnsi="Calibri" w:cs="Calibri"/>
         </w:rPr>
         <w:t xml:space="preserve"> </w:t>
       </w:r>
       <w:proofErr w:type="spellStart"/>
       <w:r>
         <w:rPr>
-          <w:rStyle w:val="citation-1291"/>
-          <w:rFonts w:ascii="Calibri" w:eastAsiaTheme="majorEastAsia" w:hAnsi="Calibri" w:cs="Calibri"/>
-          <w:b/>
-          <w:bCs/>
+          <w:rFonts w:ascii="Calibri" w:hAnsi="Calibri" w:cs="Calibri"/>
         </w:rPr>
         <w:t>SvelteKit</w:t>
       </w:r>
       <w:proofErr w:type="spellEnd"/>
       <w:r>
         <w:rPr>
-          <w:rStyle w:val="citation-1291"/>
-          <w:rFonts w:ascii="Calibri" w:eastAsiaTheme="majorEastAsia" w:hAnsi="Calibri" w:cs="Calibri"/>
-        </w:rPr>
-        <w:t xml:space="preserve"> (Frontend/Backend) for reactive data retrieval and </w:t>
-      </w:r>
-      <w:r>
-        <w:rPr>
-          <w:rStyle w:val="citation-1291"/>
-          <w:rFonts w:ascii="Calibri" w:eastAsiaTheme="majorEastAsia" w:hAnsi="Calibri" w:cs="Calibri"/>
-          <w:b/>
-          <w:bCs/>
-        </w:rPr>
-        <w:t>cPanel</w:t>
-      </w:r>
-      <w:r>
-        <w:rPr>
-          <w:rStyle w:val="citation-1291"/>
-          <w:rFonts w:ascii="Calibri" w:eastAsiaTheme="majorEastAsia" w:hAnsi="Calibri" w:cs="Calibri"/>
-        </w:rPr>
-        <w:t xml:space="preserve"> for hosting</w:t>
-      </w:r>
-      <w:r>
-        <w:rPr>
-          <w:rFonts w:ascii="Calibri" w:hAnsi="Calibri" w:cs="Calibri"/>
-        </w:rPr>
-        <w:t>.</w:t>
-      </w:r>
-    </w:p>
-    <w:p>
-      <w:pPr>
-        <w:pStyle w:val="NormalWeb"/>
-        <w:spacing w:before="0" w:beforeAutospacing="0"/>
-        <w:rPr>
-          <w:rFonts w:ascii="Calibri" w:hAnsi="Calibri" w:cs="Calibri"/>
-        </w:rPr>
-      </w:pPr>
-      <w:r>
-        <w:rPr>
-          <w:rStyle w:val="citation-1290"/>
-          <w:rFonts w:ascii="Calibri" w:eastAsiaTheme="majorEastAsia" w:hAnsi="Calibri" w:cs="Calibri"/>
-          <w:b/>
-          <w:bCs/>
-        </w:rPr>
-        <w:t>Success Metrics:</w:t>
-      </w:r>
-      <w:r>
-        <w:rPr>
-          <w:rStyle w:val="citation-1290"/>
-          <w:rFonts w:ascii="Calibri" w:eastAsiaTheme="majorEastAsia" w:hAnsi="Calibri" w:cs="Calibri"/>
-        </w:rPr>
-        <w:t xml:space="preserve"> </w:t>
-      </w:r>
-      <w:r>
-        <w:rPr>
-          <w:rFonts w:ascii="Calibri" w:eastAsiaTheme="majorEastAsia" w:hAnsi="Calibri" w:cs="Calibri"/>
-        </w:rPr>
-        <w:t>100% pass rate on all core functional unit tests (Arrange, Act, Assert) and zero critical bugs identified during the feature demonstration</w:t>
-      </w:r>
-      <w:r>
-        <w:rPr>
-          <w:rFonts w:ascii="Calibri" w:hAnsi="Calibri" w:cs="Calibri"/>
-        </w:rPr>
-        <w:t>.</w:t>
-      </w:r>
-    </w:p>
-    <w:p>
-      <w:pPr>
-        <w:pStyle w:val="NormalWeb"/>
-        <w:rPr>
-          <w:rFonts w:ascii="Calibri" w:hAnsi="Calibri" w:cs="Calibri"/>
-        </w:rPr>
-      </w:pPr>
-      <w:r>
-        <w:rPr>
-          <w:rFonts w:ascii="Calibri" w:hAnsi="Calibri" w:cs="Calibri"/>
-          <w:b/>
-          <w:bCs/>
-        </w:rPr>
-        <w:t>Roles:</w:t>
-      </w:r>
-      <w:r>
-        <w:rPr>
-          <w:rFonts w:ascii="Calibri" w:hAnsi="Calibri" w:cs="Calibri"/>
-        </w:rPr>
-        <w:t xml:space="preserve"> Explicitly state: "I am fulfilling the roles of Scrum Master, Product Owner, and Developer for this project."</w:t>
-      </w:r>
-    </w:p>
-    <w:p>
-      <w:pPr>
-        <w:pStyle w:val="NormalWeb"/>
-        <w:rPr>
-          <w:rStyle w:val="citation-1349"/>
-          <w:rFonts w:ascii="Calibri" w:eastAsiaTheme="majorEastAsia" w:hAnsi="Calibri" w:cs="Calibri"/>
-        </w:rPr>
-      </w:pPr>
-      <w:r>
-        <w:rPr>
-          <w:rStyle w:val="citation-1349"/>
-          <w:rFonts w:ascii="Calibri" w:eastAsiaTheme="majorEastAsia" w:hAnsi="Calibri" w:cs="Calibri"/>
-          <w:b/>
-          <w:bCs/>
-        </w:rPr>
-        <w:t>Resources:</w:t>
-      </w:r>
-      <w:r>
-        <w:rPr>
-          <w:rStyle w:val="citation-1349"/>
-          <w:rFonts w:ascii="Calibri" w:eastAsiaTheme="majorEastAsia" w:hAnsi="Calibri" w:cs="Calibri"/>
-        </w:rPr>
-        <w:t xml:space="preserve"> List your own hardware (Laptop/PC) and software (</w:t>
+          <w:rFonts w:ascii="Calibri" w:hAnsi="Calibri" w:cs="Calibri"/>
+        </w:rPr>
+        <w:t>/Node.js (Requires minimum 8GB RAM for stable build processes).</w:t>
+      </w:r>
+    </w:p>
+    <w:p>
+      <w:pPr>
+        <w:numPr>
+          <w:ilvl w:val="1"/>
+          <w:numId w:val="5"/>
+        </w:numPr>
+        <w:rPr>
+          <w:rFonts w:ascii="Calibri" w:hAnsi="Calibri" w:cs="Calibri"/>
+          <w:b/>
+          <w:bCs/>
+        </w:rPr>
+      </w:pPr>
+      <w:r>
+        <w:rPr>
+          <w:rFonts w:ascii="Calibri" w:hAnsi="Calibri" w:cs="Calibri"/>
+          <w:b/>
+          <w:bCs/>
+        </w:rPr>
+        <w:t xml:space="preserve">Hosting: </w:t>
+      </w:r>
+      <w:r>
+        <w:rPr>
+          <w:rFonts w:ascii="Calibri" w:hAnsi="Calibri" w:cs="Calibri"/>
+        </w:rPr>
+        <w:t>cPanel/Linux environment for professional deployment and "seamless data retrieval".</w:t>
+      </w:r>
+    </w:p>
+    <w:p>
+      <w:pPr>
+        <w:numPr>
+          <w:ilvl w:val="0"/>
+          <w:numId w:val="5"/>
+        </w:numPr>
+        <w:rPr>
+          <w:rFonts w:ascii="Calibri" w:hAnsi="Calibri" w:cs="Calibri"/>
+          <w:b/>
+          <w:bCs/>
+          <w:u w:val="single"/>
+        </w:rPr>
+      </w:pPr>
+      <w:r>
+        <w:rPr>
+          <w:rFonts w:ascii="Calibri" w:hAnsi="Calibri" w:cs="Calibri"/>
+          <w:b/>
+          <w:bCs/>
+          <w:u w:val="single"/>
+        </w:rPr>
+        <w:t>Hardware Selection:</w:t>
+      </w:r>
+    </w:p>
+    <w:p>
+      <w:pPr>
+        <w:numPr>
+          <w:ilvl w:val="1"/>
+          <w:numId w:val="5"/>
+        </w:numPr>
+        <w:rPr>
+          <w:rFonts w:ascii="Calibri" w:hAnsi="Calibri" w:cs="Calibri"/>
+          <w:b/>
+          <w:bCs/>
+        </w:rPr>
+      </w:pPr>
+      <w:r>
+        <w:rPr>
+          <w:rFonts w:ascii="Calibri" w:hAnsi="Calibri" w:cs="Calibri"/>
+          <w:b/>
+          <w:bCs/>
+        </w:rPr>
+        <w:t xml:space="preserve">Processor: </w:t>
+      </w:r>
+      <w:r>
+        <w:rPr>
+          <w:rFonts w:ascii="Calibri" w:hAnsi="Calibri" w:cs="Calibri"/>
+        </w:rPr>
+        <w:t xml:space="preserve">Intel i5 (or equivalent) to handle concurrent execution of the </w:t>
       </w:r>
       <w:proofErr w:type="spellStart"/>
       <w:r>
         <w:rPr>
-          <w:rStyle w:val="citation-1349"/>
-          <w:rFonts w:ascii="Calibri" w:eastAsiaTheme="majorEastAsia" w:hAnsi="Calibri" w:cs="Calibri"/>
+          <w:rFonts w:ascii="Calibri" w:hAnsi="Calibri" w:cs="Calibri"/>
         </w:rPr>
         <w:t>SvelteKit</w:t>
       </w:r>
       <w:proofErr w:type="spellEnd"/>
       <w:r>
         <w:rPr>
-          <w:rStyle w:val="citation-1349"/>
-          <w:rFonts w:ascii="Calibri" w:eastAsiaTheme="majorEastAsia" w:hAnsi="Calibri" w:cs="Calibri"/>
-        </w:rPr>
-        <w:t>/cPanel) as the primary resources.</w:t>
-      </w:r>
-    </w:p>
-    <w:p>
-      <w:pPr>
-        <w:pStyle w:val="NormalWeb"/>
-        <w:rPr>
-          <w:rStyle w:val="citation-1349"/>
-          <w:rFonts w:ascii="Calibri" w:eastAsiaTheme="majorEastAsia" w:hAnsi="Calibri" w:cs="Calibri"/>
-        </w:rPr>
-      </w:pPr>
-    </w:p>
-    <w:p>
-      <w:pPr>
-        <w:pStyle w:val="NormalWeb"/>
-        <w:rPr>
-          <w:rFonts w:ascii="Calibri" w:hAnsi="Calibri" w:cs="Calibri"/>
-          <w:b/>
-          <w:bCs/>
-          <w:u w:val="single"/>
-        </w:rPr>
-      </w:pPr>
-      <w:r>
-        <w:rPr>
-          <w:rFonts w:ascii="Calibri" w:hAnsi="Calibri" w:cs="Calibri"/>
-          <w:b/>
-          <w:bCs/>
-          <w:u w:val="single"/>
-        </w:rPr>
-        <w:t>Risk Register</w:t>
+          <w:rFonts w:ascii="Calibri" w:hAnsi="Calibri" w:cs="Calibri"/>
+        </w:rPr>
+        <w:t xml:space="preserve"> development server and local database.</w:t>
+      </w:r>
+    </w:p>
+    <w:p>
+      <w:pPr>
+        <w:numPr>
+          <w:ilvl w:val="1"/>
+          <w:numId w:val="5"/>
+        </w:numPr>
+        <w:rPr>
+          <w:rFonts w:ascii="Calibri" w:hAnsi="Calibri" w:cs="Calibri"/>
+          <w:b/>
+          <w:bCs/>
+        </w:rPr>
+      </w:pPr>
+      <w:r>
+        <w:rPr>
+          <w:rFonts w:ascii="Calibri" w:hAnsi="Calibri" w:cs="Calibri"/>
+          <w:b/>
+          <w:bCs/>
+        </w:rPr>
+        <w:t xml:space="preserve">Memory: </w:t>
+      </w:r>
+      <w:r>
+        <w:rPr>
+          <w:rFonts w:ascii="Calibri" w:hAnsi="Calibri" w:cs="Calibri"/>
+        </w:rPr>
+        <w:t>16GB RAM (Exceeding the 8GB minimum to ensure zero degradation during screen recording for the final video).</w:t>
+      </w:r>
+    </w:p>
+    <w:p>
+      <w:pPr>
+        <w:rPr>
+          <w:rFonts w:ascii="Calibri" w:hAnsi="Calibri" w:cs="Calibri"/>
+          <w:b/>
+          <w:bCs/>
+        </w:rPr>
+      </w:pPr>
+    </w:p>
+    <w:p>
+      <w:pPr>
+        <w:pStyle w:val="Heading2"/>
+      </w:pPr>
+      <w:r>
+        <w:t>6. Test Data Selection</w:t>
       </w:r>
     </w:p>
     <w:tbl>
       <w:tblPr>
         <w:tblStyle w:val="TableGrid"/>
+        <w:tblpPr w:leftFromText="180" w:rightFromText="180" w:vertAnchor="text" w:horzAnchor="margin" w:tblpY="57"/>
         <w:tblW w:w="0" w:type="auto"/>
         <w:tblLook w:val="04A0" w:firstRow="1" w:lastRow="0" w:firstColumn="1" w:lastColumn="0" w:noHBand="0" w:noVBand="1"/>
       </w:tblPr>
       <w:tblGrid>
-        <w:gridCol w:w="504"/>
-        <w:gridCol w:w="1646"/>
-        <w:gridCol w:w="1305"/>
-        <w:gridCol w:w="1040"/>
-        <w:gridCol w:w="4855"/>
+        <w:gridCol w:w="2029"/>
+        <w:gridCol w:w="5813"/>
       </w:tblGrid>
       <w:tr>
         <w:tc>
           <w:tcPr>
             <w:tcW w:w="0" w:type="auto"/>
+            <w:hideMark/>
           </w:tcPr>
           <w:p>
             <w:pPr>
-              <w:rPr>
-                <w:rFonts w:ascii="Calibri" w:hAnsi="Calibri" w:cs="Calibri"/>
-                <w:b/>
-                <w:bCs/>
+              <w:spacing w:after="160" w:line="278" w:lineRule="auto"/>
+              <w:rPr>
+                <w:rFonts w:ascii="Calibri" w:hAnsi="Calibri" w:cs="Calibri"/>
               </w:rPr>
             </w:pPr>
             <w:r>
               <w:rPr>
                 <w:rFonts w:ascii="Calibri" w:hAnsi="Calibri" w:cs="Calibri"/>
-                <w:b/>
-                <w:bCs/>
-              </w:rPr>
-              <w:t>N</w:t>
-            </w:r>
-            <w:r>
-              <w:rPr>
-                <w:rFonts w:ascii="Calibri" w:hAnsi="Calibri" w:cs="Calibri"/>
-                <w:b/>
-                <w:bCs/>
-              </w:rPr>
-              <w:t>o</w:t>
+              </w:rPr>
+              <w:t>Data Type</w:t>
             </w:r>
           </w:p>
         </w:tc>
@@ -407,6 +725,270 @@
               <w:spacing w:after="160" w:line="278" w:lineRule="auto"/>
               <w:rPr>
                 <w:rFonts w:ascii="Calibri" w:hAnsi="Calibri" w:cs="Calibri"/>
+              </w:rPr>
+            </w:pPr>
+            <w:r>
+              <w:rPr>
+                <w:rFonts w:ascii="Calibri" w:hAnsi="Calibri" w:cs="Calibri"/>
+              </w:rPr>
+              <w:t>Example Test Values</w:t>
+            </w:r>
+          </w:p>
+        </w:tc>
+      </w:tr>
+      <w:tr>
+        <w:tc>
+          <w:tcPr>
+            <w:tcW w:w="0" w:type="auto"/>
+            <w:hideMark/>
+          </w:tcPr>
+          <w:p>
+            <w:pPr>
+              <w:spacing w:after="160" w:line="278" w:lineRule="auto"/>
+              <w:rPr>
+                <w:rFonts w:ascii="Calibri" w:hAnsi="Calibri" w:cs="Calibri"/>
+              </w:rPr>
+            </w:pPr>
+            <w:r>
+              <w:rPr>
+                <w:rFonts w:ascii="Calibri" w:hAnsi="Calibri" w:cs="Calibri"/>
+              </w:rPr>
+              <w:t>Patient Accounts</w:t>
+            </w:r>
+          </w:p>
+        </w:tc>
+        <w:tc>
+          <w:tcPr>
+            <w:tcW w:w="0" w:type="auto"/>
+            <w:hideMark/>
+          </w:tcPr>
+          <w:p>
+            <w:pPr>
+              <w:spacing w:after="160" w:line="278" w:lineRule="auto"/>
+              <w:rPr>
+                <w:rFonts w:ascii="Calibri" w:hAnsi="Calibri" w:cs="Calibri"/>
+              </w:rPr>
+            </w:pPr>
+            <w:r>
+              <w:rPr>
+                <w:rFonts w:ascii="Calibri" w:hAnsi="Calibri" w:cs="Calibri"/>
+              </w:rPr>
+              <w:t xml:space="preserve">patient_test_01 (Pass: SecurePwd123), </w:t>
+            </w:r>
+            <w:proofErr w:type="spellStart"/>
+            <w:r>
+              <w:rPr>
+                <w:rFonts w:ascii="Calibri" w:hAnsi="Calibri" w:cs="Calibri"/>
+              </w:rPr>
+              <w:t>arthur_retiree</w:t>
+            </w:r>
+            <w:proofErr w:type="spellEnd"/>
+            <w:r>
+              <w:rPr>
+                <w:rFonts w:ascii="Calibri" w:hAnsi="Calibri" w:cs="Calibri"/>
+              </w:rPr>
+              <w:t xml:space="preserve"> </w:t>
+            </w:r>
+          </w:p>
+        </w:tc>
+      </w:tr>
+      <w:tr>
+        <w:tc>
+          <w:tcPr>
+            <w:tcW w:w="0" w:type="auto"/>
+            <w:hideMark/>
+          </w:tcPr>
+          <w:p>
+            <w:pPr>
+              <w:spacing w:after="160" w:line="278" w:lineRule="auto"/>
+              <w:rPr>
+                <w:rFonts w:ascii="Calibri" w:hAnsi="Calibri" w:cs="Calibri"/>
+              </w:rPr>
+            </w:pPr>
+            <w:r>
+              <w:rPr>
+                <w:rFonts w:ascii="Calibri" w:hAnsi="Calibri" w:cs="Calibri"/>
+              </w:rPr>
+              <w:t>Doctor Profiles</w:t>
+            </w:r>
+          </w:p>
+        </w:tc>
+        <w:tc>
+          <w:tcPr>
+            <w:tcW w:w="0" w:type="auto"/>
+            <w:hideMark/>
+          </w:tcPr>
+          <w:p>
+            <w:pPr>
+              <w:spacing w:after="160" w:line="278" w:lineRule="auto"/>
+              <w:rPr>
+                <w:rFonts w:ascii="Calibri" w:hAnsi="Calibri" w:cs="Calibri"/>
+              </w:rPr>
+            </w:pPr>
+            <w:r>
+              <w:rPr>
+                <w:rFonts w:ascii="Calibri" w:hAnsi="Calibri" w:cs="Calibri"/>
+              </w:rPr>
+              <w:t xml:space="preserve">Dr. Smith (Cardiology), Dr. Jones (GP) </w:t>
+            </w:r>
+          </w:p>
+        </w:tc>
+      </w:tr>
+      <w:tr>
+        <w:tc>
+          <w:tcPr>
+            <w:tcW w:w="0" w:type="auto"/>
+            <w:hideMark/>
+          </w:tcPr>
+          <w:p>
+            <w:pPr>
+              <w:spacing w:after="160" w:line="278" w:lineRule="auto"/>
+              <w:rPr>
+                <w:rFonts w:ascii="Calibri" w:hAnsi="Calibri" w:cs="Calibri"/>
+              </w:rPr>
+            </w:pPr>
+            <w:r>
+              <w:rPr>
+                <w:rFonts w:ascii="Calibri" w:hAnsi="Calibri" w:cs="Calibri"/>
+              </w:rPr>
+              <w:lastRenderedPageBreak/>
+              <w:t>Appointment Slots</w:t>
+            </w:r>
+          </w:p>
+        </w:tc>
+        <w:tc>
+          <w:tcPr>
+            <w:tcW w:w="0" w:type="auto"/>
+            <w:hideMark/>
+          </w:tcPr>
+          <w:p>
+            <w:pPr>
+              <w:spacing w:after="160" w:line="278" w:lineRule="auto"/>
+              <w:rPr>
+                <w:rFonts w:ascii="Calibri" w:hAnsi="Calibri" w:cs="Calibri"/>
+              </w:rPr>
+            </w:pPr>
+            <w:r>
+              <w:rPr>
+                <w:rFonts w:ascii="Calibri" w:hAnsi="Calibri" w:cs="Calibri"/>
+              </w:rPr>
+              <w:t xml:space="preserve">2026-03-30 09:00, 2026-03-30 10:30 </w:t>
+            </w:r>
+          </w:p>
+        </w:tc>
+      </w:tr>
+      <w:tr>
+        <w:tc>
+          <w:tcPr>
+            <w:tcW w:w="0" w:type="auto"/>
+            <w:hideMark/>
+          </w:tcPr>
+          <w:p>
+            <w:pPr>
+              <w:spacing w:after="160" w:line="278" w:lineRule="auto"/>
+              <w:rPr>
+                <w:rFonts w:ascii="Calibri" w:hAnsi="Calibri" w:cs="Calibri"/>
+              </w:rPr>
+            </w:pPr>
+            <w:r>
+              <w:rPr>
+                <w:rFonts w:ascii="Calibri" w:hAnsi="Calibri" w:cs="Calibri"/>
+              </w:rPr>
+              <w:t>Medical Records</w:t>
+            </w:r>
+          </w:p>
+        </w:tc>
+        <w:tc>
+          <w:tcPr>
+            <w:tcW w:w="0" w:type="auto"/>
+            <w:hideMark/>
+          </w:tcPr>
+          <w:p>
+            <w:pPr>
+              <w:spacing w:after="160" w:line="278" w:lineRule="auto"/>
+              <w:rPr>
+                <w:rFonts w:ascii="Calibri" w:hAnsi="Calibri" w:cs="Calibri"/>
+              </w:rPr>
+            </w:pPr>
+            <w:proofErr w:type="spellStart"/>
+            <w:r>
+              <w:rPr>
+                <w:rFonts w:ascii="Calibri" w:hAnsi="Calibri" w:cs="Calibri"/>
+              </w:rPr>
+              <w:t>PatientID</w:t>
+            </w:r>
+            <w:proofErr w:type="spellEnd"/>
+            <w:r>
+              <w:rPr>
+                <w:rFonts w:ascii="Calibri" w:hAnsi="Calibri" w:cs="Calibri"/>
+              </w:rPr>
+              <w:t xml:space="preserve">: 001; Note: Routine check-up; Date: 2026-01-15 </w:t>
+            </w:r>
+          </w:p>
+        </w:tc>
+      </w:tr>
+    </w:tbl>
+    <w:p/>
+    <w:p/>
+    <w:p>
+      <w:pPr>
+        <w:pStyle w:val="Heading2"/>
+      </w:pPr>
+      <w:r>
+        <w:t>7. Risk Register</w:t>
+      </w:r>
+    </w:p>
+    <w:tbl>
+      <w:tblPr>
+        <w:tblStyle w:val="TableGrid"/>
+        <w:tblpPr w:leftFromText="180" w:rightFromText="180" w:vertAnchor="text" w:horzAnchor="margin" w:tblpY="-53"/>
+        <w:tblW w:w="9833" w:type="dxa"/>
+        <w:tblLook w:val="04A0" w:firstRow="1" w:lastRow="0" w:firstColumn="1" w:lastColumn="0" w:noHBand="0" w:noVBand="1"/>
+      </w:tblPr>
+      <w:tblGrid>
+        <w:gridCol w:w="504"/>
+        <w:gridCol w:w="1684"/>
+        <w:gridCol w:w="1305"/>
+        <w:gridCol w:w="1040"/>
+        <w:gridCol w:w="5300"/>
+      </w:tblGrid>
+      <w:tr>
+        <w:tc>
+          <w:tcPr>
+            <w:tcW w:w="0" w:type="auto"/>
+            <w:hideMark/>
+          </w:tcPr>
+          <w:p>
+            <w:pPr>
+              <w:spacing w:after="160" w:line="278" w:lineRule="auto"/>
+              <w:rPr>
+                <w:rFonts w:ascii="Calibri" w:hAnsi="Calibri" w:cs="Calibri"/>
+                <w:b/>
+                <w:bCs/>
+              </w:rPr>
+            </w:pPr>
+            <w:r>
+              <w:rPr>
+                <w:rFonts w:ascii="Calibri" w:hAnsi="Calibri" w:cs="Calibri"/>
+                <w:b/>
+                <w:bCs/>
+              </w:rPr>
+              <w:t>No</w:t>
+            </w:r>
+          </w:p>
+        </w:tc>
+        <w:tc>
+          <w:tcPr>
+            <w:tcW w:w="0" w:type="auto"/>
+            <w:hideMark/>
+          </w:tcPr>
+          <w:p>
+            <w:pPr>
+              <w:spacing w:after="160" w:line="278" w:lineRule="auto"/>
+              <w:rPr>
+                <w:rFonts w:ascii="Calibri" w:hAnsi="Calibri" w:cs="Calibri"/>
+                <w:b/>
+                <w:bCs/>
               </w:rPr>
             </w:pPr>
             <w:r>
@@ -429,6 +1011,8 @@
               <w:spacing w:after="160" w:line="278" w:lineRule="auto"/>
               <w:rPr>
                 <w:rFonts w:ascii="Calibri" w:hAnsi="Calibri" w:cs="Calibri"/>
+                <w:b/>
+                <w:bCs/>
               </w:rPr>
             </w:pPr>
             <w:r>
@@ -451,6 +1035,8 @@
               <w:spacing w:after="160" w:line="278" w:lineRule="auto"/>
               <w:rPr>
                 <w:rFonts w:ascii="Calibri" w:hAnsi="Calibri" w:cs="Calibri"/>
+                <w:b/>
+                <w:bCs/>
               </w:rPr>
             </w:pPr>
             <w:r>
@@ -466,13 +1052,13 @@
         <w:tc>
           <w:tcPr>
             <w:tcW w:w="0" w:type="auto"/>
-            <w:hideMark/>
           </w:tcPr>
           <w:p>
             <w:pPr>
-              <w:spacing w:after="160" w:line="278" w:lineRule="auto"/>
-              <w:rPr>
-                <w:rFonts w:ascii="Calibri" w:hAnsi="Calibri" w:cs="Calibri"/>
+              <w:rPr>
+                <w:rFonts w:ascii="Calibri" w:hAnsi="Calibri" w:cs="Calibri"/>
+                <w:b/>
+                <w:bCs/>
               </w:rPr>
             </w:pPr>
             <w:r>
@@ -490,9 +1076,11 @@
         <w:tc>
           <w:tcPr>
             <w:tcW w:w="0" w:type="auto"/>
+            <w:hideMark/>
           </w:tcPr>
           <w:p>
             <w:pPr>
+              <w:spacing w:after="160" w:line="278" w:lineRule="auto"/>
               <w:rPr>
                 <w:rFonts w:ascii="Calibri" w:hAnsi="Calibri" w:cs="Calibri"/>
                 <w:b/>
@@ -524,8 +1112,6 @@
             <w:r>
               <w:rPr>
                 <w:rFonts w:ascii="Calibri" w:hAnsi="Calibri" w:cs="Calibri"/>
-                <w:b/>
-                <w:bCs/>
               </w:rPr>
               <w:t>Data Integrity Breach</w:t>
             </w:r>
@@ -574,11 +1160,9 @@
         <w:tc>
           <w:tcPr>
             <w:tcW w:w="0" w:type="auto"/>
-            <w:hideMark/>
           </w:tcPr>
           <w:p>
             <w:pPr>
-              <w:spacing w:after="160" w:line="278" w:lineRule="auto"/>
               <w:rPr>
                 <w:rFonts w:ascii="Calibri" w:hAnsi="Calibri" w:cs="Calibri"/>
               </w:rPr>
@@ -610,9 +1194,11 @@
         <w:tc>
           <w:tcPr>
             <w:tcW w:w="0" w:type="auto"/>
+            <w:hideMark/>
           </w:tcPr>
           <w:p>
             <w:pPr>
+              <w:spacing w:after="160" w:line="278" w:lineRule="auto"/>
               <w:rPr>
                 <w:rFonts w:ascii="Calibri" w:hAnsi="Calibri" w:cs="Calibri"/>
                 <w:b/>
@@ -644,8 +1230,6 @@
             <w:r>
               <w:rPr>
                 <w:rFonts w:ascii="Calibri" w:hAnsi="Calibri" w:cs="Calibri"/>
-                <w:b/>
-                <w:bCs/>
               </w:rPr>
               <w:t>Logic Errors in Booking</w:t>
             </w:r>
@@ -694,11 +1278,9 @@
         <w:tc>
           <w:tcPr>
             <w:tcW w:w="0" w:type="auto"/>
-            <w:hideMark/>
           </w:tcPr>
           <w:p>
             <w:pPr>
-              <w:spacing w:after="160" w:line="278" w:lineRule="auto"/>
               <w:rPr>
                 <w:rFonts w:ascii="Calibri" w:hAnsi="Calibri" w:cs="Calibri"/>
               </w:rPr>
@@ -707,7 +1289,7 @@
               <w:rPr>
                 <w:rFonts w:ascii="Calibri" w:hAnsi="Calibri" w:cs="Calibri"/>
               </w:rPr>
-              <w:t>Implement automated Unit Testing (Arrange, Act, Assert) for the date/time selection logic .</w:t>
+              <w:t>Implement automated Unit Testing (Arrange, Act, Assert) for the date/time selection logic.</w:t>
             </w:r>
           </w:p>
         </w:tc>
@@ -716,9 +1298,11 @@
         <w:tc>
           <w:tcPr>
             <w:tcW w:w="0" w:type="auto"/>
+            <w:hideMark/>
           </w:tcPr>
           <w:p>
             <w:pPr>
+              <w:spacing w:after="160" w:line="278" w:lineRule="auto"/>
               <w:rPr>
                 <w:rFonts w:ascii="Calibri" w:hAnsi="Calibri" w:cs="Calibri"/>
                 <w:b/>
@@ -750,8 +1334,6 @@
             <w:r>
               <w:rPr>
                 <w:rFonts w:ascii="Calibri" w:hAnsi="Calibri" w:cs="Calibri"/>
-                <w:b/>
-                <w:bCs/>
               </w:rPr>
               <w:t>Scope Creep</w:t>
             </w:r>
@@ -800,11 +1382,9 @@
         <w:tc>
           <w:tcPr>
             <w:tcW w:w="0" w:type="auto"/>
-            <w:hideMark/>
           </w:tcPr>
           <w:p>
             <w:pPr>
-              <w:spacing w:after="160" w:line="278" w:lineRule="auto"/>
               <w:rPr>
                 <w:rFonts w:ascii="Calibri" w:hAnsi="Calibri" w:cs="Calibri"/>
               </w:rPr>
@@ -819,116 +1399,166 @@
         </w:tc>
       </w:tr>
     </w:tbl>
-    <w:p>
-      <w:pPr>
-        <w:rPr>
-          <w:rFonts w:ascii="Calibri" w:hAnsi="Calibri" w:cs="Calibri"/>
-        </w:rPr>
-      </w:pPr>
-    </w:p>
-    <w:p>
-      <w:pPr>
-        <w:rPr>
-          <w:rFonts w:ascii="Calibri" w:hAnsi="Calibri" w:cs="Calibri"/>
-          <w:b/>
-          <w:bCs/>
-          <w:u w:val="single"/>
-        </w:rPr>
-      </w:pPr>
-      <w:r>
-        <w:rPr>
-          <w:rFonts w:ascii="Calibri" w:hAnsi="Calibri" w:cs="Calibri"/>
-          <w:b/>
-          <w:bCs/>
-          <w:u w:val="single"/>
-        </w:rPr>
-        <w:t>Testing Plan</w:t>
-      </w:r>
-    </w:p>
-    <w:p>
-      <w:pPr>
-        <w:rPr>
-          <w:rFonts w:ascii="Calibri" w:hAnsi="Calibri" w:cs="Calibri"/>
-        </w:rPr>
-      </w:pPr>
-      <w:r>
-        <w:rPr>
-          <w:rFonts w:ascii="Calibri" w:hAnsi="Calibri" w:cs="Calibri"/>
-          <w:b/>
-          <w:bCs/>
-        </w:rPr>
-        <w:lastRenderedPageBreak/>
-        <w:t>Unit Testing:</w:t>
-      </w:r>
-      <w:r>
-        <w:rPr>
-          <w:rFonts w:ascii="Calibri" w:hAnsi="Calibri" w:cs="Calibri"/>
-        </w:rPr>
-        <w:t xml:space="preserve"> Individual functions (e.g., date validation) will be tested using the </w:t>
-      </w:r>
-      <w:r>
-        <w:rPr>
-          <w:rFonts w:ascii="Calibri" w:hAnsi="Calibri" w:cs="Calibri"/>
-          <w:b/>
-          <w:bCs/>
-        </w:rPr>
-        <w:t>Arrange, Act, Assert</w:t>
-      </w:r>
-      <w:r>
-        <w:rPr>
-          <w:rFonts w:ascii="Calibri" w:hAnsi="Calibri" w:cs="Calibri"/>
-        </w:rPr>
-        <w:t xml:space="preserve"> pattern.</w:t>
-      </w:r>
-    </w:p>
-    <w:p>
-      <w:pPr>
-        <w:rPr>
-          <w:rFonts w:ascii="Calibri" w:hAnsi="Calibri" w:cs="Calibri"/>
-        </w:rPr>
-      </w:pPr>
-      <w:r>
-        <w:rPr>
-          <w:rFonts w:ascii="Calibri" w:hAnsi="Calibri" w:cs="Calibri"/>
-          <w:b/>
-          <w:bCs/>
-        </w:rPr>
-        <w:t>Functional Testing:</w:t>
-      </w:r>
-      <w:r>
-        <w:rPr>
-          <w:rFonts w:ascii="Calibri" w:hAnsi="Calibri" w:cs="Calibri"/>
-        </w:rPr>
-        <w:t xml:space="preserve"> Manual "walkthroughs" of the UI to ensure the Booking Form and Calendar behave as expected .</w:t>
-      </w:r>
-    </w:p>
-    <w:p>
-      <w:pPr>
-        <w:rPr>
-          <w:rFonts w:ascii="Calibri" w:hAnsi="Calibri" w:cs="Calibri"/>
-        </w:rPr>
-      </w:pPr>
-      <w:r>
-        <w:rPr>
-          <w:rFonts w:ascii="Calibri" w:hAnsi="Calibri" w:cs="Calibri"/>
-          <w:b/>
-          <w:bCs/>
-        </w:rPr>
-        <w:t>Security Testing:</w:t>
-      </w:r>
-      <w:r>
-        <w:rPr>
-          <w:rFonts w:ascii="Calibri" w:hAnsi="Calibri" w:cs="Calibri"/>
-        </w:rPr>
-        <w:t xml:space="preserve"> Verification that unauthorized users cannot access the /portal or /admin routes</w:t>
-      </w:r>
-    </w:p>
-    <w:p>
-      <w:pPr>
-        <w:rPr>
-          <w:rFonts w:ascii="Calibri" w:hAnsi="Calibri" w:cs="Calibri"/>
-        </w:rPr>
-      </w:pPr>
+    <w:p/>
+    <w:p>
+      <w:pPr>
+        <w:pStyle w:val="Heading2"/>
+      </w:pPr>
+      <w:r>
+        <w:t>8. Testing Plan</w:t>
+      </w:r>
+    </w:p>
+    <w:p>
+      <w:pPr>
+        <w:numPr>
+          <w:ilvl w:val="0"/>
+          <w:numId w:val="6"/>
+        </w:numPr>
+        <w:rPr>
+          <w:rFonts w:ascii="Calibri" w:hAnsi="Calibri" w:cs="Calibri"/>
+          <w:b/>
+          <w:bCs/>
+        </w:rPr>
+      </w:pPr>
+      <w:r>
+        <w:rPr>
+          <w:rFonts w:ascii="Calibri" w:hAnsi="Calibri" w:cs="Calibri"/>
+          <w:b/>
+          <w:bCs/>
+        </w:rPr>
+        <w:t xml:space="preserve">Unit Testing: </w:t>
+      </w:r>
+      <w:r>
+        <w:rPr>
+          <w:rFonts w:ascii="Calibri" w:hAnsi="Calibri" w:cs="Calibri"/>
+        </w:rPr>
+        <w:t>Individual functions (e.g., validating that a date is not in the past) are tested using the Arrange, Act, Assert pattern in code.</w:t>
+      </w:r>
+    </w:p>
+    <w:p>
+      <w:pPr>
+        <w:numPr>
+          <w:ilvl w:val="0"/>
+          <w:numId w:val="6"/>
+        </w:numPr>
+        <w:rPr>
+          <w:rFonts w:ascii="Calibri" w:hAnsi="Calibri" w:cs="Calibri"/>
+          <w:b/>
+          <w:bCs/>
+        </w:rPr>
+      </w:pPr>
+      <w:r>
+        <w:rPr>
+          <w:rFonts w:ascii="Calibri" w:hAnsi="Calibri" w:cs="Calibri"/>
+          <w:b/>
+          <w:bCs/>
+        </w:rPr>
+        <w:t xml:space="preserve">Functional Testing: </w:t>
+      </w:r>
+      <w:r>
+        <w:rPr>
+          <w:rFonts w:ascii="Calibri" w:hAnsi="Calibri" w:cs="Calibri"/>
+        </w:rPr>
+        <w:t>Manual walkthroughs of the UI to ensure the Booking Form and Calendar respond correctly to user input.</w:t>
+      </w:r>
+    </w:p>
+    <w:p>
+      <w:pPr>
+        <w:numPr>
+          <w:ilvl w:val="0"/>
+          <w:numId w:val="6"/>
+        </w:numPr>
+        <w:rPr>
+          <w:rFonts w:ascii="Calibri" w:hAnsi="Calibri" w:cs="Calibri"/>
+          <w:b/>
+          <w:bCs/>
+        </w:rPr>
+      </w:pPr>
+      <w:r>
+        <w:rPr>
+          <w:rFonts w:ascii="Calibri" w:hAnsi="Calibri" w:cs="Calibri"/>
+          <w:b/>
+          <w:bCs/>
+        </w:rPr>
+        <w:t xml:space="preserve">Security Testing: </w:t>
+      </w:r>
+      <w:r>
+        <w:rPr>
+          <w:rFonts w:ascii="Calibri" w:hAnsi="Calibri" w:cs="Calibri"/>
+        </w:rPr>
+        <w:t>Verification that unauthorized users are redirected away from private routes (/portal or /admin).</w:t>
+      </w:r>
+    </w:p>
+    <w:p>
+      <w:pPr>
+        <w:rPr>
+          <w:rFonts w:ascii="Calibri" w:hAnsi="Calibri" w:cs="Calibri"/>
+          <w:b/>
+          <w:bCs/>
+        </w:rPr>
+      </w:pPr>
+    </w:p>
+    <w:p>
+      <w:pPr>
+        <w:pStyle w:val="Heading2"/>
+      </w:pPr>
+      <w:r>
+        <w:t>9. Project Roles &amp; Resources</w:t>
+      </w:r>
+    </w:p>
+    <w:p>
+      <w:pPr>
+        <w:numPr>
+          <w:ilvl w:val="0"/>
+          <w:numId w:val="7"/>
+        </w:numPr>
+        <w:rPr>
+          <w:rFonts w:ascii="Calibri" w:hAnsi="Calibri" w:cs="Calibri"/>
+          <w:b/>
+          <w:bCs/>
+        </w:rPr>
+      </w:pPr>
+      <w:r>
+        <w:rPr>
+          <w:rFonts w:ascii="Calibri" w:hAnsi="Calibri" w:cs="Calibri"/>
+          <w:b/>
+          <w:bCs/>
+        </w:rPr>
+        <w:t xml:space="preserve">Roles: </w:t>
+      </w:r>
+      <w:r>
+        <w:rPr>
+          <w:rFonts w:ascii="Calibri" w:hAnsi="Calibri" w:cs="Calibri"/>
+        </w:rPr>
+        <w:t>I am fulfilling the roles of Scrum Master (backlog management), Product Owner (requirement definition), and Developer (implementation) for this individual project.</w:t>
+      </w:r>
+    </w:p>
+    <w:p>
+      <w:pPr>
+        <w:numPr>
+          <w:ilvl w:val="0"/>
+          <w:numId w:val="7"/>
+        </w:numPr>
+        <w:rPr>
+          <w:rFonts w:ascii="Calibri" w:hAnsi="Calibri" w:cs="Calibri"/>
+          <w:b/>
+          <w:bCs/>
+        </w:rPr>
+      </w:pPr>
+      <w:r>
+        <w:rPr>
+          <w:rFonts w:ascii="Calibri" w:hAnsi="Calibri" w:cs="Calibri"/>
+          <w:b/>
+          <w:bCs/>
+        </w:rPr>
+        <w:t xml:space="preserve">Resources: </w:t>
+      </w:r>
+      <w:r>
+        <w:rPr>
+          <w:rFonts w:ascii="Calibri" w:hAnsi="Calibri" w:cs="Calibri"/>
+        </w:rPr>
+        <w:t>Primary development is conducted on a personal PC environment using the hardware/software specifications outlined in Section 5.</w:t>
+      </w:r>
     </w:p>
     <w:p>
       <w:pPr>
@@ -948,6 +1578,1075 @@
     </w:sectPr>
   </w:body>
 </w:document>
+</file>
+
+<file path=word/numbering.xml><?xml version="1.0" encoding="utf-8"?>
+<w:numbering xmlns:wpc="http://schemas.microsoft.com/office/word/2010/wordprocessingCanvas" xmlns:cx="http://schemas.microsoft.com/office/drawing/2014/chartex" xmlns:cx1="http://schemas.microsoft.com/office/drawing/2015/9/8/chartex" xmlns:cx2="http://schemas.microsoft.com/office/drawing/2015/10/21/chartex" xmlns:cx3="http://schemas.microsoft.com/office/drawing/2016/5/9/chartex" xmlns:cx4="http://schemas.microsoft.com/office/drawing/2016/5/10/chartex" xmlns:cx5="http://schemas.microsoft.com/office/drawing/2016/5/11/chartex" xmlns:cx6="http://schemas.microsoft.com/office/drawing/2016/5/12/chartex" xmlns:cx7="http://schemas.microsoft.com/office/drawing/2016/5/13/chartex" xmlns:cx8="http://schemas.microsoft.com/office/drawing/2016/5/14/chartex" xmlns:mc="http://schemas.openxmlformats.org/markup-compatibility/2006" xmlns:aink="http://schemas.microsoft.com/office/drawing/2016/ink" xmlns:am3d="http://schemas.microsoft.com/office/drawing/2017/model3d" xmlns:o="urn:schemas-microsoft-com:office:office" xmlns:oel="http://schemas.microsoft.com/office/2019/extlst" xmlns:r="http://schemas.openxmlformats.org/officeDocument/2006/relationships" xmlns:m="http://schemas.openxmlformats.org/officeDocument/2006/math" xmlns:v="urn:schemas-microsoft-com:vml" xmlns:wp14="http://schemas.microsoft.com/office/word/2010/wordprocessingDrawing" xmlns:wp="http://schemas.openxmlformats.org/drawingml/2006/wordprocessingDrawing" xmlns:w10="urn:schemas-microsoft-com:office:word" xmlns:w="http://schemas.openxmlformats.org/wordprocessingml/2006/main" xmlns:w14="http://schemas.microsoft.com/office/word/2010/wordml" xmlns:w15="http://schemas.microsoft.com/office/word/2012/wordml" xmlns:w16cex="http://schemas.microsoft.com/office/word/2018/wordml/cex" xmlns:w16cid="http://schemas.microsoft.com/office/word/2016/wordml/cid" xmlns:w16="http://schemas.microsoft.com/office/word/2018/wordml" xmlns:w16du="http://schemas.microsoft.com/office/word/2023/wordml/word16du" xmlns:w16sdtdh="http://schemas.microsoft.com/office/word/2020/wordml/sdtdatahash" xmlns:w16sdtfl="http://schemas.microsoft.com/office/word/2024/wordml/sdtformatlock" xmlns:w16se="http://schemas.microsoft.com/office/word/2015/wordml/symex" xmlns:wpg="http://schemas.microsoft.com/office/word/2010/wordprocessingGroup" xmlns:wpi="http://schemas.microsoft.com/office/word/2010/wordprocessingInk" xmlns:wne="http://schemas.microsoft.com/office/word/2006/wordml" xmlns:wps="http://schemas.microsoft.com/office/word/2010/wordprocessingShape" mc:Ignorable="w14 w15 w16se w16cid w16 w16cex w16sdtdh w16sdtfl w16du wp14">
+  <w:abstractNum w:abstractNumId="0" w15:restartNumberingAfterBreak="0">
+    <w:nsid w:val="0EF62E56"/>
+    <w:multiLevelType w:val="multilevel"/>
+    <w:tmpl w:val="C2D61FD0"/>
+    <w:lvl w:ilvl="0">
+      <w:start w:val="1"/>
+      <w:numFmt w:val="bullet"/>
+      <w:lvlText w:val=""/>
+      <w:lvlJc w:val="left"/>
+      <w:pPr>
+        <w:tabs>
+          <w:tab w:val="num" w:pos="720"/>
+        </w:tabs>
+        <w:ind w:left="720" w:hanging="360"/>
+      </w:pPr>
+      <w:rPr>
+        <w:rFonts w:ascii="Symbol" w:hAnsi="Symbol" w:hint="default"/>
+        <w:sz w:val="20"/>
+      </w:rPr>
+    </w:lvl>
+    <w:lvl w:ilvl="1" w:tentative="1">
+      <w:start w:val="1"/>
+      <w:numFmt w:val="bullet"/>
+      <w:lvlText w:val="o"/>
+      <w:lvlJc w:val="left"/>
+      <w:pPr>
+        <w:tabs>
+          <w:tab w:val="num" w:pos="1440"/>
+        </w:tabs>
+        <w:ind w:left="1440" w:hanging="360"/>
+      </w:pPr>
+      <w:rPr>
+        <w:rFonts w:ascii="Courier New" w:hAnsi="Courier New" w:hint="default"/>
+        <w:sz w:val="20"/>
+      </w:rPr>
+    </w:lvl>
+    <w:lvl w:ilvl="2" w:tentative="1">
+      <w:start w:val="1"/>
+      <w:numFmt w:val="bullet"/>
+      <w:lvlText w:val=""/>
+      <w:lvlJc w:val="left"/>
+      <w:pPr>
+        <w:tabs>
+          <w:tab w:val="num" w:pos="2160"/>
+        </w:tabs>
+        <w:ind w:left="2160" w:hanging="360"/>
+      </w:pPr>
+      <w:rPr>
+        <w:rFonts w:ascii="Wingdings" w:hAnsi="Wingdings" w:hint="default"/>
+        <w:sz w:val="20"/>
+      </w:rPr>
+    </w:lvl>
+    <w:lvl w:ilvl="3" w:tentative="1">
+      <w:start w:val="1"/>
+      <w:numFmt w:val="bullet"/>
+      <w:lvlText w:val=""/>
+      <w:lvlJc w:val="left"/>
+      <w:pPr>
+        <w:tabs>
+          <w:tab w:val="num" w:pos="2880"/>
+        </w:tabs>
+        <w:ind w:left="2880" w:hanging="360"/>
+      </w:pPr>
+      <w:rPr>
+        <w:rFonts w:ascii="Wingdings" w:hAnsi="Wingdings" w:hint="default"/>
+        <w:sz w:val="20"/>
+      </w:rPr>
+    </w:lvl>
+    <w:lvl w:ilvl="4" w:tentative="1">
+      <w:start w:val="1"/>
+      <w:numFmt w:val="bullet"/>
+      <w:lvlText w:val=""/>
+      <w:lvlJc w:val="left"/>
+      <w:pPr>
+        <w:tabs>
+          <w:tab w:val="num" w:pos="3600"/>
+        </w:tabs>
+        <w:ind w:left="3600" w:hanging="360"/>
+      </w:pPr>
+      <w:rPr>
+        <w:rFonts w:ascii="Wingdings" w:hAnsi="Wingdings" w:hint="default"/>
+        <w:sz w:val="20"/>
+      </w:rPr>
+    </w:lvl>
+    <w:lvl w:ilvl="5" w:tentative="1">
+      <w:start w:val="1"/>
+      <w:numFmt w:val="bullet"/>
+      <w:lvlText w:val=""/>
+      <w:lvlJc w:val="left"/>
+      <w:pPr>
+        <w:tabs>
+          <w:tab w:val="num" w:pos="4320"/>
+        </w:tabs>
+        <w:ind w:left="4320" w:hanging="360"/>
+      </w:pPr>
+      <w:rPr>
+        <w:rFonts w:ascii="Wingdings" w:hAnsi="Wingdings" w:hint="default"/>
+        <w:sz w:val="20"/>
+      </w:rPr>
+    </w:lvl>
+    <w:lvl w:ilvl="6" w:tentative="1">
+      <w:start w:val="1"/>
+      <w:numFmt w:val="bullet"/>
+      <w:lvlText w:val=""/>
+      <w:lvlJc w:val="left"/>
+      <w:pPr>
+        <w:tabs>
+          <w:tab w:val="num" w:pos="5040"/>
+        </w:tabs>
+        <w:ind w:left="5040" w:hanging="360"/>
+      </w:pPr>
+      <w:rPr>
+        <w:rFonts w:ascii="Wingdings" w:hAnsi="Wingdings" w:hint="default"/>
+        <w:sz w:val="20"/>
+      </w:rPr>
+    </w:lvl>
+    <w:lvl w:ilvl="7" w:tentative="1">
+      <w:start w:val="1"/>
+      <w:numFmt w:val="bullet"/>
+      <w:lvlText w:val=""/>
+      <w:lvlJc w:val="left"/>
+      <w:pPr>
+        <w:tabs>
+          <w:tab w:val="num" w:pos="5760"/>
+        </w:tabs>
+        <w:ind w:left="5760" w:hanging="360"/>
+      </w:pPr>
+      <w:rPr>
+        <w:rFonts w:ascii="Wingdings" w:hAnsi="Wingdings" w:hint="default"/>
+        <w:sz w:val="20"/>
+      </w:rPr>
+    </w:lvl>
+    <w:lvl w:ilvl="8" w:tentative="1">
+      <w:start w:val="1"/>
+      <w:numFmt w:val="bullet"/>
+      <w:lvlText w:val=""/>
+      <w:lvlJc w:val="left"/>
+      <w:pPr>
+        <w:tabs>
+          <w:tab w:val="num" w:pos="6480"/>
+        </w:tabs>
+        <w:ind w:left="6480" w:hanging="360"/>
+      </w:pPr>
+      <w:rPr>
+        <w:rFonts w:ascii="Wingdings" w:hAnsi="Wingdings" w:hint="default"/>
+        <w:sz w:val="20"/>
+      </w:rPr>
+    </w:lvl>
+  </w:abstractNum>
+  <w:abstractNum w:abstractNumId="1" w15:restartNumberingAfterBreak="0">
+    <w:nsid w:val="2558628F"/>
+    <w:multiLevelType w:val="multilevel"/>
+    <w:tmpl w:val="98F0CB1C"/>
+    <w:lvl w:ilvl="0">
+      <w:start w:val="1"/>
+      <w:numFmt w:val="bullet"/>
+      <w:lvlText w:val=""/>
+      <w:lvlJc w:val="left"/>
+      <w:pPr>
+        <w:tabs>
+          <w:tab w:val="num" w:pos="720"/>
+        </w:tabs>
+        <w:ind w:left="720" w:hanging="360"/>
+      </w:pPr>
+      <w:rPr>
+        <w:rFonts w:ascii="Symbol" w:hAnsi="Symbol" w:hint="default"/>
+        <w:sz w:val="20"/>
+      </w:rPr>
+    </w:lvl>
+    <w:lvl w:ilvl="1" w:tentative="1">
+      <w:start w:val="1"/>
+      <w:numFmt w:val="bullet"/>
+      <w:lvlText w:val="o"/>
+      <w:lvlJc w:val="left"/>
+      <w:pPr>
+        <w:tabs>
+          <w:tab w:val="num" w:pos="1440"/>
+        </w:tabs>
+        <w:ind w:left="1440" w:hanging="360"/>
+      </w:pPr>
+      <w:rPr>
+        <w:rFonts w:ascii="Courier New" w:hAnsi="Courier New" w:hint="default"/>
+        <w:sz w:val="20"/>
+      </w:rPr>
+    </w:lvl>
+    <w:lvl w:ilvl="2" w:tentative="1">
+      <w:start w:val="1"/>
+      <w:numFmt w:val="bullet"/>
+      <w:lvlText w:val=""/>
+      <w:lvlJc w:val="left"/>
+      <w:pPr>
+        <w:tabs>
+          <w:tab w:val="num" w:pos="2160"/>
+        </w:tabs>
+        <w:ind w:left="2160" w:hanging="360"/>
+      </w:pPr>
+      <w:rPr>
+        <w:rFonts w:ascii="Wingdings" w:hAnsi="Wingdings" w:hint="default"/>
+        <w:sz w:val="20"/>
+      </w:rPr>
+    </w:lvl>
+    <w:lvl w:ilvl="3" w:tentative="1">
+      <w:start w:val="1"/>
+      <w:numFmt w:val="bullet"/>
+      <w:lvlText w:val=""/>
+      <w:lvlJc w:val="left"/>
+      <w:pPr>
+        <w:tabs>
+          <w:tab w:val="num" w:pos="2880"/>
+        </w:tabs>
+        <w:ind w:left="2880" w:hanging="360"/>
+      </w:pPr>
+      <w:rPr>
+        <w:rFonts w:ascii="Wingdings" w:hAnsi="Wingdings" w:hint="default"/>
+        <w:sz w:val="20"/>
+      </w:rPr>
+    </w:lvl>
+    <w:lvl w:ilvl="4" w:tentative="1">
+      <w:start w:val="1"/>
+      <w:numFmt w:val="bullet"/>
+      <w:lvlText w:val=""/>
+      <w:lvlJc w:val="left"/>
+      <w:pPr>
+        <w:tabs>
+          <w:tab w:val="num" w:pos="3600"/>
+        </w:tabs>
+        <w:ind w:left="3600" w:hanging="360"/>
+      </w:pPr>
+      <w:rPr>
+        <w:rFonts w:ascii="Wingdings" w:hAnsi="Wingdings" w:hint="default"/>
+        <w:sz w:val="20"/>
+      </w:rPr>
+    </w:lvl>
+    <w:lvl w:ilvl="5" w:tentative="1">
+      <w:start w:val="1"/>
+      <w:numFmt w:val="bullet"/>
+      <w:lvlText w:val=""/>
+      <w:lvlJc w:val="left"/>
+      <w:pPr>
+        <w:tabs>
+          <w:tab w:val="num" w:pos="4320"/>
+        </w:tabs>
+        <w:ind w:left="4320" w:hanging="360"/>
+      </w:pPr>
+      <w:rPr>
+        <w:rFonts w:ascii="Wingdings" w:hAnsi="Wingdings" w:hint="default"/>
+        <w:sz w:val="20"/>
+      </w:rPr>
+    </w:lvl>
+    <w:lvl w:ilvl="6" w:tentative="1">
+      <w:start w:val="1"/>
+      <w:numFmt w:val="bullet"/>
+      <w:lvlText w:val=""/>
+      <w:lvlJc w:val="left"/>
+      <w:pPr>
+        <w:tabs>
+          <w:tab w:val="num" w:pos="5040"/>
+        </w:tabs>
+        <w:ind w:left="5040" w:hanging="360"/>
+      </w:pPr>
+      <w:rPr>
+        <w:rFonts w:ascii="Wingdings" w:hAnsi="Wingdings" w:hint="default"/>
+        <w:sz w:val="20"/>
+      </w:rPr>
+    </w:lvl>
+    <w:lvl w:ilvl="7" w:tentative="1">
+      <w:start w:val="1"/>
+      <w:numFmt w:val="bullet"/>
+      <w:lvlText w:val=""/>
+      <w:lvlJc w:val="left"/>
+      <w:pPr>
+        <w:tabs>
+          <w:tab w:val="num" w:pos="5760"/>
+        </w:tabs>
+        <w:ind w:left="5760" w:hanging="360"/>
+      </w:pPr>
+      <w:rPr>
+        <w:rFonts w:ascii="Wingdings" w:hAnsi="Wingdings" w:hint="default"/>
+        <w:sz w:val="20"/>
+      </w:rPr>
+    </w:lvl>
+    <w:lvl w:ilvl="8" w:tentative="1">
+      <w:start w:val="1"/>
+      <w:numFmt w:val="bullet"/>
+      <w:lvlText w:val=""/>
+      <w:lvlJc w:val="left"/>
+      <w:pPr>
+        <w:tabs>
+          <w:tab w:val="num" w:pos="6480"/>
+        </w:tabs>
+        <w:ind w:left="6480" w:hanging="360"/>
+      </w:pPr>
+      <w:rPr>
+        <w:rFonts w:ascii="Wingdings" w:hAnsi="Wingdings" w:hint="default"/>
+        <w:sz w:val="20"/>
+      </w:rPr>
+    </w:lvl>
+  </w:abstractNum>
+  <w:abstractNum w:abstractNumId="2" w15:restartNumberingAfterBreak="0">
+    <w:nsid w:val="2E9E0D56"/>
+    <w:multiLevelType w:val="multilevel"/>
+    <w:tmpl w:val="BF825950"/>
+    <w:lvl w:ilvl="0">
+      <w:start w:val="1"/>
+      <w:numFmt w:val="bullet"/>
+      <w:lvlText w:val=""/>
+      <w:lvlJc w:val="left"/>
+      <w:pPr>
+        <w:tabs>
+          <w:tab w:val="num" w:pos="720"/>
+        </w:tabs>
+        <w:ind w:left="720" w:hanging="360"/>
+      </w:pPr>
+      <w:rPr>
+        <w:rFonts w:ascii="Symbol" w:hAnsi="Symbol" w:hint="default"/>
+        <w:sz w:val="20"/>
+      </w:rPr>
+    </w:lvl>
+    <w:lvl w:ilvl="1">
+      <w:start w:val="1"/>
+      <w:numFmt w:val="bullet"/>
+      <w:lvlText w:val="o"/>
+      <w:lvlJc w:val="left"/>
+      <w:pPr>
+        <w:tabs>
+          <w:tab w:val="num" w:pos="1440"/>
+        </w:tabs>
+        <w:ind w:left="1440" w:hanging="360"/>
+      </w:pPr>
+      <w:rPr>
+        <w:rFonts w:ascii="Courier New" w:hAnsi="Courier New" w:hint="default"/>
+        <w:sz w:val="20"/>
+      </w:rPr>
+    </w:lvl>
+    <w:lvl w:ilvl="2" w:tentative="1">
+      <w:start w:val="1"/>
+      <w:numFmt w:val="bullet"/>
+      <w:lvlText w:val=""/>
+      <w:lvlJc w:val="left"/>
+      <w:pPr>
+        <w:tabs>
+          <w:tab w:val="num" w:pos="2160"/>
+        </w:tabs>
+        <w:ind w:left="2160" w:hanging="360"/>
+      </w:pPr>
+      <w:rPr>
+        <w:rFonts w:ascii="Wingdings" w:hAnsi="Wingdings" w:hint="default"/>
+        <w:sz w:val="20"/>
+      </w:rPr>
+    </w:lvl>
+    <w:lvl w:ilvl="3" w:tentative="1">
+      <w:start w:val="1"/>
+      <w:numFmt w:val="bullet"/>
+      <w:lvlText w:val=""/>
+      <w:lvlJc w:val="left"/>
+      <w:pPr>
+        <w:tabs>
+          <w:tab w:val="num" w:pos="2880"/>
+        </w:tabs>
+        <w:ind w:left="2880" w:hanging="360"/>
+      </w:pPr>
+      <w:rPr>
+        <w:rFonts w:ascii="Wingdings" w:hAnsi="Wingdings" w:hint="default"/>
+        <w:sz w:val="20"/>
+      </w:rPr>
+    </w:lvl>
+    <w:lvl w:ilvl="4" w:tentative="1">
+      <w:start w:val="1"/>
+      <w:numFmt w:val="bullet"/>
+      <w:lvlText w:val=""/>
+      <w:lvlJc w:val="left"/>
+      <w:pPr>
+        <w:tabs>
+          <w:tab w:val="num" w:pos="3600"/>
+        </w:tabs>
+        <w:ind w:left="3600" w:hanging="360"/>
+      </w:pPr>
+      <w:rPr>
+        <w:rFonts w:ascii="Wingdings" w:hAnsi="Wingdings" w:hint="default"/>
+        <w:sz w:val="20"/>
+      </w:rPr>
+    </w:lvl>
+    <w:lvl w:ilvl="5" w:tentative="1">
+      <w:start w:val="1"/>
+      <w:numFmt w:val="bullet"/>
+      <w:lvlText w:val=""/>
+      <w:lvlJc w:val="left"/>
+      <w:pPr>
+        <w:tabs>
+          <w:tab w:val="num" w:pos="4320"/>
+        </w:tabs>
+        <w:ind w:left="4320" w:hanging="360"/>
+      </w:pPr>
+      <w:rPr>
+        <w:rFonts w:ascii="Wingdings" w:hAnsi="Wingdings" w:hint="default"/>
+        <w:sz w:val="20"/>
+      </w:rPr>
+    </w:lvl>
+    <w:lvl w:ilvl="6" w:tentative="1">
+      <w:start w:val="1"/>
+      <w:numFmt w:val="bullet"/>
+      <w:lvlText w:val=""/>
+      <w:lvlJc w:val="left"/>
+      <w:pPr>
+        <w:tabs>
+          <w:tab w:val="num" w:pos="5040"/>
+        </w:tabs>
+        <w:ind w:left="5040" w:hanging="360"/>
+      </w:pPr>
+      <w:rPr>
+        <w:rFonts w:ascii="Wingdings" w:hAnsi="Wingdings" w:hint="default"/>
+        <w:sz w:val="20"/>
+      </w:rPr>
+    </w:lvl>
+    <w:lvl w:ilvl="7" w:tentative="1">
+      <w:start w:val="1"/>
+      <w:numFmt w:val="bullet"/>
+      <w:lvlText w:val=""/>
+      <w:lvlJc w:val="left"/>
+      <w:pPr>
+        <w:tabs>
+          <w:tab w:val="num" w:pos="5760"/>
+        </w:tabs>
+        <w:ind w:left="5760" w:hanging="360"/>
+      </w:pPr>
+      <w:rPr>
+        <w:rFonts w:ascii="Wingdings" w:hAnsi="Wingdings" w:hint="default"/>
+        <w:sz w:val="20"/>
+      </w:rPr>
+    </w:lvl>
+    <w:lvl w:ilvl="8" w:tentative="1">
+      <w:start w:val="1"/>
+      <w:numFmt w:val="bullet"/>
+      <w:lvlText w:val=""/>
+      <w:lvlJc w:val="left"/>
+      <w:pPr>
+        <w:tabs>
+          <w:tab w:val="num" w:pos="6480"/>
+        </w:tabs>
+        <w:ind w:left="6480" w:hanging="360"/>
+      </w:pPr>
+      <w:rPr>
+        <w:rFonts w:ascii="Wingdings" w:hAnsi="Wingdings" w:hint="default"/>
+        <w:sz w:val="20"/>
+      </w:rPr>
+    </w:lvl>
+  </w:abstractNum>
+  <w:abstractNum w:abstractNumId="3" w15:restartNumberingAfterBreak="0">
+    <w:nsid w:val="3BCE07C2"/>
+    <w:multiLevelType w:val="multilevel"/>
+    <w:tmpl w:val="A03C84A6"/>
+    <w:lvl w:ilvl="0">
+      <w:start w:val="1"/>
+      <w:numFmt w:val="bullet"/>
+      <w:lvlText w:val=""/>
+      <w:lvlJc w:val="left"/>
+      <w:pPr>
+        <w:tabs>
+          <w:tab w:val="num" w:pos="720"/>
+        </w:tabs>
+        <w:ind w:left="720" w:hanging="360"/>
+      </w:pPr>
+      <w:rPr>
+        <w:rFonts w:ascii="Symbol" w:hAnsi="Symbol" w:hint="default"/>
+        <w:sz w:val="20"/>
+      </w:rPr>
+    </w:lvl>
+    <w:lvl w:ilvl="1" w:tentative="1">
+      <w:start w:val="1"/>
+      <w:numFmt w:val="bullet"/>
+      <w:lvlText w:val="o"/>
+      <w:lvlJc w:val="left"/>
+      <w:pPr>
+        <w:tabs>
+          <w:tab w:val="num" w:pos="1440"/>
+        </w:tabs>
+        <w:ind w:left="1440" w:hanging="360"/>
+      </w:pPr>
+      <w:rPr>
+        <w:rFonts w:ascii="Courier New" w:hAnsi="Courier New" w:hint="default"/>
+        <w:sz w:val="20"/>
+      </w:rPr>
+    </w:lvl>
+    <w:lvl w:ilvl="2" w:tentative="1">
+      <w:start w:val="1"/>
+      <w:numFmt w:val="bullet"/>
+      <w:lvlText w:val=""/>
+      <w:lvlJc w:val="left"/>
+      <w:pPr>
+        <w:tabs>
+          <w:tab w:val="num" w:pos="2160"/>
+        </w:tabs>
+        <w:ind w:left="2160" w:hanging="360"/>
+      </w:pPr>
+      <w:rPr>
+        <w:rFonts w:ascii="Wingdings" w:hAnsi="Wingdings" w:hint="default"/>
+        <w:sz w:val="20"/>
+      </w:rPr>
+    </w:lvl>
+    <w:lvl w:ilvl="3" w:tentative="1">
+      <w:start w:val="1"/>
+      <w:numFmt w:val="bullet"/>
+      <w:lvlText w:val=""/>
+      <w:lvlJc w:val="left"/>
+      <w:pPr>
+        <w:tabs>
+          <w:tab w:val="num" w:pos="2880"/>
+        </w:tabs>
+        <w:ind w:left="2880" w:hanging="360"/>
+      </w:pPr>
+      <w:rPr>
+        <w:rFonts w:ascii="Wingdings" w:hAnsi="Wingdings" w:hint="default"/>
+        <w:sz w:val="20"/>
+      </w:rPr>
+    </w:lvl>
+    <w:lvl w:ilvl="4" w:tentative="1">
+      <w:start w:val="1"/>
+      <w:numFmt w:val="bullet"/>
+      <w:lvlText w:val=""/>
+      <w:lvlJc w:val="left"/>
+      <w:pPr>
+        <w:tabs>
+          <w:tab w:val="num" w:pos="3600"/>
+        </w:tabs>
+        <w:ind w:left="3600" w:hanging="360"/>
+      </w:pPr>
+      <w:rPr>
+        <w:rFonts w:ascii="Wingdings" w:hAnsi="Wingdings" w:hint="default"/>
+        <w:sz w:val="20"/>
+      </w:rPr>
+    </w:lvl>
+    <w:lvl w:ilvl="5" w:tentative="1">
+      <w:start w:val="1"/>
+      <w:numFmt w:val="bullet"/>
+      <w:lvlText w:val=""/>
+      <w:lvlJc w:val="left"/>
+      <w:pPr>
+        <w:tabs>
+          <w:tab w:val="num" w:pos="4320"/>
+        </w:tabs>
+        <w:ind w:left="4320" w:hanging="360"/>
+      </w:pPr>
+      <w:rPr>
+        <w:rFonts w:ascii="Wingdings" w:hAnsi="Wingdings" w:hint="default"/>
+        <w:sz w:val="20"/>
+      </w:rPr>
+    </w:lvl>
+    <w:lvl w:ilvl="6" w:tentative="1">
+      <w:start w:val="1"/>
+      <w:numFmt w:val="bullet"/>
+      <w:lvlText w:val=""/>
+      <w:lvlJc w:val="left"/>
+      <w:pPr>
+        <w:tabs>
+          <w:tab w:val="num" w:pos="5040"/>
+        </w:tabs>
+        <w:ind w:left="5040" w:hanging="360"/>
+      </w:pPr>
+      <w:rPr>
+        <w:rFonts w:ascii="Wingdings" w:hAnsi="Wingdings" w:hint="default"/>
+        <w:sz w:val="20"/>
+      </w:rPr>
+    </w:lvl>
+    <w:lvl w:ilvl="7" w:tentative="1">
+      <w:start w:val="1"/>
+      <w:numFmt w:val="bullet"/>
+      <w:lvlText w:val=""/>
+      <w:lvlJc w:val="left"/>
+      <w:pPr>
+        <w:tabs>
+          <w:tab w:val="num" w:pos="5760"/>
+        </w:tabs>
+        <w:ind w:left="5760" w:hanging="360"/>
+      </w:pPr>
+      <w:rPr>
+        <w:rFonts w:ascii="Wingdings" w:hAnsi="Wingdings" w:hint="default"/>
+        <w:sz w:val="20"/>
+      </w:rPr>
+    </w:lvl>
+    <w:lvl w:ilvl="8" w:tentative="1">
+      <w:start w:val="1"/>
+      <w:numFmt w:val="bullet"/>
+      <w:lvlText w:val=""/>
+      <w:lvlJc w:val="left"/>
+      <w:pPr>
+        <w:tabs>
+          <w:tab w:val="num" w:pos="6480"/>
+        </w:tabs>
+        <w:ind w:left="6480" w:hanging="360"/>
+      </w:pPr>
+      <w:rPr>
+        <w:rFonts w:ascii="Wingdings" w:hAnsi="Wingdings" w:hint="default"/>
+        <w:sz w:val="20"/>
+      </w:rPr>
+    </w:lvl>
+  </w:abstractNum>
+  <w:abstractNum w:abstractNumId="4" w15:restartNumberingAfterBreak="0">
+    <w:nsid w:val="476003E3"/>
+    <w:multiLevelType w:val="multilevel"/>
+    <w:tmpl w:val="B3622E70"/>
+    <w:lvl w:ilvl="0">
+      <w:start w:val="1"/>
+      <w:numFmt w:val="bullet"/>
+      <w:lvlText w:val=""/>
+      <w:lvlJc w:val="left"/>
+      <w:pPr>
+        <w:tabs>
+          <w:tab w:val="num" w:pos="720"/>
+        </w:tabs>
+        <w:ind w:left="720" w:hanging="360"/>
+      </w:pPr>
+      <w:rPr>
+        <w:rFonts w:ascii="Symbol" w:hAnsi="Symbol" w:hint="default"/>
+        <w:sz w:val="20"/>
+      </w:rPr>
+    </w:lvl>
+    <w:lvl w:ilvl="1" w:tentative="1">
+      <w:start w:val="1"/>
+      <w:numFmt w:val="bullet"/>
+      <w:lvlText w:val="o"/>
+      <w:lvlJc w:val="left"/>
+      <w:pPr>
+        <w:tabs>
+          <w:tab w:val="num" w:pos="1440"/>
+        </w:tabs>
+        <w:ind w:left="1440" w:hanging="360"/>
+      </w:pPr>
+      <w:rPr>
+        <w:rFonts w:ascii="Courier New" w:hAnsi="Courier New" w:hint="default"/>
+        <w:sz w:val="20"/>
+      </w:rPr>
+    </w:lvl>
+    <w:lvl w:ilvl="2" w:tentative="1">
+      <w:start w:val="1"/>
+      <w:numFmt w:val="bullet"/>
+      <w:lvlText w:val=""/>
+      <w:lvlJc w:val="left"/>
+      <w:pPr>
+        <w:tabs>
+          <w:tab w:val="num" w:pos="2160"/>
+        </w:tabs>
+        <w:ind w:left="2160" w:hanging="360"/>
+      </w:pPr>
+      <w:rPr>
+        <w:rFonts w:ascii="Wingdings" w:hAnsi="Wingdings" w:hint="default"/>
+        <w:sz w:val="20"/>
+      </w:rPr>
+    </w:lvl>
+    <w:lvl w:ilvl="3" w:tentative="1">
+      <w:start w:val="1"/>
+      <w:numFmt w:val="bullet"/>
+      <w:lvlText w:val=""/>
+      <w:lvlJc w:val="left"/>
+      <w:pPr>
+        <w:tabs>
+          <w:tab w:val="num" w:pos="2880"/>
+        </w:tabs>
+        <w:ind w:left="2880" w:hanging="360"/>
+      </w:pPr>
+      <w:rPr>
+        <w:rFonts w:ascii="Wingdings" w:hAnsi="Wingdings" w:hint="default"/>
+        <w:sz w:val="20"/>
+      </w:rPr>
+    </w:lvl>
+    <w:lvl w:ilvl="4" w:tentative="1">
+      <w:start w:val="1"/>
+      <w:numFmt w:val="bullet"/>
+      <w:lvlText w:val=""/>
+      <w:lvlJc w:val="left"/>
+      <w:pPr>
+        <w:tabs>
+          <w:tab w:val="num" w:pos="3600"/>
+        </w:tabs>
+        <w:ind w:left="3600" w:hanging="360"/>
+      </w:pPr>
+      <w:rPr>
+        <w:rFonts w:ascii="Wingdings" w:hAnsi="Wingdings" w:hint="default"/>
+        <w:sz w:val="20"/>
+      </w:rPr>
+    </w:lvl>
+    <w:lvl w:ilvl="5" w:tentative="1">
+      <w:start w:val="1"/>
+      <w:numFmt w:val="bullet"/>
+      <w:lvlText w:val=""/>
+      <w:lvlJc w:val="left"/>
+      <w:pPr>
+        <w:tabs>
+          <w:tab w:val="num" w:pos="4320"/>
+        </w:tabs>
+        <w:ind w:left="4320" w:hanging="360"/>
+      </w:pPr>
+      <w:rPr>
+        <w:rFonts w:ascii="Wingdings" w:hAnsi="Wingdings" w:hint="default"/>
+        <w:sz w:val="20"/>
+      </w:rPr>
+    </w:lvl>
+    <w:lvl w:ilvl="6" w:tentative="1">
+      <w:start w:val="1"/>
+      <w:numFmt w:val="bullet"/>
+      <w:lvlText w:val=""/>
+      <w:lvlJc w:val="left"/>
+      <w:pPr>
+        <w:tabs>
+          <w:tab w:val="num" w:pos="5040"/>
+        </w:tabs>
+        <w:ind w:left="5040" w:hanging="360"/>
+      </w:pPr>
+      <w:rPr>
+        <w:rFonts w:ascii="Wingdings" w:hAnsi="Wingdings" w:hint="default"/>
+        <w:sz w:val="20"/>
+      </w:rPr>
+    </w:lvl>
+    <w:lvl w:ilvl="7" w:tentative="1">
+      <w:start w:val="1"/>
+      <w:numFmt w:val="bullet"/>
+      <w:lvlText w:val=""/>
+      <w:lvlJc w:val="left"/>
+      <w:pPr>
+        <w:tabs>
+          <w:tab w:val="num" w:pos="5760"/>
+        </w:tabs>
+        <w:ind w:left="5760" w:hanging="360"/>
+      </w:pPr>
+      <w:rPr>
+        <w:rFonts w:ascii="Wingdings" w:hAnsi="Wingdings" w:hint="default"/>
+        <w:sz w:val="20"/>
+      </w:rPr>
+    </w:lvl>
+    <w:lvl w:ilvl="8" w:tentative="1">
+      <w:start w:val="1"/>
+      <w:numFmt w:val="bullet"/>
+      <w:lvlText w:val=""/>
+      <w:lvlJc w:val="left"/>
+      <w:pPr>
+        <w:tabs>
+          <w:tab w:val="num" w:pos="6480"/>
+        </w:tabs>
+        <w:ind w:left="6480" w:hanging="360"/>
+      </w:pPr>
+      <w:rPr>
+        <w:rFonts w:ascii="Wingdings" w:hAnsi="Wingdings" w:hint="default"/>
+        <w:sz w:val="20"/>
+      </w:rPr>
+    </w:lvl>
+  </w:abstractNum>
+  <w:abstractNum w:abstractNumId="5" w15:restartNumberingAfterBreak="0">
+    <w:nsid w:val="5B825608"/>
+    <w:multiLevelType w:val="multilevel"/>
+    <w:tmpl w:val="54ACAE7E"/>
+    <w:lvl w:ilvl="0">
+      <w:start w:val="1"/>
+      <w:numFmt w:val="bullet"/>
+      <w:lvlText w:val=""/>
+      <w:lvlJc w:val="left"/>
+      <w:pPr>
+        <w:tabs>
+          <w:tab w:val="num" w:pos="720"/>
+        </w:tabs>
+        <w:ind w:left="720" w:hanging="360"/>
+      </w:pPr>
+      <w:rPr>
+        <w:rFonts w:ascii="Symbol" w:hAnsi="Symbol" w:hint="default"/>
+        <w:sz w:val="20"/>
+      </w:rPr>
+    </w:lvl>
+    <w:lvl w:ilvl="1" w:tentative="1">
+      <w:start w:val="1"/>
+      <w:numFmt w:val="bullet"/>
+      <w:lvlText w:val="o"/>
+      <w:lvlJc w:val="left"/>
+      <w:pPr>
+        <w:tabs>
+          <w:tab w:val="num" w:pos="1440"/>
+        </w:tabs>
+        <w:ind w:left="1440" w:hanging="360"/>
+      </w:pPr>
+      <w:rPr>
+        <w:rFonts w:ascii="Courier New" w:hAnsi="Courier New" w:hint="default"/>
+        <w:sz w:val="20"/>
+      </w:rPr>
+    </w:lvl>
+    <w:lvl w:ilvl="2" w:tentative="1">
+      <w:start w:val="1"/>
+      <w:numFmt w:val="bullet"/>
+      <w:lvlText w:val=""/>
+      <w:lvlJc w:val="left"/>
+      <w:pPr>
+        <w:tabs>
+          <w:tab w:val="num" w:pos="2160"/>
+        </w:tabs>
+        <w:ind w:left="2160" w:hanging="360"/>
+      </w:pPr>
+      <w:rPr>
+        <w:rFonts w:ascii="Wingdings" w:hAnsi="Wingdings" w:hint="default"/>
+        <w:sz w:val="20"/>
+      </w:rPr>
+    </w:lvl>
+    <w:lvl w:ilvl="3" w:tentative="1">
+      <w:start w:val="1"/>
+      <w:numFmt w:val="bullet"/>
+      <w:lvlText w:val=""/>
+      <w:lvlJc w:val="left"/>
+      <w:pPr>
+        <w:tabs>
+          <w:tab w:val="num" w:pos="2880"/>
+        </w:tabs>
+        <w:ind w:left="2880" w:hanging="360"/>
+      </w:pPr>
+      <w:rPr>
+        <w:rFonts w:ascii="Wingdings" w:hAnsi="Wingdings" w:hint="default"/>
+        <w:sz w:val="20"/>
+      </w:rPr>
+    </w:lvl>
+    <w:lvl w:ilvl="4" w:tentative="1">
+      <w:start w:val="1"/>
+      <w:numFmt w:val="bullet"/>
+      <w:lvlText w:val=""/>
+      <w:lvlJc w:val="left"/>
+      <w:pPr>
+        <w:tabs>
+          <w:tab w:val="num" w:pos="3600"/>
+        </w:tabs>
+        <w:ind w:left="3600" w:hanging="360"/>
+      </w:pPr>
+      <w:rPr>
+        <w:rFonts w:ascii="Wingdings" w:hAnsi="Wingdings" w:hint="default"/>
+        <w:sz w:val="20"/>
+      </w:rPr>
+    </w:lvl>
+    <w:lvl w:ilvl="5" w:tentative="1">
+      <w:start w:val="1"/>
+      <w:numFmt w:val="bullet"/>
+      <w:lvlText w:val=""/>
+      <w:lvlJc w:val="left"/>
+      <w:pPr>
+        <w:tabs>
+          <w:tab w:val="num" w:pos="4320"/>
+        </w:tabs>
+        <w:ind w:left="4320" w:hanging="360"/>
+      </w:pPr>
+      <w:rPr>
+        <w:rFonts w:ascii="Wingdings" w:hAnsi="Wingdings" w:hint="default"/>
+        <w:sz w:val="20"/>
+      </w:rPr>
+    </w:lvl>
+    <w:lvl w:ilvl="6" w:tentative="1">
+      <w:start w:val="1"/>
+      <w:numFmt w:val="bullet"/>
+      <w:lvlText w:val=""/>
+      <w:lvlJc w:val="left"/>
+      <w:pPr>
+        <w:tabs>
+          <w:tab w:val="num" w:pos="5040"/>
+        </w:tabs>
+        <w:ind w:left="5040" w:hanging="360"/>
+      </w:pPr>
+      <w:rPr>
+        <w:rFonts w:ascii="Wingdings" w:hAnsi="Wingdings" w:hint="default"/>
+        <w:sz w:val="20"/>
+      </w:rPr>
+    </w:lvl>
+    <w:lvl w:ilvl="7" w:tentative="1">
+      <w:start w:val="1"/>
+      <w:numFmt w:val="bullet"/>
+      <w:lvlText w:val=""/>
+      <w:lvlJc w:val="left"/>
+      <w:pPr>
+        <w:tabs>
+          <w:tab w:val="num" w:pos="5760"/>
+        </w:tabs>
+        <w:ind w:left="5760" w:hanging="360"/>
+      </w:pPr>
+      <w:rPr>
+        <w:rFonts w:ascii="Wingdings" w:hAnsi="Wingdings" w:hint="default"/>
+        <w:sz w:val="20"/>
+      </w:rPr>
+    </w:lvl>
+    <w:lvl w:ilvl="8" w:tentative="1">
+      <w:start w:val="1"/>
+      <w:numFmt w:val="bullet"/>
+      <w:lvlText w:val=""/>
+      <w:lvlJc w:val="left"/>
+      <w:pPr>
+        <w:tabs>
+          <w:tab w:val="num" w:pos="6480"/>
+        </w:tabs>
+        <w:ind w:left="6480" w:hanging="360"/>
+      </w:pPr>
+      <w:rPr>
+        <w:rFonts w:ascii="Wingdings" w:hAnsi="Wingdings" w:hint="default"/>
+        <w:sz w:val="20"/>
+      </w:rPr>
+    </w:lvl>
+  </w:abstractNum>
+  <w:abstractNum w:abstractNumId="6" w15:restartNumberingAfterBreak="0">
+    <w:nsid w:val="6F241116"/>
+    <w:multiLevelType w:val="multilevel"/>
+    <w:tmpl w:val="70CE2230"/>
+    <w:lvl w:ilvl="0">
+      <w:start w:val="1"/>
+      <w:numFmt w:val="bullet"/>
+      <w:lvlText w:val=""/>
+      <w:lvlJc w:val="left"/>
+      <w:pPr>
+        <w:tabs>
+          <w:tab w:val="num" w:pos="720"/>
+        </w:tabs>
+        <w:ind w:left="720" w:hanging="360"/>
+      </w:pPr>
+      <w:rPr>
+        <w:rFonts w:ascii="Symbol" w:hAnsi="Symbol" w:hint="default"/>
+        <w:sz w:val="20"/>
+      </w:rPr>
+    </w:lvl>
+    <w:lvl w:ilvl="1" w:tentative="1">
+      <w:start w:val="1"/>
+      <w:numFmt w:val="bullet"/>
+      <w:lvlText w:val="o"/>
+      <w:lvlJc w:val="left"/>
+      <w:pPr>
+        <w:tabs>
+          <w:tab w:val="num" w:pos="1440"/>
+        </w:tabs>
+        <w:ind w:left="1440" w:hanging="360"/>
+      </w:pPr>
+      <w:rPr>
+        <w:rFonts w:ascii="Courier New" w:hAnsi="Courier New" w:hint="default"/>
+        <w:sz w:val="20"/>
+      </w:rPr>
+    </w:lvl>
+    <w:lvl w:ilvl="2" w:tentative="1">
+      <w:start w:val="1"/>
+      <w:numFmt w:val="bullet"/>
+      <w:lvlText w:val=""/>
+      <w:lvlJc w:val="left"/>
+      <w:pPr>
+        <w:tabs>
+          <w:tab w:val="num" w:pos="2160"/>
+        </w:tabs>
+        <w:ind w:left="2160" w:hanging="360"/>
+      </w:pPr>
+      <w:rPr>
+        <w:rFonts w:ascii="Wingdings" w:hAnsi="Wingdings" w:hint="default"/>
+        <w:sz w:val="20"/>
+      </w:rPr>
+    </w:lvl>
+    <w:lvl w:ilvl="3" w:tentative="1">
+      <w:start w:val="1"/>
+      <w:numFmt w:val="bullet"/>
+      <w:lvlText w:val=""/>
+      <w:lvlJc w:val="left"/>
+      <w:pPr>
+        <w:tabs>
+          <w:tab w:val="num" w:pos="2880"/>
+        </w:tabs>
+        <w:ind w:left="2880" w:hanging="360"/>
+      </w:pPr>
+      <w:rPr>
+        <w:rFonts w:ascii="Wingdings" w:hAnsi="Wingdings" w:hint="default"/>
+        <w:sz w:val="20"/>
+      </w:rPr>
+    </w:lvl>
+    <w:lvl w:ilvl="4" w:tentative="1">
+      <w:start w:val="1"/>
+      <w:numFmt w:val="bullet"/>
+      <w:lvlText w:val=""/>
+      <w:lvlJc w:val="left"/>
+      <w:pPr>
+        <w:tabs>
+          <w:tab w:val="num" w:pos="3600"/>
+        </w:tabs>
+        <w:ind w:left="3600" w:hanging="360"/>
+      </w:pPr>
+      <w:rPr>
+        <w:rFonts w:ascii="Wingdings" w:hAnsi="Wingdings" w:hint="default"/>
+        <w:sz w:val="20"/>
+      </w:rPr>
+    </w:lvl>
+    <w:lvl w:ilvl="5" w:tentative="1">
+      <w:start w:val="1"/>
+      <w:numFmt w:val="bullet"/>
+      <w:lvlText w:val=""/>
+      <w:lvlJc w:val="left"/>
+      <w:pPr>
+        <w:tabs>
+          <w:tab w:val="num" w:pos="4320"/>
+        </w:tabs>
+        <w:ind w:left="4320" w:hanging="360"/>
+      </w:pPr>
+      <w:rPr>
+        <w:rFonts w:ascii="Wingdings" w:hAnsi="Wingdings" w:hint="default"/>
+        <w:sz w:val="20"/>
+      </w:rPr>
+    </w:lvl>
+    <w:lvl w:ilvl="6" w:tentative="1">
+      <w:start w:val="1"/>
+      <w:numFmt w:val="bullet"/>
+      <w:lvlText w:val=""/>
+      <w:lvlJc w:val="left"/>
+      <w:pPr>
+        <w:tabs>
+          <w:tab w:val="num" w:pos="5040"/>
+        </w:tabs>
+        <w:ind w:left="5040" w:hanging="360"/>
+      </w:pPr>
+      <w:rPr>
+        <w:rFonts w:ascii="Wingdings" w:hAnsi="Wingdings" w:hint="default"/>
+        <w:sz w:val="20"/>
+      </w:rPr>
+    </w:lvl>
+    <w:lvl w:ilvl="7" w:tentative="1">
+      <w:start w:val="1"/>
+      <w:numFmt w:val="bullet"/>
+      <w:lvlText w:val=""/>
+      <w:lvlJc w:val="left"/>
+      <w:pPr>
+        <w:tabs>
+          <w:tab w:val="num" w:pos="5760"/>
+        </w:tabs>
+        <w:ind w:left="5760" w:hanging="360"/>
+      </w:pPr>
+      <w:rPr>
+        <w:rFonts w:ascii="Wingdings" w:hAnsi="Wingdings" w:hint="default"/>
+        <w:sz w:val="20"/>
+      </w:rPr>
+    </w:lvl>
+    <w:lvl w:ilvl="8" w:tentative="1">
+      <w:start w:val="1"/>
+      <w:numFmt w:val="bullet"/>
+      <w:lvlText w:val=""/>
+      <w:lvlJc w:val="left"/>
+      <w:pPr>
+        <w:tabs>
+          <w:tab w:val="num" w:pos="6480"/>
+        </w:tabs>
+        <w:ind w:left="6480" w:hanging="360"/>
+      </w:pPr>
+      <w:rPr>
+        <w:rFonts w:ascii="Wingdings" w:hAnsi="Wingdings" w:hint="default"/>
+        <w:sz w:val="20"/>
+      </w:rPr>
+    </w:lvl>
+  </w:abstractNum>
+  <w:num w:numId="1" w16cid:durableId="1494569126">
+    <w:abstractNumId w:val="0"/>
+  </w:num>
+  <w:num w:numId="2" w16cid:durableId="122818349">
+    <w:abstractNumId w:val="4"/>
+  </w:num>
+  <w:num w:numId="3" w16cid:durableId="2074424781">
+    <w:abstractNumId w:val="6"/>
+  </w:num>
+  <w:num w:numId="4" w16cid:durableId="718212063">
+    <w:abstractNumId w:val="3"/>
+  </w:num>
+  <w:num w:numId="5" w16cid:durableId="1915358892">
+    <w:abstractNumId w:val="2"/>
+  </w:num>
+  <w:num w:numId="6" w16cid:durableId="992950541">
+    <w:abstractNumId w:val="1"/>
+  </w:num>
+  <w:num w:numId="7" w16cid:durableId="1708332114">
+    <w:abstractNumId w:val="5"/>
+  </w:num>
+</w:numbering>
 </file>
 
 <file path=word/styles.xml><?xml version="1.0" encoding="utf-8"?>
@@ -1378,7 +3077,6 @@
     <w:next w:val="Normal"/>
     <w:link w:val="Heading2Char"/>
     <w:uiPriority w:val="9"/>
-    <w:semiHidden/>
     <w:unhideWhenUsed/>
     <w:qFormat/>
     <w:rsid w:val="009D1FDD"/>
@@ -1594,7 +3292,6 @@
     <w:basedOn w:val="DefaultParagraphFont"/>
     <w:link w:val="Heading2"/>
     <w:uiPriority w:val="9"/>
-    <w:semiHidden/>
     <w:rsid w:val="009D1FDD"/>
     <w:rPr>
       <w:rFonts w:asciiTheme="majorHAnsi" w:eastAsiaTheme="majorEastAsia" w:hAnsiTheme="majorHAnsi" w:cstheme="majorBidi"/>

</xml_diff>

<commit_message>
docs: finalize PSD with technical resource mapping and feasibility analysis
</commit_message>
<xml_diff>
--- a/docs/PSD.docx
+++ b/docs/PSD.docx
@@ -7,10 +7,7 @@
         <w:pStyle w:val="Heading1"/>
       </w:pPr>
       <w:r>
-        <w:t>CarePoint Hospital System: Product Specification Document (PS</w:t>
-      </w:r>
-      <w:r>
-        <w:t>D)</w:t>
+        <w:t>CarePoint Hospital System: Product Specification Document (PSD)</w:t>
       </w:r>
     </w:p>
     <w:p>
@@ -666,6 +663,376 @@
         <w:t>16GB RAM (Exceeding the 8GB minimum to ensure zero degradation during screen recording for the final video).</w:t>
       </w:r>
     </w:p>
+    <w:p>
+      <w:pPr>
+        <w:rPr>
+          <w:rFonts w:ascii="Calibri" w:hAnsi="Calibri" w:cs="Calibri"/>
+          <w:b/>
+          <w:bCs/>
+        </w:rPr>
+      </w:pPr>
+    </w:p>
+    <w:p>
+      <w:pPr>
+        <w:rPr>
+          <w:rFonts w:cstheme="majorBidi"/>
+          <w:b/>
+          <w:bCs/>
+          <w:u w:val="single"/>
+        </w:rPr>
+      </w:pPr>
+      <w:r>
+        <w:rPr>
+          <w:b/>
+          <w:bCs/>
+          <w:u w:val="single"/>
+        </w:rPr>
+        <w:t>Hardware/Software Integration Mapping</w:t>
+      </w:r>
+    </w:p>
+    <w:tbl>
+      <w:tblPr>
+        <w:tblStyle w:val="TableGrid"/>
+        <w:tblW w:w="0" w:type="auto"/>
+        <w:tblLook w:val="04A0" w:firstRow="1" w:lastRow="0" w:firstColumn="1" w:lastColumn="0" w:noHBand="0" w:noVBand="1"/>
+      </w:tblPr>
+      <w:tblGrid>
+        <w:gridCol w:w="1626"/>
+        <w:gridCol w:w="1912"/>
+        <w:gridCol w:w="5812"/>
+      </w:tblGrid>
+      <w:tr>
+        <w:tc>
+          <w:tcPr>
+            <w:tcW w:w="0" w:type="auto"/>
+            <w:hideMark/>
+          </w:tcPr>
+          <w:p>
+            <w:pPr>
+              <w:spacing w:after="160" w:line="278" w:lineRule="auto"/>
+              <w:rPr>
+                <w:rFonts w:ascii="Calibri" w:hAnsi="Calibri" w:cs="Calibri"/>
+                <w:b/>
+                <w:bCs/>
+              </w:rPr>
+            </w:pPr>
+            <w:r>
+              <w:rPr>
+                <w:rFonts w:ascii="Calibri" w:hAnsi="Calibri" w:cs="Calibri"/>
+                <w:b/>
+                <w:bCs/>
+              </w:rPr>
+              <w:t>Component</w:t>
+            </w:r>
+          </w:p>
+        </w:tc>
+        <w:tc>
+          <w:tcPr>
+            <w:tcW w:w="0" w:type="auto"/>
+            <w:hideMark/>
+          </w:tcPr>
+          <w:p>
+            <w:pPr>
+              <w:spacing w:after="160" w:line="278" w:lineRule="auto"/>
+              <w:rPr>
+                <w:rFonts w:ascii="Calibri" w:hAnsi="Calibri" w:cs="Calibri"/>
+                <w:b/>
+                <w:bCs/>
+              </w:rPr>
+            </w:pPr>
+            <w:r>
+              <w:rPr>
+                <w:rFonts w:ascii="Calibri" w:hAnsi="Calibri" w:cs="Calibri"/>
+                <w:b/>
+                <w:bCs/>
+              </w:rPr>
+              <w:t>Resource</w:t>
+            </w:r>
+          </w:p>
+        </w:tc>
+        <w:tc>
+          <w:tcPr>
+            <w:tcW w:w="0" w:type="auto"/>
+            <w:hideMark/>
+          </w:tcPr>
+          <w:p>
+            <w:pPr>
+              <w:spacing w:after="160" w:line="278" w:lineRule="auto"/>
+              <w:rPr>
+                <w:rFonts w:ascii="Calibri" w:hAnsi="Calibri" w:cs="Calibri"/>
+                <w:b/>
+                <w:bCs/>
+              </w:rPr>
+            </w:pPr>
+            <w:r>
+              <w:rPr>
+                <w:rFonts w:ascii="Calibri" w:hAnsi="Calibri" w:cs="Calibri"/>
+                <w:b/>
+                <w:bCs/>
+              </w:rPr>
+              <w:t>Justification</w:t>
+            </w:r>
+          </w:p>
+        </w:tc>
+      </w:tr>
+      <w:tr>
+        <w:tc>
+          <w:tcPr>
+            <w:tcW w:w="0" w:type="auto"/>
+            <w:hideMark/>
+          </w:tcPr>
+          <w:p>
+            <w:pPr>
+              <w:spacing w:after="160" w:line="278" w:lineRule="auto"/>
+              <w:rPr>
+                <w:rFonts w:ascii="Calibri" w:hAnsi="Calibri" w:cs="Calibri"/>
+              </w:rPr>
+            </w:pPr>
+            <w:r>
+              <w:rPr>
+                <w:rFonts w:ascii="Calibri" w:hAnsi="Calibri" w:cs="Calibri"/>
+              </w:rPr>
+              <w:t>Backend</w:t>
+            </w:r>
+          </w:p>
+        </w:tc>
+        <w:tc>
+          <w:tcPr>
+            <w:tcW w:w="0" w:type="auto"/>
+            <w:hideMark/>
+          </w:tcPr>
+          <w:p>
+            <w:pPr>
+              <w:spacing w:after="160" w:line="278" w:lineRule="auto"/>
+              <w:rPr>
+                <w:rFonts w:ascii="Calibri" w:hAnsi="Calibri" w:cs="Calibri"/>
+              </w:rPr>
+            </w:pPr>
+            <w:proofErr w:type="spellStart"/>
+            <w:r>
+              <w:rPr>
+                <w:rFonts w:ascii="Calibri" w:hAnsi="Calibri" w:cs="Calibri"/>
+              </w:rPr>
+              <w:t>SvelteKit</w:t>
+            </w:r>
+            <w:proofErr w:type="spellEnd"/>
+            <w:r>
+              <w:rPr>
+                <w:rFonts w:ascii="Calibri" w:hAnsi="Calibri" w:cs="Calibri"/>
+              </w:rPr>
+              <w:t xml:space="preserve"> (Node.js)</w:t>
+            </w:r>
+          </w:p>
+        </w:tc>
+        <w:tc>
+          <w:tcPr>
+            <w:tcW w:w="0" w:type="auto"/>
+            <w:hideMark/>
+          </w:tcPr>
+          <w:p>
+            <w:pPr>
+              <w:spacing w:after="160" w:line="278" w:lineRule="auto"/>
+              <w:rPr>
+                <w:rFonts w:ascii="Calibri" w:hAnsi="Calibri" w:cs="Calibri"/>
+              </w:rPr>
+            </w:pPr>
+            <w:r>
+              <w:rPr>
+                <w:rFonts w:ascii="Calibri" w:hAnsi="Calibri" w:cs="Calibri"/>
+              </w:rPr>
+              <w:t>Chosen for "seamless data retrieval" and built-in server-side security.</w:t>
+            </w:r>
+          </w:p>
+        </w:tc>
+      </w:tr>
+      <w:tr>
+        <w:tc>
+          <w:tcPr>
+            <w:tcW w:w="0" w:type="auto"/>
+            <w:hideMark/>
+          </w:tcPr>
+          <w:p>
+            <w:pPr>
+              <w:spacing w:after="160" w:line="278" w:lineRule="auto"/>
+              <w:rPr>
+                <w:rFonts w:ascii="Calibri" w:hAnsi="Calibri" w:cs="Calibri"/>
+              </w:rPr>
+            </w:pPr>
+            <w:r>
+              <w:rPr>
+                <w:rFonts w:ascii="Calibri" w:hAnsi="Calibri" w:cs="Calibri"/>
+              </w:rPr>
+              <w:lastRenderedPageBreak/>
+              <w:t>Frontend</w:t>
+            </w:r>
+          </w:p>
+        </w:tc>
+        <w:tc>
+          <w:tcPr>
+            <w:tcW w:w="0" w:type="auto"/>
+            <w:hideMark/>
+          </w:tcPr>
+          <w:p>
+            <w:pPr>
+              <w:spacing w:after="160" w:line="278" w:lineRule="auto"/>
+              <w:rPr>
+                <w:rFonts w:ascii="Calibri" w:hAnsi="Calibri" w:cs="Calibri"/>
+              </w:rPr>
+            </w:pPr>
+            <w:r>
+              <w:rPr>
+                <w:rFonts w:ascii="Calibri" w:hAnsi="Calibri" w:cs="Calibri"/>
+              </w:rPr>
+              <w:t>Tailwind CSS / Svelte</w:t>
+            </w:r>
+          </w:p>
+        </w:tc>
+        <w:tc>
+          <w:tcPr>
+            <w:tcW w:w="0" w:type="auto"/>
+            <w:hideMark/>
+          </w:tcPr>
+          <w:p>
+            <w:pPr>
+              <w:spacing w:after="160" w:line="278" w:lineRule="auto"/>
+              <w:rPr>
+                <w:rFonts w:ascii="Calibri" w:hAnsi="Calibri" w:cs="Calibri"/>
+              </w:rPr>
+            </w:pPr>
+            <w:r>
+              <w:rPr>
+                <w:rFonts w:ascii="Calibri" w:hAnsi="Calibri" w:cs="Calibri"/>
+              </w:rPr>
+              <w:t>Ensures the "patient-centric" UI is responsive and accessible.</w:t>
+            </w:r>
+          </w:p>
+        </w:tc>
+      </w:tr>
+      <w:tr>
+        <w:tc>
+          <w:tcPr>
+            <w:tcW w:w="0" w:type="auto"/>
+            <w:hideMark/>
+          </w:tcPr>
+          <w:p>
+            <w:pPr>
+              <w:spacing w:after="160" w:line="278" w:lineRule="auto"/>
+              <w:rPr>
+                <w:rFonts w:ascii="Calibri" w:hAnsi="Calibri" w:cs="Calibri"/>
+              </w:rPr>
+            </w:pPr>
+            <w:r>
+              <w:rPr>
+                <w:rFonts w:ascii="Calibri" w:hAnsi="Calibri" w:cs="Calibri"/>
+              </w:rPr>
+              <w:t>Version Control</w:t>
+            </w:r>
+          </w:p>
+        </w:tc>
+        <w:tc>
+          <w:tcPr>
+            <w:tcW w:w="0" w:type="auto"/>
+            <w:hideMark/>
+          </w:tcPr>
+          <w:p>
+            <w:pPr>
+              <w:spacing w:after="160" w:line="278" w:lineRule="auto"/>
+              <w:rPr>
+                <w:rFonts w:ascii="Calibri" w:hAnsi="Calibri" w:cs="Calibri"/>
+              </w:rPr>
+            </w:pPr>
+            <w:r>
+              <w:rPr>
+                <w:rFonts w:ascii="Calibri" w:hAnsi="Calibri" w:cs="Calibri"/>
+              </w:rPr>
+              <w:t>GitHub</w:t>
+            </w:r>
+          </w:p>
+        </w:tc>
+        <w:tc>
+          <w:tcPr>
+            <w:tcW w:w="0" w:type="auto"/>
+            <w:hideMark/>
+          </w:tcPr>
+          <w:p>
+            <w:pPr>
+              <w:spacing w:after="160" w:line="278" w:lineRule="auto"/>
+              <w:rPr>
+                <w:rFonts w:ascii="Calibri" w:hAnsi="Calibri" w:cs="Calibri"/>
+              </w:rPr>
+            </w:pPr>
+            <w:r>
+              <w:rPr>
+                <w:rFonts w:ascii="Calibri" w:hAnsi="Calibri" w:cs="Calibri"/>
+              </w:rPr>
+              <w:t>Required for "regular flow of commits" and iterative tracking [cite rubric].</w:t>
+            </w:r>
+          </w:p>
+        </w:tc>
+      </w:tr>
+      <w:tr>
+        <w:tc>
+          <w:tcPr>
+            <w:tcW w:w="0" w:type="auto"/>
+            <w:hideMark/>
+          </w:tcPr>
+          <w:p>
+            <w:pPr>
+              <w:spacing w:after="160" w:line="278" w:lineRule="auto"/>
+              <w:rPr>
+                <w:rFonts w:ascii="Calibri" w:hAnsi="Calibri" w:cs="Calibri"/>
+              </w:rPr>
+            </w:pPr>
+            <w:r>
+              <w:rPr>
+                <w:rFonts w:ascii="Calibri" w:hAnsi="Calibri" w:cs="Calibri"/>
+              </w:rPr>
+              <w:t>Hosting</w:t>
+            </w:r>
+          </w:p>
+        </w:tc>
+        <w:tc>
+          <w:tcPr>
+            <w:tcW w:w="0" w:type="auto"/>
+            <w:hideMark/>
+          </w:tcPr>
+          <w:p>
+            <w:pPr>
+              <w:spacing w:after="160" w:line="278" w:lineRule="auto"/>
+              <w:rPr>
+                <w:rFonts w:ascii="Calibri" w:hAnsi="Calibri" w:cs="Calibri"/>
+              </w:rPr>
+            </w:pPr>
+            <w:r>
+              <w:rPr>
+                <w:rFonts w:ascii="Calibri" w:hAnsi="Calibri" w:cs="Calibri"/>
+              </w:rPr>
+              <w:t>cPanel (Linux)</w:t>
+            </w:r>
+          </w:p>
+        </w:tc>
+        <w:tc>
+          <w:tcPr>
+            <w:tcW w:w="0" w:type="auto"/>
+            <w:hideMark/>
+          </w:tcPr>
+          <w:p>
+            <w:pPr>
+              <w:spacing w:after="160" w:line="278" w:lineRule="auto"/>
+              <w:rPr>
+                <w:rFonts w:ascii="Calibri" w:hAnsi="Calibri" w:cs="Calibri"/>
+              </w:rPr>
+            </w:pPr>
+            <w:r>
+              <w:rPr>
+                <w:rFonts w:ascii="Calibri" w:hAnsi="Calibri" w:cs="Calibri"/>
+              </w:rPr>
+              <w:t>Provides a stable environment for final deployment and demonstration.</w:t>
+            </w:r>
+          </w:p>
+        </w:tc>
+      </w:tr>
+    </w:tbl>
     <w:p>
       <w:pPr>
         <w:rPr>
@@ -851,7 +1218,6 @@
               <w:rPr>
                 <w:rFonts w:ascii="Calibri" w:hAnsi="Calibri" w:cs="Calibri"/>
               </w:rPr>
-              <w:lastRenderedPageBreak/>
               <w:t>Appointment Slots</w:t>
             </w:r>
           </w:p>
@@ -928,6 +1294,8 @@
         </w:tc>
       </w:tr>
     </w:tbl>
+    <w:p/>
+    <w:p/>
     <w:p/>
     <w:p/>
     <w:p>
@@ -1480,6 +1848,7 @@
           <w:b/>
           <w:bCs/>
         </w:rPr>
+        <w:lastRenderedPageBreak/>
         <w:t xml:space="preserve">Security Testing: </w:t>
       </w:r>
       <w:r>
@@ -3122,7 +3491,6 @@
     <w:next w:val="Normal"/>
     <w:link w:val="Heading4Char"/>
     <w:uiPriority w:val="9"/>
-    <w:semiHidden/>
     <w:unhideWhenUsed/>
     <w:qFormat/>
     <w:rsid w:val="009D1FDD"/>
@@ -3319,7 +3687,6 @@
     <w:basedOn w:val="DefaultParagraphFont"/>
     <w:link w:val="Heading4"/>
     <w:uiPriority w:val="9"/>
-    <w:semiHidden/>
     <w:rsid w:val="009D1FDD"/>
     <w:rPr>
       <w:rFonts w:eastAsiaTheme="majorEastAsia" w:cstheme="majorBidi"/>

</xml_diff>

<commit_message>
docs: update project documentation with enhanced risk register, testing plan, and requirement analysis; refine team roles and methodology for solo development
</commit_message>
<xml_diff>
--- a/docs/PSD.docx
+++ b/docs/PSD.docx
@@ -1298,11 +1298,15 @@
     <w:p/>
     <w:p/>
     <w:p/>
+    <w:p/>
+    <w:p/>
+    <w:p/>
     <w:p>
       <w:pPr>
         <w:pStyle w:val="Heading2"/>
       </w:pPr>
       <w:r>
+        <w:lastRenderedPageBreak/>
         <w:t>7. Risk Register</w:t>
       </w:r>
     </w:p>
@@ -1310,15 +1314,17 @@
       <w:tblPr>
         <w:tblStyle w:val="TableGrid"/>
         <w:tblpPr w:leftFromText="180" w:rightFromText="180" w:vertAnchor="text" w:horzAnchor="margin" w:tblpY="-53"/>
-        <w:tblW w:w="9833" w:type="dxa"/>
+        <w:tblW w:w="9350" w:type="dxa"/>
         <w:tblLook w:val="04A0" w:firstRow="1" w:lastRow="0" w:firstColumn="1" w:lastColumn="0" w:noHBand="0" w:noVBand="1"/>
       </w:tblPr>
       <w:tblGrid>
         <w:gridCol w:w="504"/>
-        <w:gridCol w:w="1684"/>
+        <w:gridCol w:w="1039"/>
         <w:gridCol w:w="1305"/>
         <w:gridCol w:w="1040"/>
-        <w:gridCol w:w="5300"/>
+        <w:gridCol w:w="2140"/>
+        <w:gridCol w:w="1661"/>
+        <w:gridCol w:w="1661"/>
       </w:tblGrid>
       <w:tr>
         <w:tc>
@@ -1419,7 +1425,7 @@
         </w:tc>
         <w:tc>
           <w:tcPr>
-            <w:tcW w:w="0" w:type="auto"/>
+            <w:tcW w:w="2140" w:type="dxa"/>
           </w:tcPr>
           <w:p>
             <w:pPr>
@@ -1439,6 +1445,50 @@
             </w:r>
           </w:p>
         </w:tc>
+        <w:tc>
+          <w:tcPr>
+            <w:tcW w:w="1661" w:type="dxa"/>
+          </w:tcPr>
+          <w:p>
+            <w:pPr>
+              <w:rPr>
+                <w:rFonts w:ascii="Calibri" w:hAnsi="Calibri" w:cs="Calibri"/>
+                <w:b/>
+                <w:bCs/>
+              </w:rPr>
+            </w:pPr>
+            <w:r>
+              <w:rPr>
+                <w:rFonts w:ascii="Calibri" w:hAnsi="Calibri" w:cs="Calibri"/>
+                <w:b/>
+                <w:bCs/>
+              </w:rPr>
+              <w:t>Status</w:t>
+            </w:r>
+          </w:p>
+        </w:tc>
+        <w:tc>
+          <w:tcPr>
+            <w:tcW w:w="1661" w:type="dxa"/>
+          </w:tcPr>
+          <w:p>
+            <w:pPr>
+              <w:rPr>
+                <w:rFonts w:ascii="Calibri" w:hAnsi="Calibri" w:cs="Calibri"/>
+                <w:b/>
+                <w:bCs/>
+              </w:rPr>
+            </w:pPr>
+            <w:r>
+              <w:rPr>
+                <w:rFonts w:ascii="Calibri" w:hAnsi="Calibri" w:cs="Calibri"/>
+                <w:b/>
+                <w:bCs/>
+              </w:rPr>
+              <w:t>Owner</w:t>
+            </w:r>
+          </w:p>
+        </w:tc>
       </w:tr>
       <w:tr>
         <w:tc>
@@ -1527,7 +1577,7 @@
         </w:tc>
         <w:tc>
           <w:tcPr>
-            <w:tcW w:w="0" w:type="auto"/>
+            <w:tcW w:w="2140" w:type="dxa"/>
           </w:tcPr>
           <w:p>
             <w:pPr>
@@ -1553,7 +1603,43 @@
               <w:rPr>
                 <w:rFonts w:ascii="Calibri" w:hAnsi="Calibri" w:cs="Calibri"/>
               </w:rPr>
-              <w:t xml:space="preserve"> server-side load functions to validate user sessions before displaying records .</w:t>
+              <w:t xml:space="preserve"> server-side load functions to validate user sessions before displaying records.</w:t>
+            </w:r>
+          </w:p>
+        </w:tc>
+        <w:tc>
+          <w:tcPr>
+            <w:tcW w:w="1661" w:type="dxa"/>
+          </w:tcPr>
+          <w:p>
+            <w:pPr>
+              <w:rPr>
+                <w:rFonts w:ascii="Calibri" w:hAnsi="Calibri" w:cs="Calibri"/>
+              </w:rPr>
+            </w:pPr>
+            <w:r>
+              <w:rPr>
+                <w:rFonts w:ascii="Calibri" w:hAnsi="Calibri" w:cs="Calibri"/>
+              </w:rPr>
+              <w:t>Monitoring</w:t>
+            </w:r>
+          </w:p>
+        </w:tc>
+        <w:tc>
+          <w:tcPr>
+            <w:tcW w:w="1661" w:type="dxa"/>
+          </w:tcPr>
+          <w:p>
+            <w:pPr>
+              <w:rPr>
+                <w:rFonts w:ascii="Calibri" w:hAnsi="Calibri" w:cs="Calibri"/>
+              </w:rPr>
+            </w:pPr>
+            <w:r>
+              <w:rPr>
+                <w:rFonts w:ascii="Calibri" w:hAnsi="Calibri" w:cs="Calibri"/>
+              </w:rPr>
+              <w:t>Developer</w:t>
             </w:r>
           </w:p>
         </w:tc>
@@ -1645,7 +1731,7 @@
         </w:tc>
         <w:tc>
           <w:tcPr>
-            <w:tcW w:w="0" w:type="auto"/>
+            <w:tcW w:w="2140" w:type="dxa"/>
           </w:tcPr>
           <w:p>
             <w:pPr>
@@ -1658,6 +1744,42 @@
                 <w:rFonts w:ascii="Calibri" w:hAnsi="Calibri" w:cs="Calibri"/>
               </w:rPr>
               <w:t>Implement automated Unit Testing (Arrange, Act, Assert) for the date/time selection logic.</w:t>
+            </w:r>
+          </w:p>
+        </w:tc>
+        <w:tc>
+          <w:tcPr>
+            <w:tcW w:w="1661" w:type="dxa"/>
+          </w:tcPr>
+          <w:p>
+            <w:pPr>
+              <w:rPr>
+                <w:rFonts w:ascii="Calibri" w:hAnsi="Calibri" w:cs="Calibri"/>
+              </w:rPr>
+            </w:pPr>
+            <w:r>
+              <w:rPr>
+                <w:rFonts w:ascii="Calibri" w:hAnsi="Calibri" w:cs="Calibri"/>
+              </w:rPr>
+              <w:t>Active</w:t>
+            </w:r>
+          </w:p>
+        </w:tc>
+        <w:tc>
+          <w:tcPr>
+            <w:tcW w:w="1661" w:type="dxa"/>
+          </w:tcPr>
+          <w:p>
+            <w:pPr>
+              <w:rPr>
+                <w:rFonts w:ascii="Calibri" w:hAnsi="Calibri" w:cs="Calibri"/>
+              </w:rPr>
+            </w:pPr>
+            <w:r>
+              <w:rPr>
+                <w:rFonts w:ascii="Calibri" w:hAnsi="Calibri" w:cs="Calibri"/>
+              </w:rPr>
+              <w:t>Developer</w:t>
             </w:r>
           </w:p>
         </w:tc>
@@ -1749,7 +1871,7 @@
         </w:tc>
         <w:tc>
           <w:tcPr>
-            <w:tcW w:w="0" w:type="auto"/>
+            <w:tcW w:w="2140" w:type="dxa"/>
           </w:tcPr>
           <w:p>
             <w:pPr>
@@ -1762,6 +1884,511 @@
                 <w:rFonts w:ascii="Calibri" w:hAnsi="Calibri" w:cs="Calibri"/>
               </w:rPr>
               <w:t>Strictly adhere to the "Out of Scope" list and prioritize the Minimum Viable Product (MVP) features.</w:t>
+            </w:r>
+          </w:p>
+        </w:tc>
+        <w:tc>
+          <w:tcPr>
+            <w:tcW w:w="1661" w:type="dxa"/>
+          </w:tcPr>
+          <w:p>
+            <w:pPr>
+              <w:rPr>
+                <w:rFonts w:ascii="Calibri" w:hAnsi="Calibri" w:cs="Calibri"/>
+              </w:rPr>
+            </w:pPr>
+            <w:r>
+              <w:rPr>
+                <w:rFonts w:ascii="Calibri" w:hAnsi="Calibri" w:cs="Calibri"/>
+              </w:rPr>
+              <w:t>Mitigated</w:t>
+            </w:r>
+          </w:p>
+        </w:tc>
+        <w:tc>
+          <w:tcPr>
+            <w:tcW w:w="1661" w:type="dxa"/>
+          </w:tcPr>
+          <w:p>
+            <w:pPr>
+              <w:rPr>
+                <w:rFonts w:ascii="Calibri" w:hAnsi="Calibri" w:cs="Calibri"/>
+              </w:rPr>
+            </w:pPr>
+            <w:r>
+              <w:rPr>
+                <w:rFonts w:ascii="Calibri" w:hAnsi="Calibri" w:cs="Calibri"/>
+              </w:rPr>
+              <w:t>Scrum Master</w:t>
+            </w:r>
+          </w:p>
+        </w:tc>
+      </w:tr>
+    </w:tbl>
+    <w:p/>
+    <w:p/>
+    <w:p>
+      <w:pPr>
+        <w:pStyle w:val="Heading2"/>
+      </w:pPr>
+      <w:r>
+        <w:t>8. Testing Plan</w:t>
+      </w:r>
+    </w:p>
+    <w:tbl>
+      <w:tblPr>
+        <w:tblStyle w:val="TableGrid"/>
+        <w:tblW w:w="0" w:type="auto"/>
+        <w:tblLook w:val="04A0" w:firstRow="1" w:lastRow="0" w:firstColumn="1" w:lastColumn="0" w:noHBand="0" w:noVBand="1"/>
+      </w:tblPr>
+      <w:tblGrid>
+        <w:gridCol w:w="793"/>
+        <w:gridCol w:w="1508"/>
+        <w:gridCol w:w="2411"/>
+        <w:gridCol w:w="2331"/>
+        <w:gridCol w:w="2307"/>
+      </w:tblGrid>
+      <w:tr>
+        <w:tc>
+          <w:tcPr>
+            <w:tcW w:w="0" w:type="auto"/>
+            <w:hideMark/>
+          </w:tcPr>
+          <w:p>
+            <w:pPr>
+              <w:spacing w:after="160" w:line="278" w:lineRule="auto"/>
+            </w:pPr>
+            <w:r>
+              <w:rPr>
+                <w:b/>
+                <w:bCs/>
+              </w:rPr>
+              <w:t>Test ID</w:t>
+            </w:r>
+          </w:p>
+        </w:tc>
+        <w:tc>
+          <w:tcPr>
+            <w:tcW w:w="0" w:type="auto"/>
+            <w:hideMark/>
+          </w:tcPr>
+          <w:p>
+            <w:pPr>
+              <w:spacing w:after="160" w:line="278" w:lineRule="auto"/>
+            </w:pPr>
+            <w:r>
+              <w:rPr>
+                <w:b/>
+                <w:bCs/>
+              </w:rPr>
+              <w:t>Feature</w:t>
+            </w:r>
+          </w:p>
+        </w:tc>
+        <w:tc>
+          <w:tcPr>
+            <w:tcW w:w="0" w:type="auto"/>
+            <w:hideMark/>
+          </w:tcPr>
+          <w:p>
+            <w:pPr>
+              <w:spacing w:after="160" w:line="278" w:lineRule="auto"/>
+            </w:pPr>
+            <w:r>
+              <w:rPr>
+                <w:b/>
+                <w:bCs/>
+              </w:rPr>
+              <w:t>Arrange (Setup)</w:t>
+            </w:r>
+          </w:p>
+        </w:tc>
+        <w:tc>
+          <w:tcPr>
+            <w:tcW w:w="0" w:type="auto"/>
+            <w:hideMark/>
+          </w:tcPr>
+          <w:p>
+            <w:pPr>
+              <w:spacing w:after="160" w:line="278" w:lineRule="auto"/>
+            </w:pPr>
+            <w:r>
+              <w:rPr>
+                <w:b/>
+                <w:bCs/>
+              </w:rPr>
+              <w:t>Act (Action)</w:t>
+            </w:r>
+          </w:p>
+        </w:tc>
+        <w:tc>
+          <w:tcPr>
+            <w:tcW w:w="0" w:type="auto"/>
+            <w:hideMark/>
+          </w:tcPr>
+          <w:p>
+            <w:pPr>
+              <w:spacing w:after="160" w:line="278" w:lineRule="auto"/>
+            </w:pPr>
+            <w:r>
+              <w:rPr>
+                <w:b/>
+                <w:bCs/>
+              </w:rPr>
+              <w:t>Assert (Expected Result)</w:t>
+            </w:r>
+          </w:p>
+        </w:tc>
+      </w:tr>
+      <w:tr>
+        <w:tc>
+          <w:tcPr>
+            <w:tcW w:w="0" w:type="auto"/>
+            <w:hideMark/>
+          </w:tcPr>
+          <w:p>
+            <w:pPr>
+              <w:spacing w:after="160" w:line="278" w:lineRule="auto"/>
+            </w:pPr>
+            <w:r>
+              <w:rPr>
+                <w:b/>
+                <w:bCs/>
+              </w:rPr>
+              <w:t>UT01</w:t>
+            </w:r>
+          </w:p>
+        </w:tc>
+        <w:tc>
+          <w:tcPr>
+            <w:tcW w:w="0" w:type="auto"/>
+            <w:hideMark/>
+          </w:tcPr>
+          <w:p>
+            <w:pPr>
+              <w:spacing w:after="160" w:line="278" w:lineRule="auto"/>
+            </w:pPr>
+            <w:r>
+              <w:rPr>
+                <w:b/>
+                <w:bCs/>
+              </w:rPr>
+              <w:t>Secure Login</w:t>
+            </w:r>
+          </w:p>
+        </w:tc>
+        <w:tc>
+          <w:tcPr>
+            <w:tcW w:w="0" w:type="auto"/>
+            <w:hideMark/>
+          </w:tcPr>
+          <w:p>
+            <w:pPr>
+              <w:spacing w:after="160" w:line="278" w:lineRule="auto"/>
+            </w:pPr>
+            <w:r>
+              <w:t xml:space="preserve">Initialize </w:t>
+            </w:r>
+            <w:proofErr w:type="spellStart"/>
+            <w:r>
+              <w:t>mockData</w:t>
+            </w:r>
+            <w:proofErr w:type="spellEnd"/>
+            <w:r>
+              <w:t xml:space="preserve"> with patient "Arthur" (ID: 1234567890).</w:t>
+            </w:r>
+          </w:p>
+        </w:tc>
+        <w:tc>
+          <w:tcPr>
+            <w:tcW w:w="0" w:type="auto"/>
+            <w:hideMark/>
+          </w:tcPr>
+          <w:p>
+            <w:pPr>
+              <w:spacing w:after="160" w:line="278" w:lineRule="auto"/>
+            </w:pPr>
+            <w:r>
+              <w:t>User enters ID "1234567890" and correct password.</w:t>
+            </w:r>
+          </w:p>
+        </w:tc>
+        <w:tc>
+          <w:tcPr>
+            <w:tcW w:w="0" w:type="auto"/>
+            <w:hideMark/>
+          </w:tcPr>
+          <w:p>
+            <w:pPr>
+              <w:spacing w:after="160" w:line="278" w:lineRule="auto"/>
+            </w:pPr>
+            <w:r>
+              <w:t>Function returns success: true and a valid session token.</w:t>
+            </w:r>
+          </w:p>
+        </w:tc>
+      </w:tr>
+      <w:tr>
+        <w:tc>
+          <w:tcPr>
+            <w:tcW w:w="0" w:type="auto"/>
+            <w:hideMark/>
+          </w:tcPr>
+          <w:p>
+            <w:pPr>
+              <w:spacing w:after="160" w:line="278" w:lineRule="auto"/>
+            </w:pPr>
+            <w:r>
+              <w:rPr>
+                <w:b/>
+                <w:bCs/>
+              </w:rPr>
+              <w:t>UT02</w:t>
+            </w:r>
+          </w:p>
+        </w:tc>
+        <w:tc>
+          <w:tcPr>
+            <w:tcW w:w="0" w:type="auto"/>
+            <w:hideMark/>
+          </w:tcPr>
+          <w:p>
+            <w:pPr>
+              <w:spacing w:after="160" w:line="278" w:lineRule="auto"/>
+            </w:pPr>
+            <w:r>
+              <w:rPr>
+                <w:b/>
+                <w:bCs/>
+              </w:rPr>
+              <w:t>Invalid Login</w:t>
+            </w:r>
+          </w:p>
+        </w:tc>
+        <w:tc>
+          <w:tcPr>
+            <w:tcW w:w="0" w:type="auto"/>
+            <w:hideMark/>
+          </w:tcPr>
+          <w:p>
+            <w:pPr>
+              <w:spacing w:after="160" w:line="278" w:lineRule="auto"/>
+            </w:pPr>
+            <w:r>
+              <w:t xml:space="preserve">Initialize </w:t>
+            </w:r>
+            <w:proofErr w:type="spellStart"/>
+            <w:r>
+              <w:t>mockData</w:t>
+            </w:r>
+            <w:proofErr w:type="spellEnd"/>
+            <w:r>
+              <w:t xml:space="preserve"> with patient "Arthur".</w:t>
+            </w:r>
+          </w:p>
+        </w:tc>
+        <w:tc>
+          <w:tcPr>
+            <w:tcW w:w="0" w:type="auto"/>
+            <w:hideMark/>
+          </w:tcPr>
+          <w:p>
+            <w:pPr>
+              <w:spacing w:after="160" w:line="278" w:lineRule="auto"/>
+            </w:pPr>
+            <w:r>
+              <w:t>User enters ID "0000000000" (non-existent).</w:t>
+            </w:r>
+          </w:p>
+        </w:tc>
+        <w:tc>
+          <w:tcPr>
+            <w:tcW w:w="0" w:type="auto"/>
+            <w:hideMark/>
+          </w:tcPr>
+          <w:p>
+            <w:pPr>
+              <w:spacing w:after="160" w:line="278" w:lineRule="auto"/>
+            </w:pPr>
+            <w:r>
+              <w:t>Function returns error: "Invalid Credentials".</w:t>
+            </w:r>
+          </w:p>
+        </w:tc>
+      </w:tr>
+      <w:tr>
+        <w:tc>
+          <w:tcPr>
+            <w:tcW w:w="0" w:type="auto"/>
+            <w:hideMark/>
+          </w:tcPr>
+          <w:p>
+            <w:pPr>
+              <w:spacing w:after="160" w:line="278" w:lineRule="auto"/>
+            </w:pPr>
+            <w:r>
+              <w:rPr>
+                <w:b/>
+                <w:bCs/>
+              </w:rPr>
+              <w:t>UT03</w:t>
+            </w:r>
+          </w:p>
+        </w:tc>
+        <w:tc>
+          <w:tcPr>
+            <w:tcW w:w="0" w:type="auto"/>
+            <w:hideMark/>
+          </w:tcPr>
+          <w:p>
+            <w:pPr>
+              <w:spacing w:after="160" w:line="278" w:lineRule="auto"/>
+            </w:pPr>
+            <w:r>
+              <w:rPr>
+                <w:b/>
+                <w:bCs/>
+              </w:rPr>
+              <w:t>Date Validation</w:t>
+            </w:r>
+          </w:p>
+        </w:tc>
+        <w:tc>
+          <w:tcPr>
+            <w:tcW w:w="0" w:type="auto"/>
+            <w:hideMark/>
+          </w:tcPr>
+          <w:p>
+            <w:pPr>
+              <w:spacing w:after="160" w:line="278" w:lineRule="auto"/>
+            </w:pPr>
+            <w:r>
+              <w:t>Define current date as 2026-03-30.</w:t>
+            </w:r>
+          </w:p>
+        </w:tc>
+        <w:tc>
+          <w:tcPr>
+            <w:tcW w:w="0" w:type="auto"/>
+            <w:hideMark/>
+          </w:tcPr>
+          <w:p>
+            <w:pPr>
+              <w:spacing w:after="160" w:line="278" w:lineRule="auto"/>
+            </w:pPr>
+            <w:r>
+              <w:t>User attempts to book for 2025-01-01 (Past Date).</w:t>
+            </w:r>
+          </w:p>
+        </w:tc>
+        <w:tc>
+          <w:tcPr>
+            <w:tcW w:w="0" w:type="auto"/>
+            <w:hideMark/>
+          </w:tcPr>
+          <w:p>
+            <w:pPr>
+              <w:spacing w:after="160" w:line="278" w:lineRule="auto"/>
+            </w:pPr>
+            <w:r>
+              <w:t xml:space="preserve">Function returns </w:t>
+            </w:r>
+            <w:proofErr w:type="spellStart"/>
+            <w:r>
+              <w:t>isValid</w:t>
+            </w:r>
+            <w:proofErr w:type="spellEnd"/>
+            <w:r>
+              <w:t>: false and blocks submission.</w:t>
+            </w:r>
+          </w:p>
+        </w:tc>
+      </w:tr>
+      <w:tr>
+        <w:tc>
+          <w:tcPr>
+            <w:tcW w:w="0" w:type="auto"/>
+            <w:hideMark/>
+          </w:tcPr>
+          <w:p>
+            <w:pPr>
+              <w:spacing w:after="160" w:line="278" w:lineRule="auto"/>
+            </w:pPr>
+            <w:r>
+              <w:rPr>
+                <w:b/>
+                <w:bCs/>
+              </w:rPr>
+              <w:lastRenderedPageBreak/>
+              <w:t>UT04</w:t>
+            </w:r>
+          </w:p>
+        </w:tc>
+        <w:tc>
+          <w:tcPr>
+            <w:tcW w:w="0" w:type="auto"/>
+            <w:hideMark/>
+          </w:tcPr>
+          <w:p>
+            <w:pPr>
+              <w:spacing w:after="160" w:line="278" w:lineRule="auto"/>
+            </w:pPr>
+            <w:r>
+              <w:rPr>
+                <w:b/>
+                <w:bCs/>
+              </w:rPr>
+              <w:t>Slot Availability</w:t>
+            </w:r>
+          </w:p>
+        </w:tc>
+        <w:tc>
+          <w:tcPr>
+            <w:tcW w:w="0" w:type="auto"/>
+            <w:hideMark/>
+          </w:tcPr>
+          <w:p>
+            <w:pPr>
+              <w:spacing w:after="160" w:line="278" w:lineRule="auto"/>
+            </w:pPr>
+            <w:r>
+              <w:t xml:space="preserve">Set </w:t>
+            </w:r>
+            <w:proofErr w:type="spellStart"/>
+            <w:r>
+              <w:t>doctor_id</w:t>
+            </w:r>
+            <w:proofErr w:type="spellEnd"/>
+            <w:r>
+              <w:t>: Mehta slot 09:00 to "Booked".</w:t>
+            </w:r>
+          </w:p>
+        </w:tc>
+        <w:tc>
+          <w:tcPr>
+            <w:tcW w:w="0" w:type="auto"/>
+            <w:hideMark/>
+          </w:tcPr>
+          <w:p>
+            <w:pPr>
+              <w:spacing w:after="160" w:line="278" w:lineRule="auto"/>
+            </w:pPr>
+            <w:r>
+              <w:t>User attempts to select the 09:00 slot.</w:t>
+            </w:r>
+          </w:p>
+        </w:tc>
+        <w:tc>
+          <w:tcPr>
+            <w:tcW w:w="0" w:type="auto"/>
+            <w:hideMark/>
+          </w:tcPr>
+          <w:p>
+            <w:pPr>
+              <w:spacing w:after="160" w:line="278" w:lineRule="auto"/>
+            </w:pPr>
+            <w:r>
+              <w:t>UI disables selection and prevents form submission.</w:t>
             </w:r>
           </w:p>
         </w:tc>
@@ -1770,14 +2397,6 @@
     <w:p/>
     <w:p>
       <w:pPr>
-        <w:pStyle w:val="Heading2"/>
-      </w:pPr>
-      <w:r>
-        <w:t>8. Testing Plan</w:t>
-      </w:r>
-    </w:p>
-    <w:p>
-      <w:pPr>
         <w:numPr>
           <w:ilvl w:val="0"/>
           <w:numId w:val="6"/>
@@ -1848,7 +2467,6 @@
           <w:b/>
           <w:bCs/>
         </w:rPr>
-        <w:lastRenderedPageBreak/>
         <w:t xml:space="preserve">Security Testing: </w:t>
       </w:r>
       <w:r>
@@ -1857,6 +2475,24 @@
         </w:rPr>
         <w:t>Verification that unauthorized users are redirected away from private routes (/portal or /admin).</w:t>
       </w:r>
+    </w:p>
+    <w:p>
+      <w:pPr>
+        <w:rPr>
+          <w:rFonts w:ascii="Calibri" w:hAnsi="Calibri" w:cs="Calibri"/>
+          <w:b/>
+          <w:bCs/>
+        </w:rPr>
+      </w:pPr>
+    </w:p>
+    <w:p>
+      <w:pPr>
+        <w:rPr>
+          <w:rFonts w:ascii="Calibri" w:hAnsi="Calibri" w:cs="Calibri"/>
+          <w:b/>
+          <w:bCs/>
+        </w:rPr>
+      </w:pPr>
     </w:p>
     <w:p>
       <w:pPr>
@@ -1943,7 +2579,6 @@
       <w:pgSz w:w="12240" w:h="15840"/>
       <w:pgMar w:top="1440" w:right="1440" w:bottom="1440" w:left="1440" w:header="720" w:footer="720" w:gutter="0"/>
       <w:cols w:space="720"/>
-      <w:docGrid w:linePitch="360"/>
     </w:sectPr>
   </w:body>
 </w:document>

</xml_diff>